<commit_message>
Se actulizarón los CVs a la ultima versión disponible.
</commit_message>
<xml_diff>
--- a/assets/CVs/ENGLISH/PROJECT MANAGER/20260214_Yerman-Merel_CV-Format_ENG_v2.0_rev.docx
+++ b/assets/CVs/ENGLISH/PROJECT MANAGER/20260214_Yerman-Merel_CV-Format_ENG_v2.0_rev.docx
@@ -41,9 +41,8 @@
           <w:szCs w:val="22"/>
           <w:lang w:val="en-US"/>
         </w:rPr>
-        <w:t xml:space="preserve">Project </w:t>
-      </w:r>
-      <w:proofErr w:type="gramStart"/>
+        <w:t xml:space="preserve">Project Engineer  |  Mechanical </w:t>
+      </w:r>
       <w:r>
         <w:rPr>
           <w:rFonts w:ascii="Calibri" w:eastAsia="Calibri" w:hAnsi="Calibri" w:cs="Calibri"/>
@@ -54,9 +53,8 @@
           <w:szCs w:val="22"/>
           <w:lang w:val="en-US"/>
         </w:rPr>
-        <w:t>Engineer  |</w:t>
-      </w:r>
-      <w:proofErr w:type="gramEnd"/>
+        <w:t xml:space="preserve">Design </w:t>
+      </w:r>
       <w:r>
         <w:rPr>
           <w:rFonts w:ascii="Calibri" w:eastAsia="Calibri" w:hAnsi="Calibri" w:cs="Calibri"/>
@@ -67,45 +65,7 @@
           <w:szCs w:val="22"/>
           <w:lang w:val="en-US"/>
         </w:rPr>
-        <w:t xml:space="preserve">  Mechanical </w:t>
-      </w:r>
-      <w:r>
-        <w:rPr>
-          <w:rFonts w:ascii="Calibri" w:eastAsia="Calibri" w:hAnsi="Calibri" w:cs="Calibri"/>
-          <w:b/>
-          <w:bCs/>
-          <w:color w:val="1A5276"/>
-          <w:sz w:val="22"/>
-          <w:szCs w:val="22"/>
-          <w:lang w:val="en-US"/>
-        </w:rPr>
-        <w:t xml:space="preserve">Design </w:t>
-      </w:r>
-      <w:proofErr w:type="gramStart"/>
-      <w:r>
-        <w:rPr>
-          <w:rFonts w:ascii="Calibri" w:eastAsia="Calibri" w:hAnsi="Calibri" w:cs="Calibri"/>
-          <w:b/>
-          <w:bCs/>
-          <w:color w:val="1A5276"/>
-          <w:sz w:val="22"/>
-          <w:szCs w:val="22"/>
-          <w:lang w:val="en-US"/>
-        </w:rPr>
-        <w:t>Engineer  |</w:t>
-      </w:r>
-      <w:proofErr w:type="gramEnd"/>
-      <w:r>
-        <w:rPr>
-          <w:rFonts w:ascii="Calibri" w:eastAsia="Calibri" w:hAnsi="Calibri" w:cs="Calibri"/>
-          <w:b/>
-          <w:bCs/>
-          <w:color w:val="1A5276"/>
-          <w:sz w:val="22"/>
-          <w:szCs w:val="22"/>
-          <w:lang w:val="en-US"/>
-        </w:rPr>
-        <w:t xml:space="preserve">  Field Engineer</w:t>
+        <w:t>Engineer  |  Field Engineer</w:t>
       </w:r>
     </w:p>
     <w:p>
@@ -136,29 +96,7 @@
             <w:u w:val="single"/>
             <w:lang w:val="en-US"/>
           </w:rPr>
-          <w:t>Linke</w:t>
-        </w:r>
-        <w:r>
-          <w:rPr>
-            <w:rFonts w:ascii="Calibri" w:eastAsia="Calibri" w:hAnsi="Calibri" w:cs="Calibri"/>
-            <w:color w:val="1A5276"/>
-            <w:sz w:val="18"/>
-            <w:szCs w:val="18"/>
-            <w:u w:val="single"/>
-            <w:lang w:val="en-US"/>
-          </w:rPr>
-          <w:t>d</w:t>
-        </w:r>
-        <w:r>
-          <w:rPr>
-            <w:rFonts w:ascii="Calibri" w:eastAsia="Calibri" w:hAnsi="Calibri" w:cs="Calibri"/>
-            <w:color w:val="1A5276"/>
-            <w:sz w:val="18"/>
-            <w:szCs w:val="18"/>
-            <w:u w:val="single"/>
-            <w:lang w:val="en-US"/>
-          </w:rPr>
-          <w:t>In</w:t>
+          <w:t>LinkedIn</w:t>
         </w:r>
       </w:hyperlink>
       <w:r>
@@ -181,29 +119,7 @@
             <w:u w:val="single"/>
             <w:lang w:val="en-US"/>
           </w:rPr>
-          <w:t>Por</w:t>
-        </w:r>
-        <w:r>
-          <w:rPr>
-            <w:rFonts w:ascii="Calibri" w:eastAsia="Calibri" w:hAnsi="Calibri" w:cs="Calibri"/>
-            <w:color w:val="1A5276"/>
-            <w:sz w:val="18"/>
-            <w:szCs w:val="18"/>
-            <w:u w:val="single"/>
-            <w:lang w:val="en-US"/>
-          </w:rPr>
-          <w:t>t</w:t>
-        </w:r>
-        <w:r>
-          <w:rPr>
-            <w:rFonts w:ascii="Calibri" w:eastAsia="Calibri" w:hAnsi="Calibri" w:cs="Calibri"/>
-            <w:color w:val="1A5276"/>
-            <w:sz w:val="18"/>
-            <w:szCs w:val="18"/>
-            <w:u w:val="single"/>
-            <w:lang w:val="en-US"/>
-          </w:rPr>
-          <w:t>folio</w:t>
+          <w:t>Portfolio</w:t>
         </w:r>
       </w:hyperlink>
     </w:p>
@@ -254,7 +170,23 @@
           <w:color w:val="222222"/>
           <w:lang w:val="en-US"/>
         </w:rPr>
-        <w:t>Mechanical Engineer with hands-on experience on two international tunnelling megaprojects — Panama Metro Line 3 and the Hudson River Project (USA) — before completing a B.Sc. degree. Specialized in project engineering support, SOP development, mechanical systems validation, and piping design (P&amp;IDs / isometrics) to ASME B31 standards. Proven track record of delivering corrective engineering solutions under demanding field conditions, reducing execution errors by 20%, and improving audit readiness through regulatory traceability. Seeking to leverage tunnelling and heavy civil infrastructure expertise within a global engineering or EPC organization.</w:t>
+        <w:t>Mechanical Engineer with hands-on experience on two international tunnelling megaprojects — Panama Metro Line 3 and the Hudson River Project (USA)</w:t>
+      </w:r>
+      <w:r>
+        <w:rPr>
+          <w:rFonts w:ascii="Calibri" w:eastAsia="Calibri" w:hAnsi="Calibri" w:cs="Calibri"/>
+          <w:color w:val="222222"/>
+          <w:lang w:val="en-US"/>
+        </w:rPr>
+        <w:t xml:space="preserve">. </w:t>
+      </w:r>
+      <w:r>
+        <w:rPr>
+          <w:rFonts w:ascii="Calibri" w:eastAsia="Calibri" w:hAnsi="Calibri" w:cs="Calibri"/>
+          <w:color w:val="222222"/>
+          <w:lang w:val="en-US"/>
+        </w:rPr>
+        <w:t>Specialized in project engineering support, SOP development, mechanical systems validation, and piping design (P&amp;IDs / isometrics) to ASME B31 standards. Proven track record of delivering corrective engineering solutions under demanding field conditions, reducing execution errors by 20%, and improving audit readiness through regulatory traceability. Seeking to leverage tunnelling and heavy civil infrastructure expertise within a global engineering or EPC organization.</w:t>
       </w:r>
     </w:p>
     <w:p>
@@ -303,97 +235,7 @@
           <w:color w:val="222222"/>
           <w:lang w:val="en-US"/>
         </w:rPr>
-        <w:t xml:space="preserve">Field Engineering &amp; Technical </w:t>
-      </w:r>
-      <w:proofErr w:type="gramStart"/>
-      <w:r>
-        <w:rPr>
-          <w:rFonts w:ascii="Calibri" w:eastAsia="Calibri" w:hAnsi="Calibri" w:cs="Calibri"/>
-          <w:color w:val="222222"/>
-          <w:lang w:val="en-US"/>
-        </w:rPr>
-        <w:t>Coordination  •</w:t>
-      </w:r>
-      <w:proofErr w:type="gramEnd"/>
-      <w:r>
-        <w:rPr>
-          <w:rFonts w:ascii="Calibri" w:eastAsia="Calibri" w:hAnsi="Calibri" w:cs="Calibri"/>
-          <w:color w:val="222222"/>
-          <w:lang w:val="en-US"/>
-        </w:rPr>
-        <w:t xml:space="preserve">  Structural Validation &amp; FEA (</w:t>
-      </w:r>
-      <w:proofErr w:type="gramStart"/>
-      <w:r>
-        <w:rPr>
-          <w:rFonts w:ascii="Calibri" w:eastAsia="Calibri" w:hAnsi="Calibri" w:cs="Calibri"/>
-          <w:color w:val="222222"/>
-          <w:lang w:val="en-US"/>
-        </w:rPr>
-        <w:t>ANSYS)  •</w:t>
-      </w:r>
-      <w:proofErr w:type="gramEnd"/>
-      <w:r>
-        <w:rPr>
-          <w:rFonts w:ascii="Calibri" w:eastAsia="Calibri" w:hAnsi="Calibri" w:cs="Calibri"/>
-          <w:color w:val="222222"/>
-          <w:lang w:val="en-US"/>
-        </w:rPr>
-        <w:t xml:space="preserve">  Industrial Piping Design (P&amp;IDs, Isometrics, ASME B31</w:t>
-      </w:r>
-      <w:proofErr w:type="gramStart"/>
-      <w:r>
-        <w:rPr>
-          <w:rFonts w:ascii="Calibri" w:eastAsia="Calibri" w:hAnsi="Calibri" w:cs="Calibri"/>
-          <w:color w:val="222222"/>
-          <w:lang w:val="en-US"/>
-        </w:rPr>
-        <w:t>)  •</w:t>
-      </w:r>
-      <w:proofErr w:type="gramEnd"/>
-      <w:r>
-        <w:rPr>
-          <w:rFonts w:ascii="Calibri" w:eastAsia="Calibri" w:hAnsi="Calibri" w:cs="Calibri"/>
-          <w:color w:val="222222"/>
-          <w:lang w:val="en-US"/>
-        </w:rPr>
-        <w:t xml:space="preserve">  Commissioning &amp; Shutdown </w:t>
-      </w:r>
-      <w:proofErr w:type="gramStart"/>
-      <w:r>
-        <w:rPr>
-          <w:rFonts w:ascii="Calibri" w:eastAsia="Calibri" w:hAnsi="Calibri" w:cs="Calibri"/>
-          <w:color w:val="222222"/>
-          <w:lang w:val="en-US"/>
-        </w:rPr>
-        <w:t>Maintenance  •</w:t>
-      </w:r>
-      <w:proofErr w:type="gramEnd"/>
-      <w:r>
-        <w:rPr>
-          <w:rFonts w:ascii="Calibri" w:eastAsia="Calibri" w:hAnsi="Calibri" w:cs="Calibri"/>
-          <w:color w:val="222222"/>
-          <w:lang w:val="en-US"/>
-        </w:rPr>
-        <w:t xml:space="preserve">  Mechanical Systems </w:t>
-      </w:r>
-      <w:proofErr w:type="gramStart"/>
-      <w:r>
-        <w:rPr>
-          <w:rFonts w:ascii="Calibri" w:eastAsia="Calibri" w:hAnsi="Calibri" w:cs="Calibri"/>
-          <w:color w:val="222222"/>
-          <w:lang w:val="en-US"/>
-        </w:rPr>
-        <w:t>Validation  •</w:t>
-      </w:r>
-      <w:proofErr w:type="gramEnd"/>
-      <w:r>
-        <w:rPr>
-          <w:rFonts w:ascii="Calibri" w:eastAsia="Calibri" w:hAnsi="Calibri" w:cs="Calibri"/>
-          <w:color w:val="222222"/>
-          <w:lang w:val="en-US"/>
-        </w:rPr>
-        <w:t xml:space="preserve">  CAD Design (AutoCAD, Inventor)</w:t>
+        <w:t>Field Engineering &amp; Technical Coordination  •  Structural Validation &amp; FEA (ANSYS)  •  Industrial Piping Design (P&amp;IDs, Isometrics, ASME B31)  •  Commissioning &amp; Shutdown Maintenance  •  Mechanical Systems Validation  •  CAD Design (AutoCAD, Inventor)</w:t>
       </w:r>
     </w:p>
     <w:p>
@@ -419,61 +261,7 @@
           <w:color w:val="222222"/>
           <w:lang w:val="en-US"/>
         </w:rPr>
-        <w:t xml:space="preserve">SOP Development &amp; </w:t>
-      </w:r>
-      <w:proofErr w:type="gramStart"/>
-      <w:r>
-        <w:rPr>
-          <w:rFonts w:ascii="Calibri" w:eastAsia="Calibri" w:hAnsi="Calibri" w:cs="Calibri"/>
-          <w:color w:val="222222"/>
-          <w:lang w:val="en-US"/>
-        </w:rPr>
-        <w:t>Standardization  •</w:t>
-      </w:r>
-      <w:proofErr w:type="gramEnd"/>
-      <w:r>
-        <w:rPr>
-          <w:rFonts w:ascii="Calibri" w:eastAsia="Calibri" w:hAnsi="Calibri" w:cs="Calibri"/>
-          <w:color w:val="222222"/>
-          <w:lang w:val="en-US"/>
-        </w:rPr>
-        <w:t xml:space="preserve">  Compliance, Traceability &amp; Risk </w:t>
-      </w:r>
-      <w:proofErr w:type="gramStart"/>
-      <w:r>
-        <w:rPr>
-          <w:rFonts w:ascii="Calibri" w:eastAsia="Calibri" w:hAnsi="Calibri" w:cs="Calibri"/>
-          <w:color w:val="222222"/>
-          <w:lang w:val="en-US"/>
-        </w:rPr>
-        <w:t>Mitigation  •</w:t>
-      </w:r>
-      <w:proofErr w:type="gramEnd"/>
-      <w:r>
-        <w:rPr>
-          <w:rFonts w:ascii="Calibri" w:eastAsia="Calibri" w:hAnsi="Calibri" w:cs="Calibri"/>
-          <w:color w:val="222222"/>
-          <w:lang w:val="en-US"/>
-        </w:rPr>
-        <w:t xml:space="preserve">  Cross-functional </w:t>
-      </w:r>
-      <w:proofErr w:type="gramStart"/>
-      <w:r>
-        <w:rPr>
-          <w:rFonts w:ascii="Calibri" w:eastAsia="Calibri" w:hAnsi="Calibri" w:cs="Calibri"/>
-          <w:color w:val="222222"/>
-          <w:lang w:val="en-US"/>
-        </w:rPr>
-        <w:t>Coordination  •</w:t>
-      </w:r>
-      <w:proofErr w:type="gramEnd"/>
-      <w:r>
-        <w:rPr>
-          <w:rFonts w:ascii="Calibri" w:eastAsia="Calibri" w:hAnsi="Calibri" w:cs="Calibri"/>
-          <w:color w:val="222222"/>
-          <w:lang w:val="en-US"/>
-        </w:rPr>
-        <w:t xml:space="preserve">  Cost Analysis &amp; Resource Allocation</w:t>
+        <w:t>SOP Development &amp; Standardization  •  Compliance, Traceability &amp; Risk Mitigation  •  Cross-functional Coordination  •  Cost Analysis &amp; Resource Allocation</w:t>
       </w:r>
     </w:p>
     <w:p>
@@ -499,115 +287,7 @@
           <w:color w:val="222222"/>
           <w:lang w:val="en-US"/>
         </w:rPr>
-        <w:t xml:space="preserve">ANSYS (FEA </w:t>
-      </w:r>
-      <w:proofErr w:type="gramStart"/>
-      <w:r>
-        <w:rPr>
-          <w:rFonts w:ascii="Calibri" w:eastAsia="Calibri" w:hAnsi="Calibri" w:cs="Calibri"/>
-          <w:color w:val="222222"/>
-          <w:lang w:val="en-US"/>
-        </w:rPr>
-        <w:t>simulations)  •</w:t>
-      </w:r>
-      <w:proofErr w:type="gramEnd"/>
-      <w:r>
-        <w:rPr>
-          <w:rFonts w:ascii="Calibri" w:eastAsia="Calibri" w:hAnsi="Calibri" w:cs="Calibri"/>
-          <w:color w:val="222222"/>
-          <w:lang w:val="en-US"/>
-        </w:rPr>
-        <w:t xml:space="preserve">  MATLAB (numerical </w:t>
-      </w:r>
-      <w:proofErr w:type="gramStart"/>
-      <w:r>
-        <w:rPr>
-          <w:rFonts w:ascii="Calibri" w:eastAsia="Calibri" w:hAnsi="Calibri" w:cs="Calibri"/>
-          <w:color w:val="222222"/>
-          <w:lang w:val="en-US"/>
-        </w:rPr>
-        <w:t>modeling)  •</w:t>
-      </w:r>
-      <w:proofErr w:type="gramEnd"/>
-      <w:r>
-        <w:rPr>
-          <w:rFonts w:ascii="Calibri" w:eastAsia="Calibri" w:hAnsi="Calibri" w:cs="Calibri"/>
-          <w:color w:val="222222"/>
-          <w:lang w:val="en-US"/>
-        </w:rPr>
-        <w:t xml:space="preserve">  Python (data automation &amp; </w:t>
-      </w:r>
-      <w:proofErr w:type="gramStart"/>
-      <w:r>
-        <w:rPr>
-          <w:rFonts w:ascii="Calibri" w:eastAsia="Calibri" w:hAnsi="Calibri" w:cs="Calibri"/>
-          <w:color w:val="222222"/>
-          <w:lang w:val="en-US"/>
-        </w:rPr>
-        <w:t>reporting)  •</w:t>
-      </w:r>
-      <w:proofErr w:type="gramEnd"/>
-      <w:r>
-        <w:rPr>
-          <w:rFonts w:ascii="Calibri" w:eastAsia="Calibri" w:hAnsi="Calibri" w:cs="Calibri"/>
-          <w:color w:val="222222"/>
-          <w:lang w:val="en-US"/>
-        </w:rPr>
-        <w:t xml:space="preserve">  SAP (PM/MM </w:t>
-      </w:r>
-      <w:proofErr w:type="gramStart"/>
-      <w:r>
-        <w:rPr>
-          <w:rFonts w:ascii="Calibri" w:eastAsia="Calibri" w:hAnsi="Calibri" w:cs="Calibri"/>
-          <w:color w:val="222222"/>
-          <w:lang w:val="en-US"/>
-        </w:rPr>
-        <w:t>modules)  •</w:t>
-      </w:r>
-      <w:proofErr w:type="gramEnd"/>
-      <w:r>
-        <w:rPr>
-          <w:rFonts w:ascii="Calibri" w:eastAsia="Calibri" w:hAnsi="Calibri" w:cs="Calibri"/>
-          <w:color w:val="222222"/>
-          <w:lang w:val="en-US"/>
-        </w:rPr>
-        <w:t xml:space="preserve">  </w:t>
-      </w:r>
-      <w:proofErr w:type="gramStart"/>
-      <w:r>
-        <w:rPr>
-          <w:rFonts w:ascii="Calibri" w:eastAsia="Calibri" w:hAnsi="Calibri" w:cs="Calibri"/>
-          <w:color w:val="222222"/>
-          <w:lang w:val="en-US"/>
-        </w:rPr>
-        <w:t>AutoCAD  •</w:t>
-      </w:r>
-      <w:proofErr w:type="gramEnd"/>
-      <w:r>
-        <w:rPr>
-          <w:rFonts w:ascii="Calibri" w:eastAsia="Calibri" w:hAnsi="Calibri" w:cs="Calibri"/>
-          <w:color w:val="222222"/>
-          <w:lang w:val="en-US"/>
-        </w:rPr>
-        <w:t xml:space="preserve">  </w:t>
-      </w:r>
-      <w:proofErr w:type="gramStart"/>
-      <w:r>
-        <w:rPr>
-          <w:rFonts w:ascii="Calibri" w:eastAsia="Calibri" w:hAnsi="Calibri" w:cs="Calibri"/>
-          <w:color w:val="222222"/>
-          <w:lang w:val="en-US"/>
-        </w:rPr>
-        <w:t>Inventor  •</w:t>
-      </w:r>
-      <w:proofErr w:type="gramEnd"/>
-      <w:r>
-        <w:rPr>
-          <w:rFonts w:ascii="Calibri" w:eastAsia="Calibri" w:hAnsi="Calibri" w:cs="Calibri"/>
-          <w:color w:val="222222"/>
-          <w:lang w:val="en-US"/>
-        </w:rPr>
-        <w:t xml:space="preserve">  MS Office (advanced Excel, Word, PowerPoint)</w:t>
+        <w:t>ANSYS (FEA simulations)  •  MATLAB (numerical modeling)  •  Python (data automation &amp; reporting)  •  SAP (PM/MM modules)  •  AutoCAD  •  Inventor  •  MS Office (advanced Excel, Word, PowerPoint)</w:t>
       </w:r>
     </w:p>
     <w:p>
@@ -650,20 +330,7 @@
           <w:szCs w:val="22"/>
           <w:lang w:val="en-US"/>
         </w:rPr>
-        <w:t xml:space="preserve">Co-Founder &amp; Director of Systems </w:t>
-      </w:r>
-      <w:proofErr w:type="gramStart"/>
-      <w:r>
-        <w:rPr>
-          <w:rFonts w:ascii="Calibri" w:eastAsia="Calibri" w:hAnsi="Calibri" w:cs="Calibri"/>
-          <w:b/>
-          <w:bCs/>
-          <w:color w:val="111111"/>
-          <w:sz w:val="22"/>
-          <w:szCs w:val="22"/>
-          <w:lang w:val="en-US"/>
-        </w:rPr>
-        <w:t>Engineering</w:t>
+        <w:t>Co-Founder &amp; Director of Systems Engineering</w:t>
       </w:r>
       <w:r>
         <w:rPr>
@@ -673,18 +340,7 @@
           <w:szCs w:val="22"/>
           <w:lang w:val="en-US"/>
         </w:rPr>
-        <w:t xml:space="preserve">  |</w:t>
-      </w:r>
-      <w:proofErr w:type="gramEnd"/>
-      <w:r>
-        <w:rPr>
-          <w:rFonts w:ascii="Calibri" w:eastAsia="Calibri" w:hAnsi="Calibri" w:cs="Calibri"/>
-          <w:color w:val="7F8C8D"/>
-          <w:sz w:val="22"/>
-          <w:szCs w:val="22"/>
-          <w:lang w:val="en-US"/>
-        </w:rPr>
-        <w:t xml:space="preserve">  </w:t>
+        <w:t xml:space="preserve">  |  </w:t>
       </w:r>
       <w:r>
         <w:rPr>
@@ -838,20 +494,7 @@
           <w:szCs w:val="22"/>
           <w:lang w:val="en-US"/>
         </w:rPr>
-        <w:t xml:space="preserve">Project </w:t>
-      </w:r>
-      <w:proofErr w:type="gramStart"/>
-      <w:r>
-        <w:rPr>
-          <w:rFonts w:ascii="Calibri" w:eastAsia="Calibri" w:hAnsi="Calibri" w:cs="Calibri"/>
-          <w:b/>
-          <w:bCs/>
-          <w:color w:val="111111"/>
-          <w:sz w:val="22"/>
-          <w:szCs w:val="22"/>
-          <w:lang w:val="en-US"/>
-        </w:rPr>
-        <w:t>Engineer</w:t>
+        <w:t>Project Engineer</w:t>
       </w:r>
       <w:r>
         <w:rPr>
@@ -861,18 +504,7 @@
           <w:szCs w:val="22"/>
           <w:lang w:val="en-US"/>
         </w:rPr>
-        <w:t xml:space="preserve">  |</w:t>
-      </w:r>
-      <w:proofErr w:type="gramEnd"/>
-      <w:r>
-        <w:rPr>
-          <w:rFonts w:ascii="Calibri" w:eastAsia="Calibri" w:hAnsi="Calibri" w:cs="Calibri"/>
-          <w:color w:val="7F8C8D"/>
-          <w:sz w:val="22"/>
-          <w:szCs w:val="22"/>
-          <w:lang w:val="en-US"/>
-        </w:rPr>
-        <w:t xml:space="preserve">  </w:t>
+        <w:t xml:space="preserve">  |  </w:t>
       </w:r>
       <w:r>
         <w:rPr>
@@ -1065,20 +697,7 @@
           <w:szCs w:val="22"/>
           <w:lang w:val="en-US"/>
         </w:rPr>
-        <w:t>Field Engineer – TBM &amp; Surface Facilities (</w:t>
-      </w:r>
-      <w:proofErr w:type="gramStart"/>
-      <w:r>
-        <w:rPr>
-          <w:rFonts w:ascii="Calibri" w:eastAsia="Calibri" w:hAnsi="Calibri" w:cs="Calibri"/>
-          <w:b/>
-          <w:bCs/>
-          <w:color w:val="111111"/>
-          <w:sz w:val="22"/>
-          <w:szCs w:val="22"/>
-          <w:lang w:val="en-US"/>
-        </w:rPr>
-        <w:t>Intern)</w:t>
+        <w:t>Field Engineer – TBM &amp; Surface Facilities (Intern)</w:t>
       </w:r>
       <w:r>
         <w:rPr>
@@ -1088,18 +707,7 @@
           <w:szCs w:val="22"/>
           <w:lang w:val="en-US"/>
         </w:rPr>
-        <w:t xml:space="preserve">  |</w:t>
-      </w:r>
-      <w:proofErr w:type="gramEnd"/>
-      <w:r>
-        <w:rPr>
-          <w:rFonts w:ascii="Calibri" w:eastAsia="Calibri" w:hAnsi="Calibri" w:cs="Calibri"/>
-          <w:color w:val="7F8C8D"/>
-          <w:sz w:val="22"/>
-          <w:szCs w:val="22"/>
-          <w:lang w:val="en-US"/>
-        </w:rPr>
-        <w:t xml:space="preserve">  </w:t>
+        <w:t xml:space="preserve">  |  </w:t>
       </w:r>
       <w:r>
         <w:rPr>
@@ -1400,55 +1008,7 @@
           <w:rFonts w:ascii="Calibri" w:eastAsia="Calibri" w:hAnsi="Calibri" w:cs="Calibri"/>
           <w:color w:val="222222"/>
         </w:rPr>
-        <w:t xml:space="preserve">Fluid </w:t>
-      </w:r>
-      <w:proofErr w:type="spellStart"/>
-      <w:r>
-        <w:rPr>
-          <w:rFonts w:ascii="Calibri" w:eastAsia="Calibri" w:hAnsi="Calibri" w:cs="Calibri"/>
-          <w:color w:val="222222"/>
-        </w:rPr>
-        <w:t>Technology</w:t>
-      </w:r>
-      <w:proofErr w:type="spellEnd"/>
-      <w:r>
-        <w:rPr>
-          <w:rFonts w:ascii="Calibri" w:eastAsia="Calibri" w:hAnsi="Calibri" w:cs="Calibri"/>
-          <w:color w:val="222222"/>
-        </w:rPr>
-        <w:t xml:space="preserve">, </w:t>
-      </w:r>
-      <w:proofErr w:type="spellStart"/>
-      <w:r>
-        <w:rPr>
-          <w:rFonts w:ascii="Calibri" w:eastAsia="Calibri" w:hAnsi="Calibri" w:cs="Calibri"/>
-          <w:color w:val="222222"/>
-        </w:rPr>
-        <w:t>Hydraulics</w:t>
-      </w:r>
-      <w:proofErr w:type="spellEnd"/>
-      <w:r>
-        <w:rPr>
-          <w:rFonts w:ascii="Calibri" w:eastAsia="Calibri" w:hAnsi="Calibri" w:cs="Calibri"/>
-          <w:color w:val="222222"/>
-        </w:rPr>
-        <w:t xml:space="preserve"> &amp; </w:t>
-      </w:r>
-      <w:proofErr w:type="spellStart"/>
-      <w:r>
-        <w:rPr>
-          <w:rFonts w:ascii="Calibri" w:eastAsia="Calibri" w:hAnsi="Calibri" w:cs="Calibri"/>
-          <w:color w:val="222222"/>
-        </w:rPr>
-        <w:t>Lubrication</w:t>
-      </w:r>
-      <w:proofErr w:type="spellEnd"/>
-      <w:r>
-        <w:rPr>
-          <w:rFonts w:ascii="Calibri" w:eastAsia="Calibri" w:hAnsi="Calibri" w:cs="Calibri"/>
-          <w:color w:val="222222"/>
-        </w:rPr>
-        <w:t xml:space="preserve"> – Herrenknecht AG (Jun 2025)</w:t>
+        <w:t>Fluid Technology, Hydraulics &amp; Lubrication – Herrenknecht AG (Jun 2025)</w:t>
       </w:r>
     </w:p>
     <w:p>
@@ -1483,47 +1043,7 @@
           <w:bCs/>
           <w:color w:val="1A5276"/>
         </w:rPr>
-        <w:t xml:space="preserve">In </w:t>
-      </w:r>
-      <w:proofErr w:type="spellStart"/>
-      <w:r>
-        <w:rPr>
-          <w:rFonts w:ascii="Calibri" w:eastAsia="Calibri" w:hAnsi="Calibri" w:cs="Calibri"/>
-          <w:b/>
-          <w:bCs/>
-          <w:color w:val="1A5276"/>
-        </w:rPr>
-        <w:t>Progress</w:t>
-      </w:r>
-      <w:proofErr w:type="spellEnd"/>
-      <w:r>
-        <w:rPr>
-          <w:rFonts w:ascii="Calibri" w:eastAsia="Calibri" w:hAnsi="Calibri" w:cs="Calibri"/>
-          <w:b/>
-          <w:bCs/>
-          <w:color w:val="1A5276"/>
-        </w:rPr>
-        <w:t xml:space="preserve"> / </w:t>
-      </w:r>
-      <w:proofErr w:type="spellStart"/>
-      <w:r>
-        <w:rPr>
-          <w:rFonts w:ascii="Calibri" w:eastAsia="Calibri" w:hAnsi="Calibri" w:cs="Calibri"/>
-          <w:b/>
-          <w:bCs/>
-          <w:color w:val="1A5276"/>
-        </w:rPr>
-        <w:t>Planned</w:t>
-      </w:r>
-      <w:proofErr w:type="spellEnd"/>
-      <w:r>
-        <w:rPr>
-          <w:rFonts w:ascii="Calibri" w:eastAsia="Calibri" w:hAnsi="Calibri" w:cs="Calibri"/>
-          <w:b/>
-          <w:bCs/>
-          <w:color w:val="1A5276"/>
-        </w:rPr>
-        <w:t>:</w:t>
+        <w:t>In Progress / Planned:</w:t>
       </w:r>
     </w:p>
     <w:p>
@@ -1549,6 +1069,57 @@
     </w:p>
     <w:p>
       <w:pPr>
+        <w:pBdr>
+          <w:bottom w:val="single" w:sz="6" w:space="2" w:color="1A5276"/>
+        </w:pBdr>
+        <w:spacing w:before="240" w:after="60"/>
+        <w:rPr>
+          <w:lang w:val="en-US"/>
+        </w:rPr>
+      </w:pPr>
+      <w:r>
+        <w:rPr>
+          <w:rFonts w:ascii="Calibri" w:eastAsia="Calibri" w:hAnsi="Calibri" w:cs="Calibri"/>
+          <w:b/>
+          <w:bCs/>
+          <w:color w:val="1A5276"/>
+          <w:sz w:val="22"/>
+          <w:szCs w:val="22"/>
+          <w:lang w:val="en-US"/>
+        </w:rPr>
+        <w:t>TECHNICAL PROJECTS &amp; RESEARCH</w:t>
+      </w:r>
+    </w:p>
+    <w:p>
+      <w:pPr>
+        <w:spacing w:before="120" w:after="20"/>
+        <w:rPr>
+          <w:lang w:val="en-US"/>
+        </w:rPr>
+      </w:pPr>
+      <w:r>
+        <w:rPr>
+          <w:rFonts w:ascii="Calibri" w:eastAsia="Calibri" w:hAnsi="Calibri" w:cs="Calibri"/>
+          <w:b/>
+          <w:bCs/>
+          <w:color w:val="111111"/>
+          <w:lang w:val="en-US"/>
+        </w:rPr>
+        <w:t>Resonant Wind Turbine Mathematical Model</w:t>
+      </w:r>
+      <w:r>
+        <w:rPr>
+          <w:rFonts w:ascii="Calibri" w:eastAsia="Calibri" w:hAnsi="Calibri" w:cs="Calibri"/>
+          <w:i/>
+          <w:iCs/>
+          <w:color w:val="7F8C8D"/>
+          <w:lang w:val="en-US"/>
+        </w:rPr>
+        <w:t xml:space="preserve">   —   Finalist, National Scientific Initiation Conference (2023)</w:t>
+      </w:r>
+    </w:p>
+    <w:p>
+      <w:pPr>
         <w:pStyle w:val="ListParagraph"/>
         <w:numPr>
           <w:ilvl w:val="0"/>
@@ -1565,58 +1136,7 @@
           <w:color w:val="222222"/>
           <w:lang w:val="en-US"/>
         </w:rPr>
-        <w:t>OSHA 30-Hour General Industry Safety Certification (Target: Q2 2026)</w:t>
-      </w:r>
-    </w:p>
-    <w:p>
-      <w:pPr>
-        <w:pBdr>
-          <w:bottom w:val="single" w:sz="6" w:space="2" w:color="1A5276"/>
-        </w:pBdr>
-        <w:spacing w:before="240" w:after="60"/>
-        <w:rPr>
-          <w:lang w:val="en-US"/>
-        </w:rPr>
-      </w:pPr>
-      <w:r>
-        <w:rPr>
-          <w:rFonts w:ascii="Calibri" w:eastAsia="Calibri" w:hAnsi="Calibri" w:cs="Calibri"/>
-          <w:b/>
-          <w:bCs/>
-          <w:color w:val="1A5276"/>
-          <w:sz w:val="22"/>
-          <w:szCs w:val="22"/>
-          <w:lang w:val="en-US"/>
-        </w:rPr>
-        <w:t>TECHNICAL PROJECTS &amp; RESEARCH</w:t>
-      </w:r>
-    </w:p>
-    <w:p>
-      <w:pPr>
-        <w:spacing w:before="120" w:after="20"/>
-        <w:rPr>
-          <w:lang w:val="en-US"/>
-        </w:rPr>
-      </w:pPr>
-      <w:r>
-        <w:rPr>
-          <w:rFonts w:ascii="Calibri" w:eastAsia="Calibri" w:hAnsi="Calibri" w:cs="Calibri"/>
-          <w:b/>
-          <w:bCs/>
-          <w:color w:val="111111"/>
-          <w:lang w:val="en-US"/>
-        </w:rPr>
-        <w:t>Resonant Wind Turbine Mathematical Model</w:t>
-      </w:r>
-      <w:r>
-        <w:rPr>
-          <w:rFonts w:ascii="Calibri" w:eastAsia="Calibri" w:hAnsi="Calibri" w:cs="Calibri"/>
-          <w:i/>
-          <w:iCs/>
-          <w:color w:val="7F8C8D"/>
-          <w:lang w:val="en-US"/>
-        </w:rPr>
-        <w:t xml:space="preserve">   —   Finalist, National Scientific Initiation Conference (2023)</w:t>
+        <w:t>Developed a MATLAB-based mathematical model to analyze resonance behavior in wind turbine structures under dynamic loading.</w:t>
       </w:r>
     </w:p>
     <w:p>
@@ -1637,7 +1157,111 @@
           <w:color w:val="222222"/>
           <w:lang w:val="en-US"/>
         </w:rPr>
-        <w:t>Developed a MATLAB-based mathematical model to analyze resonance behavior in wind turbine structures under dynamic loading.</w:t>
+        <w:t>Presented results and methodology at a national-level scientific engineering conference, competing against university research teams.</w:t>
+      </w:r>
+    </w:p>
+    <w:p>
+      <w:pPr>
+        <w:pBdr>
+          <w:bottom w:val="single" w:sz="6" w:space="2" w:color="1A5276"/>
+        </w:pBdr>
+        <w:spacing w:before="240" w:after="60"/>
+        <w:rPr>
+          <w:lang w:val="en-US"/>
+        </w:rPr>
+      </w:pPr>
+      <w:r>
+        <w:rPr>
+          <w:rFonts w:ascii="Calibri" w:eastAsia="Calibri" w:hAnsi="Calibri" w:cs="Calibri"/>
+          <w:b/>
+          <w:bCs/>
+          <w:color w:val="1A5276"/>
+          <w:sz w:val="22"/>
+          <w:szCs w:val="22"/>
+          <w:lang w:val="en-US"/>
+        </w:rPr>
+        <w:t>LANGUAGES</w:t>
+      </w:r>
+    </w:p>
+    <w:p>
+      <w:pPr>
+        <w:spacing w:before="80" w:after="40"/>
+        <w:rPr>
+          <w:lang w:val="en-US"/>
+        </w:rPr>
+      </w:pPr>
+      <w:r>
+        <w:rPr>
+          <w:rFonts w:ascii="Calibri" w:eastAsia="Calibri" w:hAnsi="Calibri" w:cs="Calibri"/>
+          <w:b/>
+          <w:bCs/>
+          <w:color w:val="111111"/>
+          <w:lang w:val="en-US"/>
+        </w:rPr>
+        <w:t>Spanish</w:t>
+      </w:r>
+      <w:r>
+        <w:rPr>
+          <w:rFonts w:ascii="Calibri" w:eastAsia="Calibri" w:hAnsi="Calibri" w:cs="Calibri"/>
+          <w:color w:val="555555"/>
+          <w:lang w:val="en-US"/>
+        </w:rPr>
+        <w:t xml:space="preserve"> (Native)   •   </w:t>
+      </w:r>
+      <w:r>
+        <w:rPr>
+          <w:rFonts w:ascii="Calibri" w:eastAsia="Calibri" w:hAnsi="Calibri" w:cs="Calibri"/>
+          <w:b/>
+          <w:bCs/>
+          <w:color w:val="111111"/>
+          <w:lang w:val="en-US"/>
+        </w:rPr>
+        <w:t>English</w:t>
+      </w:r>
+      <w:r>
+        <w:rPr>
+          <w:rFonts w:ascii="Calibri" w:eastAsia="Calibri" w:hAnsi="Calibri" w:cs="Calibri"/>
+          <w:color w:val="555555"/>
+          <w:lang w:val="en-US"/>
+        </w:rPr>
+        <w:t xml:space="preserve"> (C1 – Full Professional Proficiency)   •   </w:t>
+      </w:r>
+      <w:r>
+        <w:rPr>
+          <w:rFonts w:ascii="Calibri" w:eastAsia="Calibri" w:hAnsi="Calibri" w:cs="Calibri"/>
+          <w:b/>
+          <w:bCs/>
+          <w:color w:val="111111"/>
+          <w:lang w:val="en-US"/>
+        </w:rPr>
+        <w:t>German</w:t>
+      </w:r>
+      <w:r>
+        <w:rPr>
+          <w:rFonts w:ascii="Calibri" w:eastAsia="Calibri" w:hAnsi="Calibri" w:cs="Calibri"/>
+          <w:color w:val="555555"/>
+          <w:lang w:val="en-US"/>
+        </w:rPr>
+        <w:t xml:space="preserve"> (A2 – actively developing)</w:t>
+      </w:r>
+    </w:p>
+    <w:p>
+      <w:pPr>
+        <w:pBdr>
+          <w:bottom w:val="single" w:sz="6" w:space="2" w:color="1A5276"/>
+        </w:pBdr>
+        <w:spacing w:before="240" w:after="60"/>
+      </w:pPr>
+      <w:r>
+        <w:rPr>
+          <w:rFonts w:ascii="Calibri" w:eastAsia="Calibri" w:hAnsi="Calibri" w:cs="Calibri"/>
+          <w:b/>
+          <w:bCs/>
+          <w:color w:val="1A5276"/>
+          <w:sz w:val="22"/>
+          <w:szCs w:val="22"/>
+        </w:rPr>
+        <w:t>PROFESSIONAL AFFILIATIONS</w:t>
       </w:r>
     </w:p>
     <w:p>
@@ -1648,183 +1272,13 @@
           <w:numId w:val="2"/>
         </w:numPr>
         <w:spacing w:before="40" w:after="40"/>
-        <w:rPr>
-          <w:lang w:val="en-US"/>
-        </w:rPr>
-      </w:pPr>
-      <w:r>
-        <w:rPr>
-          <w:rFonts w:ascii="Calibri" w:eastAsia="Calibri" w:hAnsi="Calibri" w:cs="Calibri"/>
-          <w:color w:val="222222"/>
-          <w:lang w:val="en-US"/>
-        </w:rPr>
-        <w:t>Presented results and methodology at a national-level scientific engineering conference, competing against university research teams.</w:t>
-      </w:r>
-    </w:p>
-    <w:p>
-      <w:pPr>
-        <w:pBdr>
-          <w:bottom w:val="single" w:sz="6" w:space="2" w:color="1A5276"/>
-        </w:pBdr>
-        <w:spacing w:before="240" w:after="60"/>
-        <w:rPr>
-          <w:lang w:val="en-US"/>
-        </w:rPr>
-      </w:pPr>
-      <w:r>
-        <w:rPr>
-          <w:rFonts w:ascii="Calibri" w:eastAsia="Calibri" w:hAnsi="Calibri" w:cs="Calibri"/>
-          <w:b/>
-          <w:bCs/>
-          <w:color w:val="1A5276"/>
-          <w:sz w:val="22"/>
-          <w:szCs w:val="22"/>
-          <w:lang w:val="en-US"/>
-        </w:rPr>
-        <w:t>LANGUAGES</w:t>
-      </w:r>
-    </w:p>
-    <w:p>
-      <w:pPr>
-        <w:spacing w:before="80" w:after="40"/>
-        <w:rPr>
-          <w:lang w:val="en-US"/>
-        </w:rPr>
-      </w:pPr>
-      <w:r>
-        <w:rPr>
-          <w:rFonts w:ascii="Calibri" w:eastAsia="Calibri" w:hAnsi="Calibri" w:cs="Calibri"/>
-          <w:b/>
-          <w:bCs/>
-          <w:color w:val="111111"/>
-          <w:lang w:val="en-US"/>
-        </w:rPr>
-        <w:t>Spanish</w:t>
-      </w:r>
-      <w:r>
-        <w:rPr>
-          <w:rFonts w:ascii="Calibri" w:eastAsia="Calibri" w:hAnsi="Calibri" w:cs="Calibri"/>
-          <w:color w:val="555555"/>
-          <w:lang w:val="en-US"/>
-        </w:rPr>
-        <w:t xml:space="preserve"> (</w:t>
-      </w:r>
-      <w:proofErr w:type="gramStart"/>
-      <w:r>
-        <w:rPr>
-          <w:rFonts w:ascii="Calibri" w:eastAsia="Calibri" w:hAnsi="Calibri" w:cs="Calibri"/>
-          <w:color w:val="555555"/>
-          <w:lang w:val="en-US"/>
-        </w:rPr>
-        <w:t xml:space="preserve">Native)   </w:t>
-      </w:r>
-      <w:proofErr w:type="gramEnd"/>
-      <w:r>
-        <w:rPr>
-          <w:rFonts w:ascii="Calibri" w:eastAsia="Calibri" w:hAnsi="Calibri" w:cs="Calibri"/>
-          <w:color w:val="555555"/>
-          <w:lang w:val="en-US"/>
-        </w:rPr>
-        <w:t xml:space="preserve">•   </w:t>
-      </w:r>
-      <w:r>
-        <w:rPr>
-          <w:rFonts w:ascii="Calibri" w:eastAsia="Calibri" w:hAnsi="Calibri" w:cs="Calibri"/>
-          <w:b/>
-          <w:bCs/>
-          <w:color w:val="111111"/>
-          <w:lang w:val="en-US"/>
-        </w:rPr>
-        <w:t>English</w:t>
-      </w:r>
-      <w:r>
-        <w:rPr>
-          <w:rFonts w:ascii="Calibri" w:eastAsia="Calibri" w:hAnsi="Calibri" w:cs="Calibri"/>
-          <w:color w:val="555555"/>
-          <w:lang w:val="en-US"/>
-        </w:rPr>
-        <w:t xml:space="preserve"> (C1 – Full Professional </w:t>
-      </w:r>
-      <w:proofErr w:type="gramStart"/>
-      <w:r>
-        <w:rPr>
-          <w:rFonts w:ascii="Calibri" w:eastAsia="Calibri" w:hAnsi="Calibri" w:cs="Calibri"/>
-          <w:color w:val="555555"/>
-          <w:lang w:val="en-US"/>
-        </w:rPr>
-        <w:t xml:space="preserve">Proficiency)   </w:t>
-      </w:r>
-      <w:proofErr w:type="gramEnd"/>
-      <w:r>
-        <w:rPr>
-          <w:rFonts w:ascii="Calibri" w:eastAsia="Calibri" w:hAnsi="Calibri" w:cs="Calibri"/>
-          <w:color w:val="555555"/>
-          <w:lang w:val="en-US"/>
-        </w:rPr>
-        <w:t xml:space="preserve">•   </w:t>
-      </w:r>
-      <w:r>
-        <w:rPr>
-          <w:rFonts w:ascii="Calibri" w:eastAsia="Calibri" w:hAnsi="Calibri" w:cs="Calibri"/>
-          <w:b/>
-          <w:bCs/>
-          <w:color w:val="111111"/>
-          <w:lang w:val="en-US"/>
-        </w:rPr>
-        <w:t>German</w:t>
-      </w:r>
-      <w:r>
-        <w:rPr>
-          <w:rFonts w:ascii="Calibri" w:eastAsia="Calibri" w:hAnsi="Calibri" w:cs="Calibri"/>
-          <w:color w:val="555555"/>
-          <w:lang w:val="en-US"/>
-        </w:rPr>
-        <w:t xml:space="preserve"> (A2 – actively developing; strong asset given prior work with Herrenknecht AG)</w:t>
-      </w:r>
-    </w:p>
-    <w:p>
-      <w:pPr>
-        <w:pBdr>
-          <w:bottom w:val="single" w:sz="6" w:space="2" w:color="1A5276"/>
-        </w:pBdr>
-        <w:spacing w:before="240" w:after="60"/>
-      </w:pPr>
-      <w:r>
-        <w:rPr>
-          <w:rFonts w:ascii="Calibri" w:eastAsia="Calibri" w:hAnsi="Calibri" w:cs="Calibri"/>
-          <w:b/>
-          <w:bCs/>
-          <w:color w:val="1A5276"/>
-          <w:sz w:val="22"/>
-          <w:szCs w:val="22"/>
-        </w:rPr>
-        <w:t>PROFESSIONAL AFFILIATIONS</w:t>
-      </w:r>
-    </w:p>
-    <w:p>
-      <w:pPr>
-        <w:pStyle w:val="ListParagraph"/>
-        <w:numPr>
-          <w:ilvl w:val="0"/>
-          <w:numId w:val="2"/>
-        </w:numPr>
-        <w:spacing w:before="40" w:after="40"/>
-      </w:pPr>
-      <w:proofErr w:type="spellStart"/>
-      <w:r>
-        <w:rPr>
-          <w:rFonts w:ascii="Calibri" w:eastAsia="Calibri" w:hAnsi="Calibri" w:cs="Calibri"/>
-          <w:color w:val="222222"/>
-        </w:rPr>
-        <w:t>Member</w:t>
-      </w:r>
-      <w:proofErr w:type="spellEnd"/>
-      <w:r>
-        <w:rPr>
-          <w:rFonts w:ascii="Calibri" w:eastAsia="Calibri" w:hAnsi="Calibri" w:cs="Calibri"/>
-          <w:color w:val="222222"/>
-        </w:rPr>
-        <w:t xml:space="preserve">, </w:t>
+      </w:pPr>
+      <w:r>
+        <w:rPr>
+          <w:rFonts w:ascii="Calibri" w:eastAsia="Calibri" w:hAnsi="Calibri" w:cs="Calibri"/>
+          <w:color w:val="222222"/>
+        </w:rPr>
+        <w:t xml:space="preserve">Member, </w:t>
       </w:r>
       <w:r>
         <w:rPr>

</xml_diff>

<commit_message>
Se agrego el Lab Section, queda actualizar el contenido. Ya está enlazado con el Medium.
</commit_message>
<xml_diff>
--- a/assets/CVs/ENGLISH/PROJECT MANAGER/20260214_Yerman-Merel_CV-Format_ENG_v2.0_rev.docx
+++ b/assets/CVs/ENGLISH/PROJECT MANAGER/20260214_Yerman-Merel_CV-Format_ENG_v2.0_rev.docx
@@ -45,40 +45,7 @@
           <w:szCs w:val="22"/>
           <w:lang w:val="en-US"/>
         </w:rPr>
-        <w:t>Field Service &amp; Industrial Systems</w:t>
-      </w:r>
-      <w:r>
-        <w:rPr>
-          <w:rFonts w:ascii="Arial" w:eastAsia="Calibri" w:hAnsi="Arial" w:cs="Arial"/>
-          <w:b/>
-          <w:bCs/>
-          <w:sz w:val="22"/>
-          <w:szCs w:val="22"/>
-          <w:lang w:val="en-US"/>
-        </w:rPr>
-        <w:t xml:space="preserve"> </w:t>
-      </w:r>
-      <w:r>
-        <w:rPr>
-          <w:rFonts w:ascii="Arial" w:eastAsia="Calibri" w:hAnsi="Arial" w:cs="Arial"/>
-          <w:b/>
-          <w:bCs/>
-          <w:sz w:val="22"/>
-          <w:szCs w:val="22"/>
-          <w:lang w:val="en-US"/>
-        </w:rPr>
-        <w:t xml:space="preserve">| </w:t>
-      </w:r>
-      <w:r>
-        <w:rPr>
-          <w:rFonts w:ascii="Arial" w:eastAsia="Calibri" w:hAnsi="Arial" w:cs="Arial"/>
-          <w:b/>
-          <w:bCs/>
-          <w:sz w:val="22"/>
-          <w:szCs w:val="22"/>
-          <w:lang w:val="en-US"/>
-        </w:rPr>
-        <w:t>Equipment Maintenance &amp; Technical Support</w:t>
+        <w:t>Industrial Infrastructure &amp; Maintenance Engineering | Field Operations &amp; Asset Reliability</w:t>
       </w:r>
     </w:p>
     <w:p>
@@ -193,15 +160,7 @@
           <w:color w:val="222222"/>
           <w:lang w:val="en-US"/>
         </w:rPr>
-        <w:t>Mechanical</w:t>
-      </w:r>
-      <w:r>
-        <w:rPr>
-          <w:rFonts w:ascii="Arial" w:eastAsia="Calibri" w:hAnsi="Arial" w:cs="Arial"/>
-          <w:color w:val="222222"/>
-          <w:lang w:val="en-US"/>
-        </w:rPr>
-        <w:t xml:space="preserve"> Engineer with experience in industrial environments, mechanical systems, and technical support for equipment and operations. </w:t>
+        <w:t xml:space="preserve">Mechanical Engineer with experience in industrial infrastructure, mechanical systems, and field engineering operations in tunnelling and large-scale industrial projects. </w:t>
       </w:r>
       <w:proofErr w:type="gramStart"/>
       <w:r>
@@ -219,15 +178,7 @@
           <w:color w:val="222222"/>
           <w:lang w:val="en-US"/>
         </w:rPr>
-        <w:t xml:space="preserve"> in preventive maintenance, troubleshooting, equipment monitoring, and field service support. Strong background in mechanical systems, industrial equipment, and engineering coordination, with the ability to diagnose technical issues, improve system performance, and support operational reliability in dynamic field environments</w:t>
-      </w:r>
-      <w:r>
-        <w:rPr>
-          <w:rFonts w:ascii="Arial" w:eastAsia="Calibri" w:hAnsi="Arial" w:cs="Arial"/>
-          <w:color w:val="222222"/>
-          <w:lang w:val="en-US"/>
-        </w:rPr>
-        <w:t>.</w:t>
+        <w:t xml:space="preserve"> in maintenance planning, technical inspections, equipment monitoring, and multidisciplinary engineering coordination across international projects. Strong background in industrial facilities, piping systems, mechanical equipment, and operational reliability, with experience supporting technical documentation, engineering evaluations, and maintenance activities to ensure safe and efficient infrastructure operations. Able to work in dynamic environments and contribute to asset integrity, inspection processes, and industrial project execution.</w:t>
       </w:r>
     </w:p>
     <w:p>
@@ -270,7 +221,7 @@
           <w:color w:val="111111"/>
           <w:lang w:val="en-US"/>
         </w:rPr>
-        <w:t>Technical Skills</w:t>
+        <w:t>Industrial &amp; Infrastructure Engineering</w:t>
       </w:r>
       <w:r>
         <w:rPr>
@@ -298,7 +249,7 @@
           <w:color w:val="222222"/>
           <w:lang w:val="en-US"/>
         </w:rPr>
-        <w:t>Field Service Support</w:t>
+        <w:t>Industrial Infrastructure Maintenance</w:t>
       </w:r>
       <w:r>
         <w:rPr>
@@ -322,7 +273,7 @@
           <w:color w:val="222222"/>
           <w:lang w:val="en-US"/>
         </w:rPr>
-        <w:t>Industrial Equipment Maintenance</w:t>
+        <w:t>Mechanical Systems &amp; Equipment</w:t>
       </w:r>
       <w:r>
         <w:rPr>
@@ -346,7 +297,31 @@
           <w:color w:val="222222"/>
           <w:lang w:val="en-US"/>
         </w:rPr>
-        <w:t>Mechanical Systems</w:t>
+        <w:t>Pumps, Piping &amp; Industrial Facilitie</w:t>
+      </w:r>
+      <w:r>
+        <w:rPr>
+          <w:rFonts w:ascii="Arial" w:eastAsia="Calibri" w:hAnsi="Arial" w:cs="Arial"/>
+          <w:color w:val="222222"/>
+          <w:lang w:val="en-US"/>
+        </w:rPr>
+        <w:t xml:space="preserve">s </w:t>
+      </w:r>
+      <w:r>
+        <w:rPr>
+          <w:rFonts w:ascii="Arial" w:eastAsia="Calibri" w:hAnsi="Arial" w:cs="Arial"/>
+          <w:color w:val="222222"/>
+          <w:lang w:val="en-US"/>
+        </w:rPr>
+        <w:t xml:space="preserve">• </w:t>
+      </w:r>
+      <w:r>
+        <w:rPr>
+          <w:rFonts w:ascii="Arial" w:eastAsia="Calibri" w:hAnsi="Arial" w:cs="Arial"/>
+          <w:color w:val="222222"/>
+          <w:lang w:val="en-US"/>
+        </w:rPr>
+        <w:t>Technical Inspections &amp; Field Engineering</w:t>
       </w:r>
       <w:r>
         <w:rPr>
@@ -370,7 +345,7 @@
           <w:color w:val="222222"/>
           <w:lang w:val="en-US"/>
         </w:rPr>
-        <w:t>Pumps and Piping Systems</w:t>
+        <w:t>Equipment Monitoring &amp; Troubleshooting</w:t>
       </w:r>
       <w:r>
         <w:rPr>
@@ -386,6 +361,76 @@
           <w:color w:val="222222"/>
           <w:lang w:val="en-US"/>
         </w:rPr>
+        <w:t>•</w:t>
+      </w:r>
+      <w:r>
+        <w:rPr>
+          <w:rFonts w:ascii="Arial" w:eastAsia="Calibri" w:hAnsi="Arial" w:cs="Arial"/>
+          <w:color w:val="222222"/>
+          <w:lang w:val="en-US"/>
+        </w:rPr>
+        <w:t xml:space="preserve"> </w:t>
+      </w:r>
+      <w:r>
+        <w:rPr>
+          <w:rFonts w:ascii="Arial" w:eastAsia="Calibri" w:hAnsi="Arial" w:cs="Arial"/>
+          <w:color w:val="222222"/>
+          <w:lang w:val="en-US"/>
+        </w:rPr>
+        <w:t>Asset Reliability &amp; Operational Support</w:t>
+      </w:r>
+    </w:p>
+    <w:p>
+      <w:pPr>
+        <w:spacing w:before="60" w:after="60"/>
+        <w:rPr>
+          <w:rFonts w:ascii="Arial" w:eastAsia="Calibri" w:hAnsi="Arial" w:cs="Arial"/>
+          <w:color w:val="222222"/>
+          <w:lang w:val="en-US"/>
+        </w:rPr>
+      </w:pPr>
+      <w:r>
+        <w:rPr>
+          <w:rFonts w:ascii="Arial" w:eastAsia="Calibri" w:hAnsi="Arial" w:cs="Arial"/>
+          <w:b/>
+          <w:bCs/>
+          <w:color w:val="111111"/>
+          <w:lang w:val="en-US"/>
+        </w:rPr>
+        <w:t>Engineering &amp; Project Coordination</w:t>
+      </w:r>
+      <w:r>
+        <w:rPr>
+          <w:rFonts w:ascii="Arial" w:eastAsia="Calibri" w:hAnsi="Arial" w:cs="Arial"/>
+          <w:b/>
+          <w:bCs/>
+          <w:color w:val="111111"/>
+          <w:lang w:val="en-US"/>
+        </w:rPr>
+        <w:t xml:space="preserve">: </w:t>
+      </w:r>
+      <w:r>
+        <w:rPr>
+          <w:rFonts w:ascii="Arial" w:eastAsia="Calibri" w:hAnsi="Arial" w:cs="Arial"/>
+          <w:color w:val="222222"/>
+          <w:lang w:val="en-US"/>
+        </w:rPr>
+        <w:t>Technical Documentation &amp; Reporting</w:t>
+      </w:r>
+      <w:r>
+        <w:rPr>
+          <w:rFonts w:ascii="Arial" w:eastAsia="Calibri" w:hAnsi="Arial" w:cs="Arial"/>
+          <w:color w:val="222222"/>
+          <w:lang w:val="en-US"/>
+        </w:rPr>
+        <w:t xml:space="preserve"> </w:t>
+      </w:r>
+      <w:r>
+        <w:rPr>
+          <w:rFonts w:ascii="Arial" w:eastAsia="Calibri" w:hAnsi="Arial" w:cs="Arial"/>
+          <w:color w:val="222222"/>
+          <w:lang w:val="en-US"/>
+        </w:rPr>
         <w:t xml:space="preserve">• </w:t>
       </w:r>
       <w:r>
@@ -394,7 +439,7 @@
           <w:color w:val="222222"/>
           <w:lang w:val="en-US"/>
         </w:rPr>
-        <w:t>Pumps and Piping Systems</w:t>
+        <w:t>Engineering Coordination</w:t>
       </w:r>
       <w:r>
         <w:rPr>
@@ -410,6 +455,135 @@
           <w:color w:val="222222"/>
           <w:lang w:val="en-US"/>
         </w:rPr>
+        <w:t xml:space="preserve">• </w:t>
+      </w:r>
+      <w:r>
+        <w:rPr>
+          <w:rFonts w:ascii="Arial" w:eastAsia="Calibri" w:hAnsi="Arial" w:cs="Arial"/>
+          <w:color w:val="222222"/>
+          <w:lang w:val="en-US"/>
+        </w:rPr>
+        <w:t>Maintenance Planning Support</w:t>
+      </w:r>
+      <w:r>
+        <w:rPr>
+          <w:rFonts w:ascii="Arial" w:eastAsia="Calibri" w:hAnsi="Arial" w:cs="Arial"/>
+          <w:color w:val="222222"/>
+          <w:lang w:val="en-US"/>
+        </w:rPr>
+        <w:t xml:space="preserve"> </w:t>
+      </w:r>
+      <w:r>
+        <w:rPr>
+          <w:rFonts w:ascii="Arial" w:eastAsia="Calibri" w:hAnsi="Arial" w:cs="Arial"/>
+          <w:color w:val="222222"/>
+          <w:lang w:val="en-US"/>
+        </w:rPr>
+        <w:t xml:space="preserve">• </w:t>
+      </w:r>
+      <w:r>
+        <w:rPr>
+          <w:rFonts w:ascii="Arial" w:eastAsia="Calibri" w:hAnsi="Arial" w:cs="Arial"/>
+          <w:color w:val="222222"/>
+          <w:lang w:val="en-US"/>
+        </w:rPr>
+        <w:t>Multidisciplinary Team Collaboration</w:t>
+      </w:r>
+      <w:r>
+        <w:rPr>
+          <w:rFonts w:ascii="Arial" w:eastAsia="Calibri" w:hAnsi="Arial" w:cs="Arial"/>
+          <w:color w:val="222222"/>
+          <w:lang w:val="en-US"/>
+        </w:rPr>
+        <w:t xml:space="preserve"> </w:t>
+      </w:r>
+      <w:r>
+        <w:rPr>
+          <w:rFonts w:ascii="Arial" w:eastAsia="Calibri" w:hAnsi="Arial" w:cs="Arial"/>
+          <w:color w:val="222222"/>
+          <w:lang w:val="en-US"/>
+        </w:rPr>
+        <w:t xml:space="preserve">• </w:t>
+      </w:r>
+      <w:r>
+        <w:rPr>
+          <w:rFonts w:ascii="Arial" w:eastAsia="Calibri" w:hAnsi="Arial" w:cs="Arial"/>
+          <w:color w:val="222222"/>
+          <w:lang w:val="en-US"/>
+        </w:rPr>
+        <w:t xml:space="preserve">Operational Performance </w:t>
+      </w:r>
+      <w:proofErr w:type="spellStart"/>
+      <w:r>
+        <w:rPr>
+          <w:rFonts w:ascii="Arial" w:eastAsia="Calibri" w:hAnsi="Arial" w:cs="Arial"/>
+          <w:color w:val="222222"/>
+          <w:lang w:val="en-US"/>
+        </w:rPr>
+        <w:t>Monitoring</w:t>
+      </w:r>
+      <w:proofErr w:type="spellEnd"/>
+    </w:p>
+    <w:p>
+      <w:pPr>
+        <w:spacing w:before="60" w:after="60"/>
+        <w:rPr>
+          <w:rFonts w:ascii="Arial" w:eastAsia="Calibri" w:hAnsi="Arial" w:cs="Arial"/>
+          <w:color w:val="222222"/>
+          <w:lang w:val="en-US"/>
+        </w:rPr>
+      </w:pPr>
+      <w:r>
+        <w:rPr>
+          <w:rFonts w:ascii="Arial" w:eastAsia="Calibri" w:hAnsi="Arial" w:cs="Arial"/>
+          <w:b/>
+          <w:bCs/>
+          <w:color w:val="111111"/>
+          <w:lang w:val="en-US"/>
+        </w:rPr>
+        <w:t>Technical Tools</w:t>
+      </w:r>
+      <w:r>
+        <w:rPr>
+          <w:rFonts w:ascii="Arial" w:eastAsia="Calibri" w:hAnsi="Arial" w:cs="Arial"/>
+          <w:b/>
+          <w:bCs/>
+          <w:color w:val="111111"/>
+          <w:lang w:val="en-US"/>
+        </w:rPr>
+        <w:t>:</w:t>
+      </w:r>
+      <w:r>
+        <w:rPr>
+          <w:rFonts w:ascii="Arial" w:hAnsi="Arial" w:cs="Arial"/>
+          <w:b/>
+          <w:bCs/>
+          <w:lang w:val="en-US"/>
+        </w:rPr>
+        <w:t xml:space="preserve"> </w:t>
+      </w:r>
+      <w:r>
+        <w:rPr>
+          <w:rFonts w:ascii="Arial" w:eastAsia="Calibri" w:hAnsi="Arial" w:cs="Arial"/>
+          <w:color w:val="222222"/>
+          <w:lang w:val="en-US"/>
+        </w:rPr>
+        <w:t>MS Excel</w:t>
+      </w:r>
+      <w:r>
+        <w:rPr>
+          <w:rFonts w:ascii="Arial" w:eastAsia="Calibri" w:hAnsi="Arial" w:cs="Arial"/>
+          <w:color w:val="222222"/>
+          <w:lang w:val="en-US"/>
+        </w:rPr>
+        <w:t xml:space="preserve"> </w:t>
+      </w:r>
+      <w:r>
+        <w:rPr>
+          <w:rFonts w:ascii="Arial" w:eastAsia="Calibri" w:hAnsi="Arial" w:cs="Arial"/>
+          <w:color w:val="222222"/>
+          <w:lang w:val="en-US"/>
+        </w:rPr>
         <w:t>•</w:t>
       </w:r>
       <w:r>
@@ -426,7 +600,7 @@
           <w:color w:val="222222"/>
           <w:lang w:val="en-US"/>
         </w:rPr>
-        <w:t>Troubleshooting and Diagnostics</w:t>
+        <w:t>Microsoft Office</w:t>
       </w:r>
       <w:r>
         <w:rPr>
@@ -458,253 +632,7 @@
           <w:color w:val="222222"/>
           <w:lang w:val="en-US"/>
         </w:rPr>
-        <w:t>Technical Inspections</w:t>
-      </w:r>
-    </w:p>
-    <w:p>
-      <w:pPr>
-        <w:spacing w:before="60" w:after="60"/>
-        <w:rPr>
-          <w:rFonts w:ascii="Arial" w:eastAsia="Calibri" w:hAnsi="Arial" w:cs="Arial"/>
-          <w:color w:val="222222"/>
-          <w:lang w:val="en-US"/>
-        </w:rPr>
-      </w:pPr>
-      <w:r>
-        <w:rPr>
-          <w:rFonts w:ascii="Arial" w:eastAsia="Calibri" w:hAnsi="Arial" w:cs="Arial"/>
-          <w:b/>
-          <w:bCs/>
-          <w:color w:val="111111"/>
-          <w:lang w:val="en-US"/>
-        </w:rPr>
-        <w:t>Engineerin</w:t>
-      </w:r>
-      <w:r>
-        <w:rPr>
-          <w:rFonts w:ascii="Arial" w:eastAsia="Calibri" w:hAnsi="Arial" w:cs="Arial"/>
-          <w:b/>
-          <w:bCs/>
-          <w:color w:val="111111"/>
-          <w:lang w:val="en-US"/>
-        </w:rPr>
-        <w:t xml:space="preserve">g </w:t>
-      </w:r>
-      <w:r>
-        <w:rPr>
-          <w:rFonts w:ascii="Arial" w:eastAsia="Calibri" w:hAnsi="Arial" w:cs="Arial"/>
-          <w:b/>
-          <w:bCs/>
-          <w:color w:val="111111"/>
-          <w:lang w:val="en-US"/>
-        </w:rPr>
-        <w:t>Skills</w:t>
-      </w:r>
-      <w:r>
-        <w:rPr>
-          <w:rFonts w:ascii="Arial" w:eastAsia="Calibri" w:hAnsi="Arial" w:cs="Arial"/>
-          <w:b/>
-          <w:bCs/>
-          <w:color w:val="111111"/>
-          <w:lang w:val="en-US"/>
-        </w:rPr>
-        <w:t xml:space="preserve">: </w:t>
-      </w:r>
-      <w:r>
-        <w:rPr>
-          <w:rFonts w:ascii="Arial" w:eastAsia="Calibri" w:hAnsi="Arial" w:cs="Arial"/>
-          <w:color w:val="222222"/>
-          <w:lang w:val="en-US"/>
-        </w:rPr>
-        <w:t>Problem Solving</w:t>
-      </w:r>
-      <w:r>
-        <w:rPr>
-          <w:rFonts w:ascii="Arial" w:eastAsia="Calibri" w:hAnsi="Arial" w:cs="Arial"/>
-          <w:color w:val="222222"/>
-          <w:lang w:val="en-US"/>
-        </w:rPr>
-        <w:t xml:space="preserve"> </w:t>
-      </w:r>
-      <w:r>
-        <w:rPr>
-          <w:rFonts w:ascii="Arial" w:eastAsia="Calibri" w:hAnsi="Arial" w:cs="Arial"/>
-          <w:color w:val="222222"/>
-          <w:lang w:val="en-US"/>
-        </w:rPr>
-        <w:t xml:space="preserve">• </w:t>
-      </w:r>
-      <w:r>
-        <w:rPr>
-          <w:rFonts w:ascii="Arial" w:eastAsia="Calibri" w:hAnsi="Arial" w:cs="Arial"/>
-          <w:color w:val="222222"/>
-          <w:lang w:val="en-US"/>
-        </w:rPr>
-        <w:t>Technical Documentation</w:t>
-      </w:r>
-      <w:r>
-        <w:rPr>
-          <w:rFonts w:ascii="Arial" w:eastAsia="Calibri" w:hAnsi="Arial" w:cs="Arial"/>
-          <w:color w:val="222222"/>
-          <w:lang w:val="en-US"/>
-        </w:rPr>
-        <w:t xml:space="preserve"> </w:t>
-      </w:r>
-      <w:r>
-        <w:rPr>
-          <w:rFonts w:ascii="Arial" w:eastAsia="Calibri" w:hAnsi="Arial" w:cs="Arial"/>
-          <w:color w:val="222222"/>
-          <w:lang w:val="en-US"/>
-        </w:rPr>
-        <w:t xml:space="preserve">• </w:t>
-      </w:r>
-      <w:r>
-        <w:rPr>
-          <w:rFonts w:ascii="Arial" w:eastAsia="Calibri" w:hAnsi="Arial" w:cs="Arial"/>
-          <w:color w:val="222222"/>
-          <w:lang w:val="en-US"/>
-        </w:rPr>
-        <w:t>Customer Support</w:t>
-      </w:r>
-      <w:r>
-        <w:rPr>
-          <w:rFonts w:ascii="Arial" w:eastAsia="Calibri" w:hAnsi="Arial" w:cs="Arial"/>
-          <w:color w:val="222222"/>
-          <w:lang w:val="en-US"/>
-        </w:rPr>
-        <w:t xml:space="preserve"> </w:t>
-      </w:r>
-      <w:r>
-        <w:rPr>
-          <w:rFonts w:ascii="Arial" w:eastAsia="Calibri" w:hAnsi="Arial" w:cs="Arial"/>
-          <w:color w:val="222222"/>
-          <w:lang w:val="en-US"/>
-        </w:rPr>
-        <w:t xml:space="preserve">• </w:t>
-      </w:r>
-      <w:r>
-        <w:rPr>
-          <w:rFonts w:ascii="Arial" w:eastAsia="Calibri" w:hAnsi="Arial" w:cs="Arial"/>
-          <w:color w:val="222222"/>
-          <w:lang w:val="en-US"/>
-        </w:rPr>
-        <w:t>Equipment Performance Monitoring</w:t>
-      </w:r>
-      <w:r>
-        <w:rPr>
-          <w:rFonts w:ascii="Arial" w:eastAsia="Calibri" w:hAnsi="Arial" w:cs="Arial"/>
-          <w:color w:val="222222"/>
-          <w:lang w:val="en-US"/>
-        </w:rPr>
-        <w:t xml:space="preserve"> </w:t>
-      </w:r>
-      <w:r>
-        <w:rPr>
-          <w:rFonts w:ascii="Arial" w:eastAsia="Calibri" w:hAnsi="Arial" w:cs="Arial"/>
-          <w:color w:val="222222"/>
-          <w:lang w:val="en-US"/>
-        </w:rPr>
-        <w:t xml:space="preserve">• </w:t>
-      </w:r>
-      <w:r>
-        <w:rPr>
-          <w:rFonts w:ascii="Arial" w:eastAsia="Calibri" w:hAnsi="Arial" w:cs="Arial"/>
-          <w:color w:val="222222"/>
-          <w:lang w:val="en-US"/>
-        </w:rPr>
-        <w:t>Equipment Performance Monitoring</w:t>
-      </w:r>
-    </w:p>
-    <w:p>
-      <w:pPr>
-        <w:spacing w:before="60" w:after="60"/>
-        <w:rPr>
-          <w:rFonts w:ascii="Arial" w:hAnsi="Arial" w:cs="Arial"/>
-          <w:b/>
-          <w:bCs/>
-          <w:lang w:val="en-US"/>
-        </w:rPr>
-      </w:pPr>
-      <w:r>
-        <w:rPr>
-          <w:rFonts w:ascii="Arial" w:hAnsi="Arial" w:cs="Arial"/>
-          <w:b/>
-          <w:bCs/>
-          <w:lang w:val="en-US"/>
-        </w:rPr>
-        <w:t xml:space="preserve">Technical inspections: </w:t>
-      </w:r>
-      <w:r>
-        <w:rPr>
-          <w:rFonts w:ascii="Arial" w:eastAsia="Calibri" w:hAnsi="Arial" w:cs="Arial"/>
-          <w:color w:val="222222"/>
-          <w:lang w:val="en-US"/>
-        </w:rPr>
-        <w:t>MS Excel</w:t>
-      </w:r>
-      <w:r>
-        <w:rPr>
-          <w:rFonts w:ascii="Arial" w:eastAsia="Calibri" w:hAnsi="Arial" w:cs="Arial"/>
-          <w:color w:val="222222"/>
-          <w:lang w:val="en-US"/>
-        </w:rPr>
-        <w:t xml:space="preserve"> </w:t>
-      </w:r>
-      <w:r>
-        <w:rPr>
-          <w:rFonts w:ascii="Arial" w:eastAsia="Calibri" w:hAnsi="Arial" w:cs="Arial"/>
-          <w:color w:val="222222"/>
-          <w:lang w:val="en-US"/>
-        </w:rPr>
-        <w:t>•</w:t>
-      </w:r>
-      <w:r>
-        <w:rPr>
-          <w:rFonts w:ascii="Arial" w:eastAsia="Calibri" w:hAnsi="Arial" w:cs="Arial"/>
-          <w:color w:val="222222"/>
-          <w:lang w:val="en-US"/>
-        </w:rPr>
-        <w:t xml:space="preserve"> </w:t>
-      </w:r>
-      <w:r>
-        <w:rPr>
-          <w:rFonts w:ascii="Arial" w:eastAsia="Calibri" w:hAnsi="Arial" w:cs="Arial"/>
-          <w:color w:val="222222"/>
-          <w:lang w:val="en-US"/>
-        </w:rPr>
-        <w:t>Microsoft Office</w:t>
-      </w:r>
-      <w:r>
-        <w:rPr>
-          <w:rFonts w:ascii="Arial" w:eastAsia="Calibri" w:hAnsi="Arial" w:cs="Arial"/>
-          <w:color w:val="222222"/>
-          <w:lang w:val="en-US"/>
-        </w:rPr>
-        <w:t xml:space="preserve"> </w:t>
-      </w:r>
-      <w:r>
-        <w:rPr>
-          <w:rFonts w:ascii="Arial" w:eastAsia="Calibri" w:hAnsi="Arial" w:cs="Arial"/>
-          <w:color w:val="222222"/>
-          <w:lang w:val="en-US"/>
-        </w:rPr>
-        <w:t>•</w:t>
-      </w:r>
-      <w:r>
-        <w:rPr>
-          <w:rFonts w:ascii="Arial" w:eastAsia="Calibri" w:hAnsi="Arial" w:cs="Arial"/>
-          <w:color w:val="222222"/>
-          <w:lang w:val="en-US"/>
-        </w:rPr>
-        <w:t xml:space="preserve"> </w:t>
-      </w:r>
-      <w:r>
-        <w:rPr>
-          <w:rFonts w:ascii="Arial" w:eastAsia="Calibri" w:hAnsi="Arial" w:cs="Arial"/>
-          <w:color w:val="222222"/>
-          <w:lang w:val="en-US"/>
-        </w:rPr>
-        <w:t>Microsoft Office</w:t>
+        <w:t>Technical Reporting &amp; Data Analysis</w:t>
       </w:r>
     </w:p>
     <w:p>
@@ -753,6 +681,7 @@
       <w:r>
         <w:rPr>
           <w:rFonts w:ascii="Arial" w:eastAsia="Calibri" w:hAnsi="Arial" w:cs="Arial"/>
+          <w:color w:val="002060"/>
           <w:sz w:val="22"/>
           <w:szCs w:val="22"/>
           <w:lang w:val="en-US"/>
@@ -762,7 +691,7 @@
       <w:r>
         <w:rPr>
           <w:rFonts w:ascii="Arial" w:eastAsia="Calibri" w:hAnsi="Arial" w:cs="Arial"/>
-          <w:color w:val="7F8C8D"/>
+          <w:color w:val="002060"/>
           <w:sz w:val="22"/>
           <w:szCs w:val="22"/>
           <w:lang w:val="en-US"/>
@@ -775,6 +704,7 @@
           <w:rFonts w:ascii="Arial" w:eastAsia="Calibri" w:hAnsi="Arial" w:cs="Arial"/>
           <w:b/>
           <w:bCs/>
+          <w:color w:val="002060"/>
           <w:sz w:val="22"/>
           <w:szCs w:val="22"/>
           <w:lang w:val="en-US"/>
@@ -787,6 +717,7 @@
           <w:rFonts w:ascii="Arial" w:eastAsia="Calibri" w:hAnsi="Arial" w:cs="Arial"/>
           <w:b/>
           <w:bCs/>
+          <w:color w:val="002060"/>
           <w:sz w:val="22"/>
           <w:szCs w:val="22"/>
           <w:lang w:val="en-US"/>
@@ -834,7 +765,7 @@
           <w:color w:val="222222"/>
           <w:lang w:val="en-US"/>
         </w:rPr>
-        <w:t>Supported monitoring and evaluation of mechanical and industrial equipment across 2 international tunnelling projects, contributing to improved operational performance tracking and reducing potential failure risks by 15%.</w:t>
+        <w:t>Supported monitoring and evaluation of mechanical and industrial infrastructure systems across 2 international tunnelling projects, improving operational performance tracking and reducing potential equipment failure risks by 15%.</w:t>
       </w:r>
     </w:p>
     <w:p>
@@ -855,7 +786,7 @@
           <w:rFonts w:ascii="Arial" w:hAnsi="Arial" w:cs="Arial"/>
           <w:lang w:val="en-US"/>
         </w:rPr>
-        <w:t>Conducted technical inspections and operational analysis of mechanical systems, supporting early identification of equipment issues and improving system reliability by 20%.</w:t>
+        <w:t>Conducted technical inspections and operational analysis of mechanical equipment and industrial systems, contributing to a 20% improvement in system reliability and early fault detection.</w:t>
       </w:r>
     </w:p>
     <w:p>
@@ -877,7 +808,167 @@
           <w:color w:val="222222"/>
           <w:lang w:val="en-US"/>
         </w:rPr>
-        <w:t>Conducted technical inspections and operational analysis of mechanical systems, supporting early identification of equipment issues and improving system reliability by 20%.</w:t>
+        <w:t>Coordinated engineering documentation, maintenance activities, and technical communication for multidisciplinary teams of 5+ engineers, improving operational workflow efficiency by 18%.</w:t>
+      </w:r>
+    </w:p>
+    <w:p>
+      <w:pPr>
+        <w:pStyle w:val="ListParagraph"/>
+        <w:numPr>
+          <w:ilvl w:val="0"/>
+          <w:numId w:val="2"/>
+        </w:numPr>
+        <w:rPr>
+          <w:rFonts w:ascii="Arial" w:eastAsia="Calibri" w:hAnsi="Arial" w:cs="Arial"/>
+          <w:color w:val="222222"/>
+          <w:lang w:val="en-US"/>
+        </w:rPr>
+      </w:pPr>
+      <w:r>
+        <w:rPr>
+          <w:rFonts w:ascii="Arial" w:eastAsia="Calibri" w:hAnsi="Arial" w:cs="Arial"/>
+          <w:color w:val="222222"/>
+          <w:lang w:val="en-US"/>
+        </w:rPr>
+        <w:t>Supported maintenance planning and engineering evaluation of industrial equipment and field infrastructure to ensure operational continuity and safety compliance.</w:t>
+      </w:r>
+    </w:p>
+    <w:p>
+      <w:pPr>
+        <w:spacing w:before="40" w:after="40"/>
+        <w:ind w:left="240"/>
+        <w:rPr>
+          <w:rFonts w:ascii="Arial" w:hAnsi="Arial" w:cs="Arial"/>
+          <w:lang w:val="en-US"/>
+        </w:rPr>
+      </w:pPr>
+      <w:r>
+        <w:rPr>
+          <w:rFonts w:ascii="Arial" w:eastAsia="Calibri" w:hAnsi="Arial" w:cs="Arial"/>
+          <w:i/>
+          <w:iCs/>
+          <w:color w:val="7F8C8D"/>
+          <w:lang w:val="en-US"/>
+        </w:rPr>
+        <w:t>Key projects: Hudson River Tunnel Project (USA) • Railway Tunnel Project (</w:t>
+      </w:r>
+      <w:r>
+        <w:rPr>
+          <w:rFonts w:ascii="Arial" w:eastAsia="Calibri" w:hAnsi="Arial" w:cs="Arial"/>
+          <w:i/>
+          <w:iCs/>
+          <w:color w:val="7F8C8D"/>
+          <w:lang w:val="en-US"/>
+        </w:rPr>
+        <w:t>Perú</w:t>
+      </w:r>
+      <w:r>
+        <w:rPr>
+          <w:rFonts w:ascii="Arial" w:eastAsia="Calibri" w:hAnsi="Arial" w:cs="Arial"/>
+          <w:i/>
+          <w:iCs/>
+          <w:color w:val="7F8C8D"/>
+          <w:lang w:val="en-US"/>
+        </w:rPr>
+        <w:t>)</w:t>
+      </w:r>
+    </w:p>
+    <w:p>
+      <w:pPr>
+        <w:spacing w:before="180" w:after="20"/>
+        <w:rPr>
+          <w:rFonts w:ascii="Arial" w:hAnsi="Arial" w:cs="Arial"/>
+          <w:lang w:val="en-US"/>
+        </w:rPr>
+      </w:pPr>
+      <w:r>
+        <w:rPr>
+          <w:rFonts w:ascii="Arial" w:eastAsia="Calibri" w:hAnsi="Arial" w:cs="Arial"/>
+          <w:b/>
+          <w:bCs/>
+          <w:color w:val="111111"/>
+          <w:sz w:val="22"/>
+          <w:szCs w:val="22"/>
+          <w:lang w:val="en-US"/>
+        </w:rPr>
+        <w:t>Field Engineer – TBM &amp; Surface Facilities (</w:t>
+      </w:r>
+      <w:proofErr w:type="gramStart"/>
+      <w:r>
+        <w:rPr>
+          <w:rFonts w:ascii="Arial" w:eastAsia="Calibri" w:hAnsi="Arial" w:cs="Arial"/>
+          <w:b/>
+          <w:bCs/>
+          <w:color w:val="111111"/>
+          <w:sz w:val="22"/>
+          <w:szCs w:val="22"/>
+          <w:lang w:val="en-US"/>
+        </w:rPr>
+        <w:t>Intern)</w:t>
+      </w:r>
+      <w:r>
+        <w:rPr>
+          <w:rFonts w:ascii="Arial" w:eastAsia="Calibri" w:hAnsi="Arial" w:cs="Arial"/>
+          <w:color w:val="7F8C8D"/>
+          <w:sz w:val="22"/>
+          <w:szCs w:val="22"/>
+          <w:lang w:val="en-US"/>
+        </w:rPr>
+        <w:t xml:space="preserve">  </w:t>
+      </w:r>
+      <w:r>
+        <w:rPr>
+          <w:rFonts w:ascii="Arial" w:eastAsia="Calibri" w:hAnsi="Arial" w:cs="Arial"/>
+          <w:color w:val="002060"/>
+          <w:sz w:val="22"/>
+          <w:szCs w:val="22"/>
+          <w:lang w:val="en-US"/>
+        </w:rPr>
+        <w:t>|</w:t>
+      </w:r>
+      <w:proofErr w:type="gramEnd"/>
+      <w:r>
+        <w:rPr>
+          <w:rFonts w:ascii="Arial" w:eastAsia="Calibri" w:hAnsi="Arial" w:cs="Arial"/>
+          <w:color w:val="7F8C8D"/>
+          <w:sz w:val="22"/>
+          <w:szCs w:val="22"/>
+          <w:lang w:val="en-US"/>
+        </w:rPr>
+        <w:t xml:space="preserve">  </w:t>
+      </w:r>
+      <w:r>
+        <w:rPr>
+          <w:rFonts w:ascii="Arial" w:eastAsia="Calibri" w:hAnsi="Arial" w:cs="Arial"/>
+          <w:b/>
+          <w:bCs/>
+          <w:color w:val="002060"/>
+          <w:sz w:val="22"/>
+          <w:szCs w:val="22"/>
+          <w:lang w:val="en-US"/>
+        </w:rPr>
+        <w:t>China Railway Tunnel Group Co., Ltd.</w:t>
+      </w:r>
+    </w:p>
+    <w:p>
+      <w:pPr>
+        <w:spacing w:after="60"/>
+        <w:rPr>
+          <w:rFonts w:ascii="Arial" w:hAnsi="Arial" w:cs="Arial"/>
+          <w:lang w:val="en-US"/>
+        </w:rPr>
+      </w:pPr>
+      <w:r>
+        <w:rPr>
+          <w:rFonts w:ascii="Arial" w:eastAsia="Calibri" w:hAnsi="Arial" w:cs="Arial"/>
+          <w:i/>
+          <w:iCs/>
+          <w:color w:val="7F8C8D"/>
+          <w:sz w:val="18"/>
+          <w:szCs w:val="18"/>
+          <w:lang w:val="en-US"/>
+        </w:rPr>
+        <w:t>Panamá City, Panamá   •   Aug 2024 – Jan 2025</w:t>
       </w:r>
     </w:p>
     <w:p>
@@ -899,135 +990,15 @@
           <w:color w:val="222222"/>
           <w:lang w:val="en-US"/>
         </w:rPr>
-        <w:t>Coordinated engineering documentation and maintenance support activities for multidisciplinary teams of 5+ engineers, improving operational workflow efficiency by 18%.</w:t>
-      </w:r>
-    </w:p>
-    <w:p>
-      <w:pPr>
-        <w:spacing w:before="40" w:after="40"/>
-        <w:ind w:left="240"/>
-        <w:rPr>
-          <w:rFonts w:ascii="Arial" w:hAnsi="Arial" w:cs="Arial"/>
-          <w:lang w:val="en-US"/>
-        </w:rPr>
-      </w:pPr>
-      <w:r>
-        <w:rPr>
-          <w:rFonts w:ascii="Arial" w:eastAsia="Calibri" w:hAnsi="Arial" w:cs="Arial"/>
-          <w:i/>
-          <w:iCs/>
-          <w:color w:val="7F8C8D"/>
-          <w:lang w:val="en-US"/>
-        </w:rPr>
-        <w:t>Key projects: Hudson River Tunnel Project (USA) • Railway Tunnel Project (</w:t>
-      </w:r>
-      <w:r>
-        <w:rPr>
-          <w:rFonts w:ascii="Arial" w:eastAsia="Calibri" w:hAnsi="Arial" w:cs="Arial"/>
-          <w:i/>
-          <w:iCs/>
-          <w:color w:val="7F8C8D"/>
-          <w:lang w:val="en-US"/>
-        </w:rPr>
-        <w:t>Perú</w:t>
-      </w:r>
-      <w:r>
-        <w:rPr>
-          <w:rFonts w:ascii="Arial" w:eastAsia="Calibri" w:hAnsi="Arial" w:cs="Arial"/>
-          <w:i/>
-          <w:iCs/>
-          <w:color w:val="7F8C8D"/>
-          <w:lang w:val="en-US"/>
-        </w:rPr>
-        <w:t>)</w:t>
-      </w:r>
-    </w:p>
-    <w:p>
-      <w:pPr>
-        <w:spacing w:before="180" w:after="20"/>
-        <w:rPr>
-          <w:rFonts w:ascii="Arial" w:hAnsi="Arial" w:cs="Arial"/>
-          <w:lang w:val="en-US"/>
-        </w:rPr>
-      </w:pPr>
-      <w:r>
-        <w:rPr>
-          <w:rFonts w:ascii="Arial" w:eastAsia="Calibri" w:hAnsi="Arial" w:cs="Arial"/>
-          <w:b/>
-          <w:bCs/>
-          <w:color w:val="111111"/>
-          <w:sz w:val="22"/>
-          <w:szCs w:val="22"/>
-          <w:lang w:val="en-US"/>
-        </w:rPr>
-        <w:t>Field Engineer – TBM &amp; Surface Facilities (</w:t>
-      </w:r>
-      <w:proofErr w:type="gramStart"/>
-      <w:r>
-        <w:rPr>
-          <w:rFonts w:ascii="Arial" w:eastAsia="Calibri" w:hAnsi="Arial" w:cs="Arial"/>
-          <w:b/>
-          <w:bCs/>
-          <w:color w:val="111111"/>
-          <w:sz w:val="22"/>
-          <w:szCs w:val="22"/>
-          <w:lang w:val="en-US"/>
-        </w:rPr>
-        <w:t>Intern)</w:t>
-      </w:r>
-      <w:r>
-        <w:rPr>
-          <w:rFonts w:ascii="Arial" w:eastAsia="Calibri" w:hAnsi="Arial" w:cs="Arial"/>
-          <w:color w:val="7F8C8D"/>
-          <w:sz w:val="22"/>
-          <w:szCs w:val="22"/>
-          <w:lang w:val="en-US"/>
-        </w:rPr>
-        <w:t xml:space="preserve">  |</w:t>
-      </w:r>
-      <w:proofErr w:type="gramEnd"/>
-      <w:r>
-        <w:rPr>
-          <w:rFonts w:ascii="Arial" w:eastAsia="Calibri" w:hAnsi="Arial" w:cs="Arial"/>
-          <w:color w:val="7F8C8D"/>
-          <w:sz w:val="22"/>
-          <w:szCs w:val="22"/>
-          <w:lang w:val="en-US"/>
-        </w:rPr>
-        <w:t xml:space="preserve">  </w:t>
-      </w:r>
-      <w:r>
-        <w:rPr>
-          <w:rFonts w:ascii="Arial" w:eastAsia="Calibri" w:hAnsi="Arial" w:cs="Arial"/>
-          <w:b/>
-          <w:bCs/>
-          <w:color w:val="1A5276"/>
-          <w:sz w:val="22"/>
-          <w:szCs w:val="22"/>
-          <w:lang w:val="en-US"/>
-        </w:rPr>
-        <w:t>China Railway Tunnel Group Co., Ltd.</w:t>
-      </w:r>
-    </w:p>
-    <w:p>
-      <w:pPr>
-        <w:spacing w:after="60"/>
-        <w:rPr>
-          <w:rFonts w:ascii="Arial" w:hAnsi="Arial" w:cs="Arial"/>
-          <w:lang w:val="en-US"/>
-        </w:rPr>
-      </w:pPr>
-      <w:r>
-        <w:rPr>
-          <w:rFonts w:ascii="Arial" w:eastAsia="Calibri" w:hAnsi="Arial" w:cs="Arial"/>
-          <w:i/>
-          <w:iCs/>
-          <w:color w:val="7F8C8D"/>
-          <w:sz w:val="18"/>
-          <w:szCs w:val="18"/>
-          <w:lang w:val="en-US"/>
-        </w:rPr>
-        <w:t>Panamá City, Panamá   •   Aug 2024 – Jan 2025</w:t>
+        <w:t>Supported field monitoring of tunnelling and industrial mechanical infrastructure in active operations, maintaining equipment availability above 95</w:t>
+      </w:r>
+      <w:r>
+        <w:rPr>
+          <w:rFonts w:ascii="Arial" w:eastAsia="Calibri" w:hAnsi="Arial" w:cs="Arial"/>
+          <w:color w:val="222222"/>
+          <w:lang w:val="en-US"/>
+        </w:rPr>
+        <w:t>%.</w:t>
       </w:r>
     </w:p>
     <w:p>
@@ -1049,7 +1020,7 @@
           <w:color w:val="222222"/>
           <w:lang w:val="en-US"/>
         </w:rPr>
-        <w:t>Supported field monitoring of tunnelling and industrial mechanical equipment in active operations, contributing to operational continuity and equipment availability above 95%</w:t>
+        <w:t>Assisted in technical inspections and performance monitoring of industrial equipment and mechanical systems in field environments</w:t>
       </w:r>
       <w:r>
         <w:rPr>
@@ -1079,7 +1050,7 @@
           <w:color w:val="222222"/>
           <w:lang w:val="en-US"/>
         </w:rPr>
-        <w:t>Supported field monitoring of tunnelling and industrial mechanical equipment in active operations, contributing to operational continuity and equipment availability above 95%</w:t>
+        <w:t>Prepared weekly engineering reports on equipment performance, operational conditions, and infrastructure status to support maintenance and engineering decisions</w:t>
       </w:r>
       <w:r>
         <w:rPr>
@@ -1109,7 +1080,269 @@
           <w:color w:val="222222"/>
           <w:lang w:val="en-US"/>
         </w:rPr>
-        <w:t>Prepared weekly technical reports on equipment performance and field operations, improving operational visibility and coordination with engineering teams.</w:t>
+        <w:t>Supported troubleshooting and operational monitoring of mechanical and industrial systems, improving equipment reliability by 20%.</w:t>
+      </w:r>
+    </w:p>
+    <w:p>
+      <w:pPr>
+        <w:spacing w:before="40" w:after="40"/>
+        <w:ind w:left="240"/>
+        <w:rPr>
+          <w:rFonts w:ascii="Arial" w:hAnsi="Arial" w:cs="Arial"/>
+          <w:lang w:val="en-US"/>
+        </w:rPr>
+      </w:pPr>
+      <w:r>
+        <w:rPr>
+          <w:rFonts w:ascii="Arial" w:eastAsia="Calibri" w:hAnsi="Arial" w:cs="Arial"/>
+          <w:i/>
+          <w:iCs/>
+          <w:color w:val="7F8C8D"/>
+          <w:lang w:val="en-US"/>
+        </w:rPr>
+        <w:t>Key project: Panama Metro Line 3 – Tunnel Section</w:t>
+      </w:r>
+    </w:p>
+    <w:p>
+      <w:pPr>
+        <w:rPr>
+          <w:rFonts w:ascii="Arial" w:eastAsia="Calibri" w:hAnsi="Arial" w:cs="Arial"/>
+          <w:b/>
+          <w:bCs/>
+          <w:sz w:val="22"/>
+          <w:szCs w:val="22"/>
+          <w:lang w:val="en-US"/>
+        </w:rPr>
+      </w:pPr>
+      <w:r>
+        <w:rPr>
+          <w:rFonts w:ascii="Arial" w:eastAsia="Calibri" w:hAnsi="Arial" w:cs="Arial"/>
+          <w:b/>
+          <w:bCs/>
+          <w:sz w:val="22"/>
+          <w:szCs w:val="22"/>
+          <w:lang w:val="en-US"/>
+        </w:rPr>
+        <w:br w:type="page"/>
+      </w:r>
+    </w:p>
+    <w:p>
+      <w:pPr>
+        <w:pBdr>
+          <w:bottom w:val="single" w:sz="6" w:space="2" w:color="1A5276"/>
+        </w:pBdr>
+        <w:spacing w:before="240" w:after="60"/>
+        <w:rPr>
+          <w:rFonts w:ascii="Arial" w:hAnsi="Arial" w:cs="Arial"/>
+          <w:lang w:val="en-US"/>
+        </w:rPr>
+      </w:pPr>
+      <w:r>
+        <w:rPr>
+          <w:rFonts w:ascii="Arial" w:eastAsia="Calibri" w:hAnsi="Arial" w:cs="Arial"/>
+          <w:b/>
+          <w:bCs/>
+          <w:sz w:val="22"/>
+          <w:szCs w:val="22"/>
+          <w:lang w:val="en-US"/>
+        </w:rPr>
+        <w:lastRenderedPageBreak/>
+        <w:t>EDUCATION</w:t>
+      </w:r>
+    </w:p>
+    <w:p>
+      <w:pPr>
+        <w:spacing w:before="120" w:after="20"/>
+        <w:rPr>
+          <w:rFonts w:ascii="Arial" w:hAnsi="Arial" w:cs="Arial"/>
+          <w:lang w:val="en-US"/>
+        </w:rPr>
+      </w:pPr>
+      <w:r>
+        <w:rPr>
+          <w:rFonts w:ascii="Arial" w:eastAsia="Calibri" w:hAnsi="Arial" w:cs="Arial"/>
+          <w:b/>
+          <w:bCs/>
+          <w:color w:val="111111"/>
+          <w:sz w:val="22"/>
+          <w:szCs w:val="22"/>
+          <w:lang w:val="en-US"/>
+        </w:rPr>
+        <w:t>B.Sc. in Mechanical Engineering</w:t>
+      </w:r>
+      <w:r>
+        <w:rPr>
+          <w:rFonts w:ascii="Arial" w:eastAsia="Calibri" w:hAnsi="Arial" w:cs="Arial"/>
+          <w:b/>
+          <w:bCs/>
+          <w:color w:val="1A5276"/>
+          <w:lang w:val="en-US"/>
+        </w:rPr>
+        <w:t xml:space="preserve">   •   </w:t>
+      </w:r>
+      <w:r>
+        <w:rPr>
+          <w:rFonts w:ascii="Arial" w:eastAsia="Calibri" w:hAnsi="Arial" w:cs="Arial"/>
+          <w:b/>
+          <w:bCs/>
+          <w:color w:val="002060"/>
+          <w:lang w:val="en-US"/>
+        </w:rPr>
+        <w:t>Technological University of Panama</w:t>
+      </w:r>
+    </w:p>
+    <w:p>
+      <w:pPr>
+        <w:spacing w:after="60"/>
+        <w:rPr>
+          <w:rFonts w:ascii="Arial" w:hAnsi="Arial" w:cs="Arial"/>
+          <w:lang w:val="en-US"/>
+        </w:rPr>
+      </w:pPr>
+      <w:r>
+        <w:rPr>
+          <w:rFonts w:ascii="Arial" w:eastAsia="Calibri" w:hAnsi="Arial" w:cs="Arial"/>
+          <w:i/>
+          <w:iCs/>
+          <w:color w:val="7F8C8D"/>
+          <w:sz w:val="18"/>
+          <w:szCs w:val="18"/>
+          <w:lang w:val="en-US"/>
+        </w:rPr>
+        <w:t>Panamá City, Panamá   •   Jan 2018 – Aug 202</w:t>
+      </w:r>
+      <w:r>
+        <w:rPr>
+          <w:rFonts w:ascii="Arial" w:eastAsia="Calibri" w:hAnsi="Arial" w:cs="Arial"/>
+          <w:i/>
+          <w:iCs/>
+          <w:color w:val="7F8C8D"/>
+          <w:sz w:val="18"/>
+          <w:szCs w:val="18"/>
+          <w:lang w:val="en-US"/>
+        </w:rPr>
+        <w:t>4</w:t>
+      </w:r>
+      <w:r>
+        <w:rPr>
+          <w:rFonts w:ascii="Arial" w:eastAsia="Calibri" w:hAnsi="Arial" w:cs="Arial"/>
+          <w:i/>
+          <w:iCs/>
+          <w:color w:val="7F8C8D"/>
+          <w:sz w:val="18"/>
+          <w:szCs w:val="18"/>
+          <w:lang w:val="en-US"/>
+        </w:rPr>
+        <w:t xml:space="preserve">  </w:t>
+      </w:r>
+    </w:p>
+    <w:p>
+      <w:pPr>
+        <w:pBdr>
+          <w:bottom w:val="single" w:sz="6" w:space="2" w:color="1A5276"/>
+        </w:pBdr>
+        <w:spacing w:after="60"/>
+        <w:rPr>
+          <w:rFonts w:ascii="Arial" w:eastAsia="Calibri" w:hAnsi="Arial" w:cs="Arial"/>
+          <w:b/>
+          <w:bCs/>
+          <w:lang w:val="en-US"/>
+        </w:rPr>
+      </w:pPr>
+      <w:r>
+        <w:rPr>
+          <w:rFonts w:ascii="Arial" w:eastAsia="Calibri" w:hAnsi="Arial" w:cs="Arial"/>
+          <w:b/>
+          <w:bCs/>
+          <w:lang w:val="en-US"/>
+        </w:rPr>
+        <w:t xml:space="preserve">Relevant coursework: Mechanical Systems, </w:t>
+      </w:r>
+      <w:r>
+        <w:rPr>
+          <w:rFonts w:ascii="Arial" w:eastAsia="Calibri" w:hAnsi="Arial" w:cs="Arial"/>
+          <w:b/>
+          <w:bCs/>
+          <w:lang w:val="en-US"/>
+        </w:rPr>
+        <w:t>Thermodynamics</w:t>
+      </w:r>
+      <w:r>
+        <w:rPr>
+          <w:rFonts w:ascii="Arial" w:eastAsia="Calibri" w:hAnsi="Arial" w:cs="Arial"/>
+          <w:b/>
+          <w:bCs/>
+          <w:lang w:val="en-US"/>
+        </w:rPr>
+        <w:t xml:space="preserve">, </w:t>
+      </w:r>
+      <w:r>
+        <w:rPr>
+          <w:rFonts w:ascii="Arial" w:eastAsia="Calibri" w:hAnsi="Arial" w:cs="Arial"/>
+          <w:b/>
+          <w:bCs/>
+          <w:lang w:val="en-US"/>
+        </w:rPr>
+        <w:t>Materials Engineering</w:t>
+      </w:r>
+      <w:r>
+        <w:rPr>
+          <w:rFonts w:ascii="Arial" w:eastAsia="Calibri" w:hAnsi="Arial" w:cs="Arial"/>
+          <w:b/>
+          <w:bCs/>
+          <w:lang w:val="en-US"/>
+        </w:rPr>
+        <w:t xml:space="preserve">, </w:t>
+      </w:r>
+      <w:r>
+        <w:rPr>
+          <w:rFonts w:ascii="Arial" w:eastAsia="Calibri" w:hAnsi="Arial" w:cs="Arial"/>
+          <w:b/>
+          <w:bCs/>
+          <w:lang w:val="en-US"/>
+        </w:rPr>
+        <w:t>Heat Transfer</w:t>
+      </w:r>
+      <w:r>
+        <w:rPr>
+          <w:rFonts w:ascii="Arial" w:eastAsia="Calibri" w:hAnsi="Arial" w:cs="Arial"/>
+          <w:b/>
+          <w:bCs/>
+          <w:lang w:val="en-US"/>
+        </w:rPr>
+        <w:t xml:space="preserve">, </w:t>
+      </w:r>
+      <w:r>
+        <w:rPr>
+          <w:rFonts w:ascii="Arial" w:eastAsia="Calibri" w:hAnsi="Arial" w:cs="Arial"/>
+          <w:b/>
+          <w:bCs/>
+          <w:lang w:val="en-US"/>
+        </w:rPr>
+        <w:t>Industrial Systems</w:t>
+      </w:r>
+    </w:p>
+    <w:p>
+      <w:pPr>
+        <w:pBdr>
+          <w:bottom w:val="single" w:sz="6" w:space="2" w:color="1A5276"/>
+        </w:pBdr>
+        <w:spacing w:before="240" w:after="60"/>
+        <w:rPr>
+          <w:rFonts w:ascii="Arial" w:hAnsi="Arial" w:cs="Arial"/>
+          <w:lang w:val="en-US"/>
+        </w:rPr>
+      </w:pPr>
+      <w:r>
+        <w:rPr>
+          <w:rFonts w:ascii="Arial" w:eastAsia="Calibri" w:hAnsi="Arial" w:cs="Arial"/>
+          <w:b/>
+          <w:bCs/>
+          <w:sz w:val="22"/>
+          <w:szCs w:val="22"/>
+          <w:lang w:val="en-US"/>
+        </w:rPr>
+        <w:t>CERTIFICATIONS &amp; TRAINING</w:t>
       </w:r>
     </w:p>
     <w:p>
@@ -1131,236 +1364,63 @@
           <w:color w:val="222222"/>
           <w:lang w:val="en-US"/>
         </w:rPr>
-        <w:t xml:space="preserve">Supported </w:t>
-      </w:r>
-      <w:proofErr w:type="spellStart"/>
-      <w:r>
-        <w:rPr>
-          <w:rFonts w:ascii="Arial" w:eastAsia="Calibri" w:hAnsi="Arial" w:cs="Arial"/>
-          <w:color w:val="222222"/>
-          <w:lang w:val="en-US"/>
-        </w:rPr>
-        <w:t>Supported</w:t>
-      </w:r>
-      <w:proofErr w:type="spellEnd"/>
-      <w:r>
-        <w:rPr>
-          <w:rFonts w:ascii="Arial" w:eastAsia="Calibri" w:hAnsi="Arial" w:cs="Arial"/>
-          <w:color w:val="222222"/>
-          <w:lang w:val="en-US"/>
-        </w:rPr>
-        <w:t xml:space="preserve"> mechanical system monitoring and troubleshooting in field environments, enhancing equipment performance and operational reliability by 20%.</w:t>
-      </w:r>
-    </w:p>
-    <w:p>
-      <w:pPr>
-        <w:spacing w:before="40" w:after="40"/>
-        <w:ind w:left="240"/>
-        <w:rPr>
-          <w:rFonts w:ascii="Arial" w:hAnsi="Arial" w:cs="Arial"/>
-          <w:lang w:val="en-US"/>
-        </w:rPr>
-      </w:pPr>
-      <w:r>
-        <w:rPr>
-          <w:rFonts w:ascii="Arial" w:eastAsia="Calibri" w:hAnsi="Arial" w:cs="Arial"/>
-          <w:i/>
-          <w:iCs/>
-          <w:color w:val="7F8C8D"/>
-          <w:lang w:val="en-US"/>
-        </w:rPr>
-        <w:t>Key project: Panama Metro Line 3 – Tunnel Section</w:t>
-      </w:r>
-    </w:p>
-    <w:p>
-      <w:pPr>
-        <w:pBdr>
-          <w:bottom w:val="single" w:sz="6" w:space="2" w:color="1A5276"/>
-        </w:pBdr>
-        <w:spacing w:before="240" w:after="60"/>
-        <w:rPr>
-          <w:rFonts w:ascii="Arial" w:hAnsi="Arial" w:cs="Arial"/>
-          <w:lang w:val="en-US"/>
-        </w:rPr>
-      </w:pPr>
-      <w:r>
-        <w:rPr>
-          <w:rFonts w:ascii="Arial" w:eastAsia="Calibri" w:hAnsi="Arial" w:cs="Arial"/>
-          <w:b/>
-          <w:bCs/>
-          <w:sz w:val="22"/>
-          <w:szCs w:val="22"/>
-          <w:lang w:val="en-US"/>
-        </w:rPr>
-        <w:t>EDUCATION</w:t>
-      </w:r>
-    </w:p>
-    <w:p>
-      <w:pPr>
-        <w:spacing w:before="120" w:after="20"/>
-        <w:rPr>
-          <w:rFonts w:ascii="Arial" w:hAnsi="Arial" w:cs="Arial"/>
-          <w:lang w:val="en-US"/>
-        </w:rPr>
-      </w:pPr>
-      <w:r>
-        <w:rPr>
-          <w:rFonts w:ascii="Arial" w:eastAsia="Calibri" w:hAnsi="Arial" w:cs="Arial"/>
-          <w:b/>
-          <w:bCs/>
-          <w:color w:val="111111"/>
-          <w:sz w:val="22"/>
-          <w:szCs w:val="22"/>
-          <w:lang w:val="en-US"/>
-        </w:rPr>
-        <w:t>B.Sc. in Mechanical Engineering</w:t>
-      </w:r>
-      <w:r>
-        <w:rPr>
-          <w:rFonts w:ascii="Arial" w:eastAsia="Calibri" w:hAnsi="Arial" w:cs="Arial"/>
-          <w:b/>
-          <w:bCs/>
-          <w:color w:val="1A5276"/>
-          <w:lang w:val="en-US"/>
-        </w:rPr>
-        <w:t xml:space="preserve">   •   Technological University of Panama</w:t>
-      </w:r>
-    </w:p>
-    <w:p>
-      <w:pPr>
-        <w:spacing w:after="60"/>
-        <w:rPr>
-          <w:rFonts w:ascii="Arial" w:hAnsi="Arial" w:cs="Arial"/>
-          <w:lang w:val="en-US"/>
-        </w:rPr>
-      </w:pPr>
-      <w:r>
-        <w:rPr>
-          <w:rFonts w:ascii="Arial" w:eastAsia="Calibri" w:hAnsi="Arial" w:cs="Arial"/>
-          <w:i/>
-          <w:iCs/>
-          <w:color w:val="7F8C8D"/>
-          <w:sz w:val="18"/>
-          <w:szCs w:val="18"/>
-          <w:lang w:val="en-US"/>
-        </w:rPr>
-        <w:t>Panamá City, Panamá   •   Jan 2018 – Aug 202</w:t>
-      </w:r>
-      <w:r>
-        <w:rPr>
-          <w:rFonts w:ascii="Arial" w:eastAsia="Calibri" w:hAnsi="Arial" w:cs="Arial"/>
-          <w:i/>
-          <w:iCs/>
-          <w:color w:val="7F8C8D"/>
-          <w:sz w:val="18"/>
-          <w:szCs w:val="18"/>
-          <w:lang w:val="en-US"/>
-        </w:rPr>
-        <w:t>4</w:t>
-      </w:r>
-      <w:r>
-        <w:rPr>
-          <w:rFonts w:ascii="Arial" w:eastAsia="Calibri" w:hAnsi="Arial" w:cs="Arial"/>
-          <w:i/>
-          <w:iCs/>
-          <w:color w:val="7F8C8D"/>
-          <w:sz w:val="18"/>
-          <w:szCs w:val="18"/>
-          <w:lang w:val="en-US"/>
-        </w:rPr>
-        <w:t xml:space="preserve">  </w:t>
-      </w:r>
-    </w:p>
-    <w:p>
-      <w:pPr>
-        <w:pBdr>
-          <w:bottom w:val="single" w:sz="6" w:space="2" w:color="1A5276"/>
-        </w:pBdr>
-        <w:spacing w:after="60"/>
-        <w:rPr>
-          <w:rFonts w:ascii="Arial" w:eastAsia="Calibri" w:hAnsi="Arial" w:cs="Arial"/>
-          <w:b/>
-          <w:bCs/>
-          <w:lang w:val="en-US"/>
-        </w:rPr>
-      </w:pPr>
-      <w:r>
-        <w:rPr>
-          <w:rFonts w:ascii="Arial" w:eastAsia="Calibri" w:hAnsi="Arial" w:cs="Arial"/>
-          <w:b/>
-          <w:bCs/>
-          <w:lang w:val="en-US"/>
-        </w:rPr>
-        <w:t xml:space="preserve">Relevant coursework: Mechanical Systems, </w:t>
-      </w:r>
-      <w:r>
-        <w:rPr>
-          <w:rFonts w:ascii="Arial" w:eastAsia="Calibri" w:hAnsi="Arial" w:cs="Arial"/>
-          <w:b/>
-          <w:bCs/>
-          <w:lang w:val="en-US"/>
-        </w:rPr>
-        <w:t>Thermodynamics</w:t>
-      </w:r>
-      <w:r>
-        <w:rPr>
-          <w:rFonts w:ascii="Arial" w:eastAsia="Calibri" w:hAnsi="Arial" w:cs="Arial"/>
-          <w:b/>
-          <w:bCs/>
-          <w:lang w:val="en-US"/>
-        </w:rPr>
-        <w:t xml:space="preserve">, Fluid Mechanics, </w:t>
-      </w:r>
-      <w:r>
-        <w:rPr>
-          <w:rFonts w:ascii="Arial" w:eastAsia="Calibri" w:hAnsi="Arial" w:cs="Arial"/>
-          <w:b/>
-          <w:bCs/>
-          <w:lang w:val="en-US"/>
-        </w:rPr>
-        <w:t>Heat Transfer</w:t>
-      </w:r>
-      <w:r>
-        <w:rPr>
-          <w:rFonts w:ascii="Arial" w:eastAsia="Calibri" w:hAnsi="Arial" w:cs="Arial"/>
-          <w:b/>
-          <w:bCs/>
-          <w:lang w:val="en-US"/>
-        </w:rPr>
-        <w:t xml:space="preserve">, </w:t>
-      </w:r>
-      <w:r>
-        <w:rPr>
-          <w:rFonts w:ascii="Arial" w:eastAsia="Calibri" w:hAnsi="Arial" w:cs="Arial"/>
-          <w:b/>
-          <w:bCs/>
-          <w:lang w:val="en-US"/>
-        </w:rPr>
-        <w:t>Industrial Systems</w:t>
-      </w:r>
-    </w:p>
-    <w:p>
-      <w:pPr>
-        <w:pBdr>
-          <w:bottom w:val="single" w:sz="6" w:space="2" w:color="1A5276"/>
-        </w:pBdr>
-        <w:spacing w:before="240" w:after="60"/>
-        <w:rPr>
-          <w:rFonts w:ascii="Arial" w:hAnsi="Arial" w:cs="Arial"/>
-          <w:lang w:val="en-US"/>
-        </w:rPr>
-      </w:pPr>
-      <w:r>
-        <w:rPr>
-          <w:rFonts w:ascii="Arial" w:eastAsia="Calibri" w:hAnsi="Arial" w:cs="Arial"/>
-          <w:b/>
-          <w:bCs/>
-          <w:sz w:val="22"/>
-          <w:szCs w:val="22"/>
-          <w:lang w:val="en-US"/>
-        </w:rPr>
-        <w:lastRenderedPageBreak/>
-        <w:t>CERTIFICATIONS &amp; TRAINING</w:t>
+        <w:t>Engineering training in hydraulic systems and industrial equipment monitoring</w:t>
+      </w:r>
+      <w:r>
+        <w:rPr>
+          <w:rFonts w:ascii="Arial" w:eastAsia="Calibri" w:hAnsi="Arial" w:cs="Arial"/>
+          <w:color w:val="222222"/>
+          <w:lang w:val="en-US"/>
+        </w:rPr>
+        <w:t xml:space="preserve"> </w:t>
+      </w:r>
+      <w:r>
+        <w:rPr>
+          <w:rFonts w:ascii="Arial" w:eastAsia="Calibri" w:hAnsi="Arial" w:cs="Arial"/>
+          <w:color w:val="222222"/>
+          <w:lang w:val="en-US"/>
+        </w:rPr>
+        <w:t>– H</w:t>
+      </w:r>
+      <w:r>
+        <w:rPr>
+          <w:rFonts w:ascii="Arial" w:eastAsia="Calibri" w:hAnsi="Arial" w:cs="Arial"/>
+          <w:color w:val="222222"/>
+          <w:lang w:val="en-US"/>
+        </w:rPr>
+        <w:t>K</w:t>
+      </w:r>
+      <w:r>
+        <w:rPr>
+          <w:rFonts w:ascii="Arial" w:eastAsia="Calibri" w:hAnsi="Arial" w:cs="Arial"/>
+          <w:color w:val="222222"/>
+          <w:lang w:val="en-US"/>
+        </w:rPr>
+        <w:t xml:space="preserve"> AG (</w:t>
+      </w:r>
+      <w:r>
+        <w:rPr>
+          <w:rFonts w:ascii="Arial" w:eastAsia="Calibri" w:hAnsi="Arial" w:cs="Arial"/>
+          <w:color w:val="222222"/>
+          <w:lang w:val="en-US"/>
+        </w:rPr>
+        <w:t xml:space="preserve">Germany, </w:t>
+      </w:r>
+      <w:r>
+        <w:rPr>
+          <w:rFonts w:ascii="Arial" w:eastAsia="Calibri" w:hAnsi="Arial" w:cs="Arial"/>
+          <w:color w:val="222222"/>
+          <w:lang w:val="en-US"/>
+        </w:rPr>
+        <w:t>Jun 2025)</w:t>
+      </w:r>
+      <w:r>
+        <w:rPr>
+          <w:rFonts w:ascii="Arial" w:eastAsia="Calibri" w:hAnsi="Arial" w:cs="Arial"/>
+          <w:color w:val="222222"/>
+          <w:lang w:val="en-US"/>
+        </w:rPr>
+        <w:t xml:space="preserve"> </w:t>
       </w:r>
     </w:p>
     <w:p>
@@ -1382,84 +1442,6 @@
           <w:color w:val="222222"/>
           <w:lang w:val="en-US"/>
         </w:rPr>
-        <w:t>Engineering training in hydraulic systems and industrial equipment monitoring</w:t>
-      </w:r>
-      <w:r>
-        <w:rPr>
-          <w:rFonts w:ascii="Arial" w:eastAsia="Calibri" w:hAnsi="Arial" w:cs="Arial"/>
-          <w:color w:val="222222"/>
-          <w:lang w:val="en-US"/>
-        </w:rPr>
-        <w:t xml:space="preserve"> </w:t>
-      </w:r>
-      <w:r>
-        <w:rPr>
-          <w:rFonts w:ascii="Arial" w:eastAsia="Calibri" w:hAnsi="Arial" w:cs="Arial"/>
-          <w:color w:val="222222"/>
-          <w:lang w:val="en-US"/>
-        </w:rPr>
-        <w:t>– H</w:t>
-      </w:r>
-      <w:r>
-        <w:rPr>
-          <w:rFonts w:ascii="Arial" w:eastAsia="Calibri" w:hAnsi="Arial" w:cs="Arial"/>
-          <w:color w:val="222222"/>
-          <w:lang w:val="en-US"/>
-        </w:rPr>
-        <w:t>K</w:t>
-      </w:r>
-      <w:r>
-        <w:rPr>
-          <w:rFonts w:ascii="Arial" w:eastAsia="Calibri" w:hAnsi="Arial" w:cs="Arial"/>
-          <w:color w:val="222222"/>
-          <w:lang w:val="en-US"/>
-        </w:rPr>
-        <w:t xml:space="preserve"> AG (</w:t>
-      </w:r>
-      <w:r>
-        <w:rPr>
-          <w:rFonts w:ascii="Arial" w:eastAsia="Calibri" w:hAnsi="Arial" w:cs="Arial"/>
-          <w:color w:val="222222"/>
-          <w:lang w:val="en-US"/>
-        </w:rPr>
-        <w:t xml:space="preserve">Germany, </w:t>
-      </w:r>
-      <w:r>
-        <w:rPr>
-          <w:rFonts w:ascii="Arial" w:eastAsia="Calibri" w:hAnsi="Arial" w:cs="Arial"/>
-          <w:color w:val="222222"/>
-          <w:lang w:val="en-US"/>
-        </w:rPr>
-        <w:t>Jun 2025)</w:t>
-      </w:r>
-      <w:r>
-        <w:rPr>
-          <w:rFonts w:ascii="Arial" w:eastAsia="Calibri" w:hAnsi="Arial" w:cs="Arial"/>
-          <w:color w:val="222222"/>
-          <w:lang w:val="en-US"/>
-        </w:rPr>
-        <w:t xml:space="preserve"> </w:t>
-      </w:r>
-    </w:p>
-    <w:p>
-      <w:pPr>
-        <w:pStyle w:val="ListParagraph"/>
-        <w:numPr>
-          <w:ilvl w:val="0"/>
-          <w:numId w:val="2"/>
-        </w:numPr>
-        <w:spacing w:before="40" w:after="40"/>
-        <w:rPr>
-          <w:rFonts w:ascii="Arial" w:hAnsi="Arial" w:cs="Arial"/>
-          <w:lang w:val="en-US"/>
-        </w:rPr>
-      </w:pPr>
-      <w:r>
-        <w:rPr>
-          <w:rFonts w:ascii="Arial" w:eastAsia="Calibri" w:hAnsi="Arial" w:cs="Arial"/>
-          <w:color w:val="222222"/>
-          <w:lang w:val="en-US"/>
-        </w:rPr>
         <w:t>Design of Thermofluidic Systems – Technological University of Panama (Aug 2023)</w:t>
       </w:r>
     </w:p>
@@ -1470,12 +1452,6 @@
         </w:pBdr>
         <w:spacing w:before="240" w:after="60"/>
         <w:rPr>
-          <w:rFonts w:ascii="Arial" w:hAnsi="Arial" w:cs="Arial"/>
-          <w:lang w:val="en-US"/>
-        </w:rPr>
-      </w:pPr>
-      <w:r>
-        <w:rPr>
           <w:rFonts w:ascii="Arial" w:eastAsia="Calibri" w:hAnsi="Arial" w:cs="Arial"/>
           <w:b/>
           <w:bCs/>
@@ -1483,54 +1459,18 @@
           <w:szCs w:val="22"/>
           <w:lang w:val="en-US"/>
         </w:rPr>
-        <w:t>CERTIFICATIONS &amp; TRAINING</w:t>
-      </w:r>
-    </w:p>
-    <w:p>
-      <w:pPr>
-        <w:spacing w:before="40" w:after="40"/>
-        <w:rPr>
-          <w:rFonts w:ascii="Arial" w:hAnsi="Arial" w:cs="Arial"/>
-          <w:b/>
-          <w:bCs/>
-        </w:rPr>
-      </w:pPr>
-      <w:r>
-        <w:rPr>
-          <w:rFonts w:ascii="Arial" w:hAnsi="Arial" w:cs="Arial"/>
-          <w:b/>
-          <w:bCs/>
-        </w:rPr>
-        <w:t xml:space="preserve">Field &amp; </w:t>
-      </w:r>
-      <w:proofErr w:type="spellStart"/>
-      <w:r>
-        <w:rPr>
-          <w:rFonts w:ascii="Arial" w:hAnsi="Arial" w:cs="Arial"/>
-          <w:b/>
-          <w:bCs/>
-        </w:rPr>
-        <w:t>Operational</w:t>
-      </w:r>
-      <w:proofErr w:type="spellEnd"/>
-      <w:r>
-        <w:rPr>
-          <w:rFonts w:ascii="Arial" w:hAnsi="Arial" w:cs="Arial"/>
-          <w:b/>
-          <w:bCs/>
-        </w:rPr>
-        <w:t xml:space="preserve"> </w:t>
-      </w:r>
-      <w:proofErr w:type="spellStart"/>
-      <w:r>
-        <w:rPr>
-          <w:rFonts w:ascii="Arial" w:hAnsi="Arial" w:cs="Arial"/>
-          <w:b/>
-          <w:bCs/>
-        </w:rPr>
-        <w:t>Readiness</w:t>
-      </w:r>
-      <w:proofErr w:type="spellEnd"/>
+      </w:pPr>
+      <w:r>
+        <w:rPr>
+          <w:rFonts w:ascii="Arial" w:eastAsia="Calibri" w:hAnsi="Arial" w:cs="Arial"/>
+          <w:b/>
+          <w:bCs/>
+          <w:sz w:val="22"/>
+          <w:szCs w:val="22"/>
+          <w:lang w:val="en-US"/>
+        </w:rPr>
+        <w:t>FIELD &amp; OPERATIONAL READINESS</w:t>
+      </w:r>
     </w:p>
     <w:p>
       <w:pPr>
@@ -1547,10 +1487,17 @@
       <w:r>
         <w:rPr>
           <w:rFonts w:ascii="Arial" w:hAnsi="Arial" w:cs="Arial"/>
-          <w:lang w:val="en-US"/>
-        </w:rPr>
-        <w:t xml:space="preserve">Willing to work in industrial field environments </w:t>
-      </w:r>
+        </w:rPr>
+        <w:t xml:space="preserve">Valid Driver </w:t>
+      </w:r>
+      <w:proofErr w:type="spellStart"/>
+      <w:r>
+        <w:rPr>
+          <w:rFonts w:ascii="Arial" w:hAnsi="Arial" w:cs="Arial"/>
+        </w:rPr>
+        <w:t>License</w:t>
+      </w:r>
+      <w:proofErr w:type="spellEnd"/>
     </w:p>
     <w:p>
       <w:pPr>
@@ -1567,10 +1514,17 @@
       <w:r>
         <w:rPr>
           <w:rFonts w:ascii="Arial" w:hAnsi="Arial" w:cs="Arial"/>
-          <w:lang w:val="en-US"/>
-        </w:rPr>
-        <w:t xml:space="preserve">Comfortable working in dynamic operational conditions </w:t>
-      </w:r>
+        </w:rPr>
+        <w:t xml:space="preserve">Strong Safety </w:t>
+      </w:r>
+      <w:proofErr w:type="spellStart"/>
+      <w:r>
+        <w:rPr>
+          <w:rFonts w:ascii="Arial" w:hAnsi="Arial" w:cs="Arial"/>
+        </w:rPr>
+        <w:t>Awareness</w:t>
+      </w:r>
+      <w:proofErr w:type="spellEnd"/>
     </w:p>
     <w:p>
       <w:pPr>
@@ -1589,7 +1543,7 @@
           <w:rFonts w:ascii="Arial" w:hAnsi="Arial" w:cs="Arial"/>
           <w:lang w:val="en-US"/>
         </w:rPr>
-        <w:t xml:space="preserve">Ability to travel and support field operations </w:t>
+        <w:t>Ability to Work in Industrial and Field Environments</w:t>
       </w:r>
     </w:p>
     <w:p>
@@ -1601,68 +1555,16 @@
         <w:spacing w:before="40" w:after="40"/>
         <w:rPr>
           <w:rFonts w:ascii="Arial" w:hAnsi="Arial" w:cs="Arial"/>
-        </w:rPr>
-      </w:pPr>
-      <w:r>
-        <w:rPr>
-          <w:rFonts w:ascii="Arial" w:hAnsi="Arial" w:cs="Arial"/>
-        </w:rPr>
-        <w:t xml:space="preserve">Strong safety </w:t>
-      </w:r>
-      <w:proofErr w:type="spellStart"/>
-      <w:r>
-        <w:rPr>
-          <w:rFonts w:ascii="Arial" w:hAnsi="Arial" w:cs="Arial"/>
-        </w:rPr>
-        <w:t>awareness</w:t>
-      </w:r>
-      <w:proofErr w:type="spellEnd"/>
-      <w:r>
-        <w:rPr>
-          <w:rFonts w:ascii="Arial" w:hAnsi="Arial" w:cs="Arial"/>
-        </w:rPr>
-        <w:t xml:space="preserve"> </w:t>
-      </w:r>
-    </w:p>
-    <w:p>
-      <w:pPr>
-        <w:numPr>
-          <w:ilvl w:val="0"/>
-          <w:numId w:val="4"/>
-        </w:numPr>
-        <w:spacing w:before="40" w:after="40"/>
-        <w:rPr>
-          <w:rFonts w:ascii="Arial" w:hAnsi="Arial" w:cs="Arial"/>
-        </w:rPr>
-      </w:pPr>
-      <w:r>
-        <w:rPr>
-          <w:rFonts w:ascii="Arial" w:hAnsi="Arial" w:cs="Arial"/>
-        </w:rPr>
-        <w:t xml:space="preserve">Valid </w:t>
-      </w:r>
-      <w:proofErr w:type="gramStart"/>
-      <w:r>
-        <w:rPr>
-          <w:rFonts w:ascii="Arial" w:hAnsi="Arial" w:cs="Arial"/>
-        </w:rPr>
-        <w:t>driver</w:t>
-      </w:r>
-      <w:proofErr w:type="gramEnd"/>
-      <w:r>
-        <w:rPr>
-          <w:rFonts w:ascii="Arial" w:hAnsi="Arial" w:cs="Arial"/>
-        </w:rPr>
-        <w:t xml:space="preserve"> </w:t>
-      </w:r>
-      <w:proofErr w:type="spellStart"/>
-      <w:r>
-        <w:rPr>
-          <w:rFonts w:ascii="Arial" w:hAnsi="Arial" w:cs="Arial"/>
-        </w:rPr>
-        <w:t>license</w:t>
-      </w:r>
-      <w:proofErr w:type="spellEnd"/>
+          <w:lang w:val="en-US"/>
+        </w:rPr>
+      </w:pPr>
+      <w:r>
+        <w:rPr>
+          <w:rFonts w:ascii="Arial" w:hAnsi="Arial" w:cs="Arial"/>
+          <w:lang w:val="en-US"/>
+        </w:rPr>
+        <w:t>Available for Site Inspections and Infrastructure Operations</w:t>
+      </w:r>
     </w:p>
     <w:p>
       <w:pPr>

</xml_diff>

<commit_message>
Terminamos la sección de Lab Engineering. Se debe crear contenido en medium.
</commit_message>
<xml_diff>
--- a/assets/CVs/ENGLISH/PROJECT MANAGER/20260214_Yerman-Merel_CV-Format_ENG_v2.0_rev.docx
+++ b/assets/CVs/ENGLISH/PROJECT MANAGER/20260214_Yerman-Merel_CV-Format_ENG_v2.0_rev.docx
@@ -45,7 +45,7 @@
           <w:szCs w:val="22"/>
           <w:lang w:val="en-US"/>
         </w:rPr>
-        <w:t>Industrial Infrastructure &amp; Maintenance Engineering | Field Operations &amp; Asset Reliability</w:t>
+        <w:t>Mechanical Engineer | Mechanical Design Engineer | Project Engineer</w:t>
       </w:r>
     </w:p>
     <w:p>
@@ -56,7 +56,6 @@
           <w:color w:val="555555"/>
           <w:sz w:val="18"/>
           <w:szCs w:val="18"/>
-          <w:lang w:val="en-US"/>
         </w:rPr>
       </w:pPr>
       <w:r>
@@ -65,9 +64,8 @@
           <w:color w:val="555555"/>
           <w:sz w:val="18"/>
           <w:szCs w:val="18"/>
-          <w:lang w:val="en-US"/>
-        </w:rPr>
-        <w:t xml:space="preserve">Panamanian Nationality </w:t>
+        </w:rPr>
+        <w:t>Panama City, Panama</w:t>
       </w:r>
       <w:r>
         <w:rPr>
@@ -75,9 +73,53 @@
           <w:color w:val="555555"/>
           <w:sz w:val="18"/>
           <w:szCs w:val="18"/>
-          <w:lang w:val="en-US"/>
-        </w:rPr>
-        <w:t xml:space="preserve">• (+507) 6295-9441 • ymerel_02@outlook.com • </w:t>
+        </w:rPr>
+        <w:t xml:space="preserve"> </w:t>
+      </w:r>
+      <w:r>
+        <w:rPr>
+          <w:rFonts w:ascii="Arial" w:eastAsia="Calibri" w:hAnsi="Arial" w:cs="Arial"/>
+          <w:color w:val="555555"/>
+          <w:sz w:val="18"/>
+          <w:szCs w:val="18"/>
+        </w:rPr>
+        <w:t xml:space="preserve">• (+507) 6295-9441 • </w:t>
+      </w:r>
+      <w:r>
+        <w:rPr>
+          <w:rFonts w:ascii="Arial" w:eastAsia="Calibri" w:hAnsi="Arial" w:cs="Arial"/>
+          <w:color w:val="555555"/>
+          <w:sz w:val="18"/>
+          <w:szCs w:val="18"/>
+        </w:rPr>
+        <w:t>yermanmerel</w:t>
+      </w:r>
+      <w:r>
+        <w:rPr>
+          <w:rFonts w:ascii="Arial" w:eastAsia="Calibri" w:hAnsi="Arial" w:cs="Arial"/>
+          <w:color w:val="555555"/>
+          <w:sz w:val="18"/>
+          <w:szCs w:val="18"/>
+        </w:rPr>
+        <w:t>@</w:t>
+      </w:r>
+      <w:r>
+        <w:rPr>
+          <w:rFonts w:ascii="Arial" w:eastAsia="Calibri" w:hAnsi="Arial" w:cs="Arial"/>
+          <w:color w:val="555555"/>
+          <w:sz w:val="18"/>
+          <w:szCs w:val="18"/>
+        </w:rPr>
+        <w:t>gmail</w:t>
+      </w:r>
+      <w:r>
+        <w:rPr>
+          <w:rFonts w:ascii="Arial" w:eastAsia="Calibri" w:hAnsi="Arial" w:cs="Arial"/>
+          <w:color w:val="555555"/>
+          <w:sz w:val="18"/>
+          <w:szCs w:val="18"/>
+        </w:rPr>
+        <w:t xml:space="preserve">.com • </w:t>
       </w:r>
       <w:hyperlink r:id="rId6" w:history="1">
         <w:r>
@@ -87,7 +129,6 @@
             <w:sz w:val="18"/>
             <w:szCs w:val="18"/>
             <w:u w:val="single"/>
-            <w:lang w:val="en-US"/>
           </w:rPr>
           <w:t>LinkedIn</w:t>
         </w:r>
@@ -98,14 +139,12 @@
           <w:color w:val="555555"/>
           <w:sz w:val="18"/>
           <w:szCs w:val="18"/>
-          <w:lang w:val="en-US"/>
         </w:rPr>
         <w:t xml:space="preserve"> </w:t>
       </w:r>
       <w:r>
         <w:rPr>
           <w:rFonts w:ascii="Arial" w:hAnsi="Arial" w:cs="Arial"/>
-          <w:lang w:val="en-US"/>
         </w:rPr>
         <w:t xml:space="preserve">• </w:t>
       </w:r>
@@ -116,7 +155,6 @@
             <w:rFonts w:ascii="Arial" w:eastAsia="Calibri" w:hAnsi="Arial" w:cs="Arial"/>
             <w:sz w:val="18"/>
             <w:szCs w:val="18"/>
-            <w:lang w:val="en-US"/>
           </w:rPr>
           <w:t>Portfolio</w:t>
         </w:r>
@@ -129,56 +167,62 @@
         </w:pBdr>
         <w:spacing w:before="240" w:after="60"/>
         <w:rPr>
-          <w:rFonts w:ascii="Arial" w:hAnsi="Arial" w:cs="Arial"/>
-          <w:lang w:val="en-US"/>
-        </w:rPr>
-      </w:pPr>
-      <w:r>
-        <w:rPr>
-          <w:rFonts w:ascii="Arial" w:eastAsia="Calibri" w:hAnsi="Arial" w:cs="Arial"/>
-          <w:b/>
-          <w:bCs/>
+          <w:rFonts w:ascii="Arial" w:eastAsia="Calibri" w:hAnsi="Arial" w:cs="Arial"/>
+          <w:b/>
+          <w:bCs/>
+          <w:color w:val="222222"/>
           <w:sz w:val="22"/>
           <w:szCs w:val="22"/>
           <w:lang w:val="en-US"/>
         </w:rPr>
+      </w:pPr>
+      <w:r>
+        <w:rPr>
+          <w:rFonts w:ascii="Arial" w:eastAsia="Calibri" w:hAnsi="Arial" w:cs="Arial"/>
+          <w:b/>
+          <w:bCs/>
+          <w:color w:val="222222"/>
+          <w:sz w:val="22"/>
+          <w:szCs w:val="22"/>
+          <w:lang w:val="en-US"/>
+        </w:rPr>
         <w:t>PROFESSIONAL SUMMARY</w:t>
       </w:r>
     </w:p>
     <w:p>
       <w:pPr>
-        <w:spacing w:before="80" w:after="80"/>
-        <w:rPr>
-          <w:rFonts w:ascii="Arial" w:eastAsia="Calibri" w:hAnsi="Arial" w:cs="Arial"/>
-          <w:color w:val="222222"/>
-          <w:lang w:val="en-US"/>
-        </w:rPr>
-      </w:pPr>
-      <w:r>
-        <w:rPr>
-          <w:rFonts w:ascii="Arial" w:eastAsia="Calibri" w:hAnsi="Arial" w:cs="Arial"/>
-          <w:color w:val="222222"/>
-          <w:lang w:val="en-US"/>
-        </w:rPr>
-        <w:t xml:space="preserve">Mechanical Engineer with experience in industrial infrastructure, mechanical systems, and field engineering operations in tunnelling and large-scale industrial projects. </w:t>
-      </w:r>
-      <w:proofErr w:type="gramStart"/>
-      <w:r>
-        <w:rPr>
-          <w:rFonts w:ascii="Arial" w:eastAsia="Calibri" w:hAnsi="Arial" w:cs="Arial"/>
-          <w:color w:val="222222"/>
-          <w:lang w:val="en-US"/>
-        </w:rPr>
-        <w:t>Skilled</w:t>
-      </w:r>
-      <w:proofErr w:type="gramEnd"/>
-      <w:r>
-        <w:rPr>
-          <w:rFonts w:ascii="Arial" w:eastAsia="Calibri" w:hAnsi="Arial" w:cs="Arial"/>
-          <w:color w:val="222222"/>
-          <w:lang w:val="en-US"/>
-        </w:rPr>
-        <w:t xml:space="preserve"> in maintenance planning, technical inspections, equipment monitoring, and multidisciplinary engineering coordination across international projects. Strong background in industrial facilities, piping systems, mechanical equipment, and operational reliability, with experience supporting technical documentation, engineering evaluations, and maintenance activities to ensure safe and efficient infrastructure operations. Able to work in dynamic environments and contribute to asset integrity, inspection processes, and industrial project execution.</w:t>
+        <w:spacing w:before="60" w:after="60"/>
+        <w:rPr>
+          <w:rFonts w:ascii="Arial" w:eastAsia="Calibri" w:hAnsi="Arial" w:cs="Arial"/>
+          <w:color w:val="111111"/>
+          <w:lang w:val="en-US"/>
+        </w:rPr>
+      </w:pPr>
+      <w:r>
+        <w:rPr>
+          <w:rFonts w:ascii="Arial" w:eastAsia="Calibri" w:hAnsi="Arial" w:cs="Arial"/>
+          <w:color w:val="111111"/>
+          <w:lang w:val="en-US"/>
+        </w:rPr>
+        <w:t>Mechanical Engineer with experience in large-scale infrastructure projects, specializing in mechanical systems analysis, technical documentation, and engineering support for complex equipment.</w:t>
+      </w:r>
+    </w:p>
+    <w:p>
+      <w:pPr>
+        <w:spacing w:before="60" w:after="60"/>
+        <w:rPr>
+          <w:rFonts w:ascii="Arial" w:eastAsia="Calibri" w:hAnsi="Arial" w:cs="Arial"/>
+          <w:color w:val="111111"/>
+          <w:lang w:val="en-US"/>
+        </w:rPr>
+      </w:pPr>
+      <w:r>
+        <w:rPr>
+          <w:rFonts w:ascii="Arial" w:eastAsia="Calibri" w:hAnsi="Arial" w:cs="Arial"/>
+          <w:color w:val="111111"/>
+          <w:lang w:val="en-US"/>
+        </w:rPr>
+        <w:t>Hands-on experience in mechanical design using Autodesk Inventor (3D modeling, assemblies, and manufacturing drawings) and finite element analysis (FEA) using Ansys for structural validation.</w:t>
       </w:r>
     </w:p>
     <w:p>
@@ -221,7 +265,7 @@
           <w:color w:val="111111"/>
           <w:lang w:val="en-US"/>
         </w:rPr>
-        <w:t>Industrial &amp; Infrastructure Engineering</w:t>
+        <w:t>Mechanical Design &amp; Analysis</w:t>
       </w:r>
       <w:r>
         <w:rPr>
@@ -249,7 +293,7 @@
           <w:color w:val="222222"/>
           <w:lang w:val="en-US"/>
         </w:rPr>
-        <w:t>Industrial Infrastructure Maintenance</w:t>
+        <w:t>3D Modeling &amp; Assemblies (Autodesk Inventor)</w:t>
       </w:r>
       <w:r>
         <w:rPr>
@@ -273,7 +317,7 @@
           <w:color w:val="222222"/>
           <w:lang w:val="en-US"/>
         </w:rPr>
-        <w:t>Mechanical Systems &amp; Equipment</w:t>
+        <w:t>Manufacturing Drawings</w:t>
       </w:r>
       <w:r>
         <w:rPr>
@@ -297,15 +341,15 @@
           <w:color w:val="222222"/>
           <w:lang w:val="en-US"/>
         </w:rPr>
-        <w:t>Pumps, Piping &amp; Industrial Facilitie</w:t>
-      </w:r>
-      <w:r>
-        <w:rPr>
-          <w:rFonts w:ascii="Arial" w:eastAsia="Calibri" w:hAnsi="Arial" w:cs="Arial"/>
-          <w:color w:val="222222"/>
-          <w:lang w:val="en-US"/>
-        </w:rPr>
-        <w:t xml:space="preserve">s </w:t>
+        <w:t>Engineering Calculations</w:t>
+      </w:r>
+      <w:r>
+        <w:rPr>
+          <w:rFonts w:ascii="Arial" w:eastAsia="Calibri" w:hAnsi="Arial" w:cs="Arial"/>
+          <w:color w:val="222222"/>
+          <w:lang w:val="en-US"/>
+        </w:rPr>
+        <w:t xml:space="preserve"> </w:t>
       </w:r>
       <w:r>
         <w:rPr>
@@ -321,7 +365,7 @@
           <w:color w:val="222222"/>
           <w:lang w:val="en-US"/>
         </w:rPr>
-        <w:t>Technical Inspections &amp; Field Engineering</w:t>
+        <w:t>Structural Analysis</w:t>
       </w:r>
       <w:r>
         <w:rPr>
@@ -345,7 +389,45 @@
           <w:color w:val="222222"/>
           <w:lang w:val="en-US"/>
         </w:rPr>
-        <w:t>Equipment Monitoring &amp; Troubleshooting</w:t>
+        <w:t>Finite Element Analysis (FEA – Ansys)</w:t>
+      </w:r>
+    </w:p>
+    <w:p>
+      <w:pPr>
+        <w:spacing w:before="60" w:after="60"/>
+        <w:rPr>
+          <w:rFonts w:ascii="Arial" w:eastAsia="Calibri" w:hAnsi="Arial" w:cs="Arial"/>
+          <w:color w:val="222222"/>
+          <w:lang w:val="en-US"/>
+        </w:rPr>
+      </w:pPr>
+      <w:r>
+        <w:rPr>
+          <w:rFonts w:ascii="Arial" w:eastAsia="Calibri" w:hAnsi="Arial" w:cs="Arial"/>
+          <w:b/>
+          <w:bCs/>
+          <w:color w:val="111111"/>
+          <w:lang w:val="en-US"/>
+        </w:rPr>
+        <w:t>Engineering &amp; Technical</w:t>
+      </w:r>
+      <w:r>
+        <w:rPr>
+          <w:rFonts w:ascii="Arial" w:eastAsia="Calibri" w:hAnsi="Arial" w:cs="Arial"/>
+          <w:b/>
+          <w:bCs/>
+          <w:color w:val="111111"/>
+          <w:lang w:val="en-US"/>
+        </w:rPr>
+        <w:t xml:space="preserve">: </w:t>
+      </w:r>
+      <w:r>
+        <w:rPr>
+          <w:rFonts w:ascii="Arial" w:eastAsia="Calibri" w:hAnsi="Arial" w:cs="Arial"/>
+          <w:color w:val="222222"/>
+          <w:lang w:val="en-US"/>
+        </w:rPr>
+        <w:t>Mechanical Systems Analysis</w:t>
       </w:r>
       <w:r>
         <w:rPr>
@@ -361,6 +443,30 @@
           <w:color w:val="222222"/>
           <w:lang w:val="en-US"/>
         </w:rPr>
+        <w:t xml:space="preserve">• </w:t>
+      </w:r>
+      <w:r>
+        <w:rPr>
+          <w:rFonts w:ascii="Arial" w:eastAsia="Calibri" w:hAnsi="Arial" w:cs="Arial"/>
+          <w:color w:val="222222"/>
+          <w:lang w:val="en-US"/>
+        </w:rPr>
+        <w:t>Product Support &amp; Validation</w:t>
+      </w:r>
+      <w:r>
+        <w:rPr>
+          <w:rFonts w:ascii="Arial" w:eastAsia="Calibri" w:hAnsi="Arial" w:cs="Arial"/>
+          <w:color w:val="222222"/>
+          <w:lang w:val="en-US"/>
+        </w:rPr>
+        <w:t xml:space="preserve"> </w:t>
+      </w:r>
+      <w:r>
+        <w:rPr>
+          <w:rFonts w:ascii="Arial" w:eastAsia="Calibri" w:hAnsi="Arial" w:cs="Arial"/>
+          <w:color w:val="222222"/>
+          <w:lang w:val="en-US"/>
+        </w:rPr>
         <w:t>•</w:t>
       </w:r>
       <w:r>
@@ -377,7 +483,71 @@
           <w:color w:val="222222"/>
           <w:lang w:val="en-US"/>
         </w:rPr>
-        <w:t>Asset Reliability &amp; Operational Support</w:t>
+        <w:t>Technical Documentation</w:t>
+      </w:r>
+      <w:r>
+        <w:rPr>
+          <w:rFonts w:ascii="Arial" w:eastAsia="Calibri" w:hAnsi="Arial" w:cs="Arial"/>
+          <w:color w:val="222222"/>
+          <w:lang w:val="en-US"/>
+        </w:rPr>
+        <w:t xml:space="preserve"> </w:t>
+      </w:r>
+      <w:r>
+        <w:rPr>
+          <w:rFonts w:ascii="Arial" w:eastAsia="Calibri" w:hAnsi="Arial" w:cs="Arial"/>
+          <w:color w:val="222222"/>
+          <w:lang w:val="en-US"/>
+        </w:rPr>
+        <w:t>•</w:t>
+      </w:r>
+      <w:r>
+        <w:rPr>
+          <w:rFonts w:ascii="Arial" w:eastAsia="Calibri" w:hAnsi="Arial" w:cs="Arial"/>
+          <w:color w:val="222222"/>
+          <w:lang w:val="en-US"/>
+        </w:rPr>
+        <w:t xml:space="preserve"> </w:t>
+      </w:r>
+      <w:r>
+        <w:rPr>
+          <w:rFonts w:ascii="Arial" w:eastAsia="Calibri" w:hAnsi="Arial" w:cs="Arial"/>
+          <w:color w:val="222222"/>
+          <w:lang w:val="en-US"/>
+        </w:rPr>
+        <w:t>Piping Systems (P&amp;IDs / Isometrics – ASME B31)</w:t>
+      </w:r>
+      <w:r>
+        <w:rPr>
+          <w:rFonts w:ascii="Arial" w:eastAsia="Calibri" w:hAnsi="Arial" w:cs="Arial"/>
+          <w:color w:val="222222"/>
+          <w:lang w:val="en-US"/>
+        </w:rPr>
+        <w:t xml:space="preserve"> </w:t>
+      </w:r>
+      <w:r>
+        <w:rPr>
+          <w:rFonts w:ascii="Arial" w:eastAsia="Calibri" w:hAnsi="Arial" w:cs="Arial"/>
+          <w:color w:val="222222"/>
+          <w:lang w:val="en-US"/>
+        </w:rPr>
+        <w:t>•</w:t>
+      </w:r>
+      <w:r>
+        <w:rPr>
+          <w:rFonts w:ascii="Arial" w:eastAsia="Calibri" w:hAnsi="Arial" w:cs="Arial"/>
+          <w:color w:val="222222"/>
+          <w:lang w:val="en-US"/>
+        </w:rPr>
+        <w:t xml:space="preserve"> </w:t>
+      </w:r>
+      <w:r>
+        <w:rPr>
+          <w:rFonts w:ascii="Arial" w:eastAsia="Calibri" w:hAnsi="Arial" w:cs="Arial"/>
+          <w:color w:val="222222"/>
+          <w:lang w:val="en-US"/>
+        </w:rPr>
+        <w:t>Equipment Performance Evaluation</w:t>
       </w:r>
     </w:p>
     <w:p>
@@ -397,7 +567,7 @@
           <w:color w:val="111111"/>
           <w:lang w:val="en-US"/>
         </w:rPr>
-        <w:t>Engineering &amp; Project Coordination</w:t>
+        <w:t>Software</w:t>
       </w:r>
       <w:r>
         <w:rPr>
@@ -407,20 +577,13 @@
           <w:color w:val="111111"/>
           <w:lang w:val="en-US"/>
         </w:rPr>
-        <w:t xml:space="preserve">: </w:t>
-      </w:r>
-      <w:r>
-        <w:rPr>
-          <w:rFonts w:ascii="Arial" w:eastAsia="Calibri" w:hAnsi="Arial" w:cs="Arial"/>
-          <w:color w:val="222222"/>
-          <w:lang w:val="en-US"/>
-        </w:rPr>
-        <w:t>Technical Documentation &amp; Reporting</w:t>
-      </w:r>
-      <w:r>
-        <w:rPr>
-          <w:rFonts w:ascii="Arial" w:eastAsia="Calibri" w:hAnsi="Arial" w:cs="Arial"/>
-          <w:color w:val="222222"/>
+        <w:t>:</w:t>
+      </w:r>
+      <w:r>
+        <w:rPr>
+          <w:rFonts w:ascii="Arial" w:hAnsi="Arial" w:cs="Arial"/>
+          <w:b/>
+          <w:bCs/>
           <w:lang w:val="en-US"/>
         </w:rPr>
         <w:t xml:space="preserve"> </w:t>
@@ -431,15 +594,7 @@
           <w:color w:val="222222"/>
           <w:lang w:val="en-US"/>
         </w:rPr>
-        <w:t xml:space="preserve">• </w:t>
-      </w:r>
-      <w:r>
-        <w:rPr>
-          <w:rFonts w:ascii="Arial" w:eastAsia="Calibri" w:hAnsi="Arial" w:cs="Arial"/>
-          <w:color w:val="222222"/>
-          <w:lang w:val="en-US"/>
-        </w:rPr>
-        <w:t>Engineering Coordination</w:t>
+        <w:t>Autodesk Inventor</w:t>
       </w:r>
       <w:r>
         <w:rPr>
@@ -455,15 +610,7 @@
           <w:color w:val="222222"/>
           <w:lang w:val="en-US"/>
         </w:rPr>
-        <w:t xml:space="preserve">• </w:t>
-      </w:r>
-      <w:r>
-        <w:rPr>
-          <w:rFonts w:ascii="Arial" w:eastAsia="Calibri" w:hAnsi="Arial" w:cs="Arial"/>
-          <w:color w:val="222222"/>
-          <w:lang w:val="en-US"/>
-        </w:rPr>
-        <w:t>Maintenance Planning Support</w:t>
+        <w:t>•</w:t>
       </w:r>
       <w:r>
         <w:rPr>
@@ -479,15 +626,15 @@
           <w:color w:val="222222"/>
           <w:lang w:val="en-US"/>
         </w:rPr>
-        <w:t xml:space="preserve">• </w:t>
-      </w:r>
-      <w:r>
-        <w:rPr>
-          <w:rFonts w:ascii="Arial" w:eastAsia="Calibri" w:hAnsi="Arial" w:cs="Arial"/>
-          <w:color w:val="222222"/>
-          <w:lang w:val="en-US"/>
-        </w:rPr>
-        <w:t>Multidisciplinary Team Collaboration</w:t>
+        <w:t xml:space="preserve">AutoCAD </w:t>
+      </w:r>
+      <w:r>
+        <w:rPr>
+          <w:rFonts w:ascii="Arial" w:eastAsia="Calibri" w:hAnsi="Arial" w:cs="Arial"/>
+          <w:color w:val="222222"/>
+          <w:lang w:val="en-US"/>
+        </w:rPr>
+        <w:t>•</w:t>
       </w:r>
       <w:r>
         <w:rPr>
@@ -503,61 +650,12 @@
           <w:color w:val="222222"/>
           <w:lang w:val="en-US"/>
         </w:rPr>
-        <w:t xml:space="preserve">• </w:t>
-      </w:r>
-      <w:r>
-        <w:rPr>
-          <w:rFonts w:ascii="Arial" w:eastAsia="Calibri" w:hAnsi="Arial" w:cs="Arial"/>
-          <w:color w:val="222222"/>
-          <w:lang w:val="en-US"/>
-        </w:rPr>
-        <w:t xml:space="preserve">Operational Performance </w:t>
-      </w:r>
-      <w:proofErr w:type="spellStart"/>
-      <w:r>
-        <w:rPr>
-          <w:rFonts w:ascii="Arial" w:eastAsia="Calibri" w:hAnsi="Arial" w:cs="Arial"/>
-          <w:color w:val="222222"/>
-          <w:lang w:val="en-US"/>
-        </w:rPr>
-        <w:t>Monitoring</w:t>
-      </w:r>
-      <w:proofErr w:type="spellEnd"/>
-    </w:p>
-    <w:p>
-      <w:pPr>
-        <w:spacing w:before="60" w:after="60"/>
-        <w:rPr>
-          <w:rFonts w:ascii="Arial" w:eastAsia="Calibri" w:hAnsi="Arial" w:cs="Arial"/>
-          <w:color w:val="222222"/>
-          <w:lang w:val="en-US"/>
-        </w:rPr>
-      </w:pPr>
-      <w:r>
-        <w:rPr>
-          <w:rFonts w:ascii="Arial" w:eastAsia="Calibri" w:hAnsi="Arial" w:cs="Arial"/>
-          <w:b/>
-          <w:bCs/>
-          <w:color w:val="111111"/>
-          <w:lang w:val="en-US"/>
-        </w:rPr>
-        <w:t>Technical Tools</w:t>
-      </w:r>
-      <w:r>
-        <w:rPr>
-          <w:rFonts w:ascii="Arial" w:eastAsia="Calibri" w:hAnsi="Arial" w:cs="Arial"/>
-          <w:b/>
-          <w:bCs/>
-          <w:color w:val="111111"/>
-          <w:lang w:val="en-US"/>
-        </w:rPr>
-        <w:t>:</w:t>
-      </w:r>
-      <w:r>
-        <w:rPr>
-          <w:rFonts w:ascii="Arial" w:hAnsi="Arial" w:cs="Arial"/>
-          <w:b/>
-          <w:bCs/>
+        <w:t>Ansys (FEA)</w:t>
+      </w:r>
+      <w:r>
+        <w:rPr>
+          <w:rFonts w:ascii="Arial" w:eastAsia="Calibri" w:hAnsi="Arial" w:cs="Arial"/>
+          <w:color w:val="222222"/>
           <w:lang w:val="en-US"/>
         </w:rPr>
         <w:t xml:space="preserve"> </w:t>
@@ -568,7 +666,7 @@
           <w:color w:val="222222"/>
           <w:lang w:val="en-US"/>
         </w:rPr>
-        <w:t>MS Excel</w:t>
+        <w:t>•</w:t>
       </w:r>
       <w:r>
         <w:rPr>
@@ -584,6 +682,22 @@
           <w:color w:val="222222"/>
           <w:lang w:val="en-US"/>
         </w:rPr>
+        <w:t>MATLAB</w:t>
+      </w:r>
+      <w:r>
+        <w:rPr>
+          <w:rFonts w:ascii="Arial" w:eastAsia="Calibri" w:hAnsi="Arial" w:cs="Arial"/>
+          <w:color w:val="222222"/>
+          <w:lang w:val="en-US"/>
+        </w:rPr>
+        <w:t xml:space="preserve"> </w:t>
+      </w:r>
+      <w:r>
+        <w:rPr>
+          <w:rFonts w:ascii="Arial" w:eastAsia="Calibri" w:hAnsi="Arial" w:cs="Arial"/>
+          <w:color w:val="222222"/>
+          <w:lang w:val="en-US"/>
+        </w:rPr>
         <w:t>•</w:t>
       </w:r>
       <w:r>
@@ -600,7 +714,7 @@
           <w:color w:val="222222"/>
           <w:lang w:val="en-US"/>
         </w:rPr>
-        <w:t>Microsoft Office</w:t>
+        <w:t>Python</w:t>
       </w:r>
       <w:r>
         <w:rPr>
@@ -616,23 +730,7 @@
           <w:color w:val="222222"/>
           <w:lang w:val="en-US"/>
         </w:rPr>
-        <w:t>•</w:t>
-      </w:r>
-      <w:r>
-        <w:rPr>
-          <w:rFonts w:ascii="Arial" w:eastAsia="Calibri" w:hAnsi="Arial" w:cs="Arial"/>
-          <w:color w:val="222222"/>
-          <w:lang w:val="en-US"/>
-        </w:rPr>
-        <w:t xml:space="preserve"> </w:t>
-      </w:r>
-      <w:r>
-        <w:rPr>
-          <w:rFonts w:ascii="Arial" w:eastAsia="Calibri" w:hAnsi="Arial" w:cs="Arial"/>
-          <w:color w:val="222222"/>
-          <w:lang w:val="en-US"/>
-        </w:rPr>
-        <w:t>Technical Reporting &amp; Data Analysis</w:t>
+        <w:t>MS • Office (Advanced Excel)</w:t>
       </w:r>
     </w:p>
     <w:p>
@@ -676,7 +774,19 @@
           <w:szCs w:val="22"/>
           <w:lang w:val="en-US"/>
         </w:rPr>
-        <w:t xml:space="preserve">Project Engineer </w:t>
+        <w:t>Project Engineer</w:t>
+      </w:r>
+      <w:r>
+        <w:rPr>
+          <w:rFonts w:ascii="Arial" w:eastAsia="Calibri" w:hAnsi="Arial" w:cs="Arial"/>
+          <w:b/>
+          <w:bCs/>
+          <w:color w:val="111111"/>
+          <w:sz w:val="22"/>
+          <w:szCs w:val="22"/>
+          <w:lang w:val="en-US"/>
+        </w:rPr>
+        <w:t xml:space="preserve"> </w:t>
       </w:r>
       <w:r>
         <w:rPr>
@@ -698,7 +808,6 @@
         </w:rPr>
         <w:t xml:space="preserve"> </w:t>
       </w:r>
-      <w:proofErr w:type="spellStart"/>
       <w:r>
         <w:rPr>
           <w:rFonts w:ascii="Arial" w:eastAsia="Calibri" w:hAnsi="Arial" w:cs="Arial"/>
@@ -709,20 +818,7 @@
           <w:szCs w:val="22"/>
           <w:lang w:val="en-US"/>
         </w:rPr>
-        <w:t>Herrenknecht</w:t>
-      </w:r>
-      <w:proofErr w:type="spellEnd"/>
-      <w:r>
-        <w:rPr>
-          <w:rFonts w:ascii="Arial" w:eastAsia="Calibri" w:hAnsi="Arial" w:cs="Arial"/>
-          <w:b/>
-          <w:bCs/>
-          <w:color w:val="002060"/>
-          <w:sz w:val="22"/>
-          <w:szCs w:val="22"/>
-          <w:lang w:val="en-US"/>
-        </w:rPr>
-        <w:t xml:space="preserve"> Tunnelling Services Panama Corp.</w:t>
+        <w:t>Herrenknecht Tunnelling Services Panama Corp.</w:t>
       </w:r>
     </w:p>
     <w:p>
@@ -743,7 +839,7 @@
           <w:szCs w:val="18"/>
           <w:lang w:val="en-US"/>
         </w:rPr>
-        <w:t>Panamá City, Panamá   •   Jan 2025 – Jul 2025</w:t>
+        <w:t>Panamá City, Panamá   •   2025 – 2025</w:t>
       </w:r>
     </w:p>
     <w:p>
@@ -765,7 +861,220 @@
           <w:color w:val="222222"/>
           <w:lang w:val="en-US"/>
         </w:rPr>
-        <w:t>Supported monitoring and evaluation of mechanical and industrial infrastructure systems across 2 international tunnelling projects, improving operational performance tracking and reducing potential equipment failure risks by 15%.</w:t>
+        <w:t>Supported engineering analysis and performance evaluation of mechanical systems across international TBM projects.</w:t>
+      </w:r>
+    </w:p>
+    <w:p>
+      <w:pPr>
+        <w:pStyle w:val="ListParagraph"/>
+        <w:numPr>
+          <w:ilvl w:val="0"/>
+          <w:numId w:val="2"/>
+        </w:numPr>
+        <w:rPr>
+          <w:rFonts w:ascii="Arial" w:eastAsia="Calibri" w:hAnsi="Arial" w:cs="Arial"/>
+          <w:color w:val="222222"/>
+          <w:lang w:val="en-US"/>
+        </w:rPr>
+      </w:pPr>
+      <w:r>
+        <w:rPr>
+          <w:rFonts w:ascii="Arial" w:hAnsi="Arial" w:cs="Arial"/>
+          <w:lang w:val="en-US"/>
+        </w:rPr>
+        <w:t>Performed structural validation calculations and functional analysis of mechanical assemblies, contributing to safe operation and reduction of equipment downtime.</w:t>
+      </w:r>
+    </w:p>
+    <w:p>
+      <w:pPr>
+        <w:pStyle w:val="ListParagraph"/>
+        <w:numPr>
+          <w:ilvl w:val="0"/>
+          <w:numId w:val="2"/>
+        </w:numPr>
+        <w:rPr>
+          <w:rFonts w:ascii="Arial" w:eastAsia="Calibri" w:hAnsi="Arial" w:cs="Arial"/>
+          <w:color w:val="222222"/>
+          <w:lang w:val="en-US"/>
+        </w:rPr>
+      </w:pPr>
+      <w:r>
+        <w:rPr>
+          <w:rFonts w:ascii="Arial" w:eastAsia="Calibri" w:hAnsi="Arial" w:cs="Arial"/>
+          <w:color w:val="222222"/>
+          <w:lang w:val="en-US"/>
+        </w:rPr>
+        <w:t>Assisted in the development of technical documentation, SOPs, and engineering reports, improving execution consistency and reducing non-conformance events across 3+ project sites.</w:t>
+      </w:r>
+    </w:p>
+    <w:p>
+      <w:pPr>
+        <w:pStyle w:val="ListParagraph"/>
+        <w:numPr>
+          <w:ilvl w:val="0"/>
+          <w:numId w:val="2"/>
+        </w:numPr>
+        <w:rPr>
+          <w:rFonts w:ascii="Arial" w:eastAsia="Calibri" w:hAnsi="Arial" w:cs="Arial"/>
+          <w:color w:val="222222"/>
+          <w:lang w:val="en-US"/>
+        </w:rPr>
+      </w:pPr>
+      <w:r>
+        <w:rPr>
+          <w:rFonts w:ascii="Arial" w:eastAsia="Calibri" w:hAnsi="Arial" w:cs="Arial"/>
+          <w:color w:val="222222"/>
+          <w:lang w:val="en-US"/>
+        </w:rPr>
+        <w:t>Contributed to engineering decision-making by analyzing equipment behavior under operational conditions.</w:t>
+      </w:r>
+    </w:p>
+    <w:p>
+      <w:pPr>
+        <w:spacing w:before="40" w:after="40"/>
+        <w:ind w:left="240"/>
+        <w:rPr>
+          <w:rFonts w:ascii="Arial" w:hAnsi="Arial" w:cs="Arial"/>
+          <w:lang w:val="en-US"/>
+        </w:rPr>
+      </w:pPr>
+      <w:r>
+        <w:rPr>
+          <w:rFonts w:ascii="Arial" w:eastAsia="Calibri" w:hAnsi="Arial" w:cs="Arial"/>
+          <w:i/>
+          <w:iCs/>
+          <w:color w:val="7F8C8D"/>
+          <w:lang w:val="en-US"/>
+        </w:rPr>
+        <w:t>Key projects: Hudson River Tunnel Project (USA) • Railway Tunnel Project (</w:t>
+      </w:r>
+      <w:r>
+        <w:rPr>
+          <w:rFonts w:ascii="Arial" w:eastAsia="Calibri" w:hAnsi="Arial" w:cs="Arial"/>
+          <w:i/>
+          <w:iCs/>
+          <w:color w:val="7F8C8D"/>
+          <w:lang w:val="en-US"/>
+        </w:rPr>
+        <w:t>Perú</w:t>
+      </w:r>
+      <w:r>
+        <w:rPr>
+          <w:rFonts w:ascii="Arial" w:eastAsia="Calibri" w:hAnsi="Arial" w:cs="Arial"/>
+          <w:i/>
+          <w:iCs/>
+          <w:color w:val="7F8C8D"/>
+          <w:lang w:val="en-US"/>
+        </w:rPr>
+        <w:t>)</w:t>
+      </w:r>
+    </w:p>
+    <w:p>
+      <w:pPr>
+        <w:spacing w:before="180" w:after="20"/>
+        <w:rPr>
+          <w:rFonts w:ascii="Arial" w:hAnsi="Arial" w:cs="Arial"/>
+          <w:lang w:val="en-US"/>
+        </w:rPr>
+      </w:pPr>
+      <w:r>
+        <w:rPr>
+          <w:rFonts w:ascii="Arial" w:eastAsia="Calibri" w:hAnsi="Arial" w:cs="Arial"/>
+          <w:b/>
+          <w:bCs/>
+          <w:color w:val="111111"/>
+          <w:sz w:val="22"/>
+          <w:szCs w:val="22"/>
+          <w:lang w:val="en-US"/>
+        </w:rPr>
+        <w:t>Field Engineer – TBM &amp; Surface Facilities (Intern)</w:t>
+      </w:r>
+      <w:r>
+        <w:rPr>
+          <w:rFonts w:ascii="Arial" w:eastAsia="Calibri" w:hAnsi="Arial" w:cs="Arial"/>
+          <w:color w:val="7F8C8D"/>
+          <w:sz w:val="22"/>
+          <w:szCs w:val="22"/>
+          <w:lang w:val="en-US"/>
+        </w:rPr>
+        <w:t xml:space="preserve"> </w:t>
+      </w:r>
+      <w:r>
+        <w:rPr>
+          <w:rFonts w:ascii="Arial" w:eastAsia="Calibri" w:hAnsi="Arial" w:cs="Arial"/>
+          <w:color w:val="002060"/>
+          <w:sz w:val="22"/>
+          <w:szCs w:val="22"/>
+          <w:lang w:val="en-US"/>
+        </w:rPr>
+        <w:t>|</w:t>
+      </w:r>
+      <w:r>
+        <w:rPr>
+          <w:rFonts w:ascii="Arial" w:eastAsia="Calibri" w:hAnsi="Arial" w:cs="Arial"/>
+          <w:color w:val="7F8C8D"/>
+          <w:sz w:val="22"/>
+          <w:szCs w:val="22"/>
+          <w:lang w:val="en-US"/>
+        </w:rPr>
+        <w:t xml:space="preserve"> </w:t>
+      </w:r>
+      <w:r>
+        <w:rPr>
+          <w:rFonts w:ascii="Arial" w:eastAsia="Calibri" w:hAnsi="Arial" w:cs="Arial"/>
+          <w:b/>
+          <w:bCs/>
+          <w:color w:val="002060"/>
+          <w:sz w:val="22"/>
+          <w:szCs w:val="22"/>
+          <w:lang w:val="en-US"/>
+        </w:rPr>
+        <w:t>China Railway Tunnel Group Co., Ltd.</w:t>
+      </w:r>
+    </w:p>
+    <w:p>
+      <w:pPr>
+        <w:spacing w:after="60"/>
+        <w:rPr>
+          <w:rFonts w:ascii="Arial" w:hAnsi="Arial" w:cs="Arial"/>
+          <w:lang w:val="en-US"/>
+        </w:rPr>
+      </w:pPr>
+      <w:r>
+        <w:rPr>
+          <w:rFonts w:ascii="Arial" w:eastAsia="Calibri" w:hAnsi="Arial" w:cs="Arial"/>
+          <w:i/>
+          <w:iCs/>
+          <w:color w:val="7F8C8D"/>
+          <w:sz w:val="18"/>
+          <w:szCs w:val="18"/>
+          <w:lang w:val="en-US"/>
+        </w:rPr>
+        <w:t xml:space="preserve">Panamá City, Panamá   •   2024 – </w:t>
+      </w:r>
+      <w:r>
+        <w:rPr>
+          <w:rFonts w:ascii="Arial" w:eastAsia="Calibri" w:hAnsi="Arial" w:cs="Arial"/>
+          <w:i/>
+          <w:iCs/>
+          <w:color w:val="7F8C8D"/>
+          <w:sz w:val="18"/>
+          <w:szCs w:val="18"/>
+          <w:lang w:val="en-US"/>
+        </w:rPr>
+        <w:t>2</w:t>
+      </w:r>
+      <w:r>
+        <w:rPr>
+          <w:rFonts w:ascii="Arial" w:eastAsia="Calibri" w:hAnsi="Arial" w:cs="Arial"/>
+          <w:i/>
+          <w:iCs/>
+          <w:color w:val="7F8C8D"/>
+          <w:sz w:val="18"/>
+          <w:szCs w:val="18"/>
+          <w:lang w:val="en-US"/>
+        </w:rPr>
+        <w:t>025</w:t>
       </w:r>
     </w:p>
     <w:p>
@@ -783,10 +1092,11 @@
       </w:pPr>
       <w:r>
         <w:rPr>
-          <w:rFonts w:ascii="Arial" w:hAnsi="Arial" w:cs="Arial"/>
-          <w:lang w:val="en-US"/>
-        </w:rPr>
-        <w:t>Conducted technical inspections and operational analysis of mechanical equipment and industrial systems, contributing to a 20% improvement in system reliability and early fault detection.</w:t>
+          <w:rFonts w:ascii="Arial" w:eastAsia="Calibri" w:hAnsi="Arial" w:cs="Arial"/>
+          <w:color w:val="222222"/>
+          <w:lang w:val="en-US"/>
+        </w:rPr>
+        <w:t>Supported mechanical system verification and performance analysis during tunnelling operations.</w:t>
       </w:r>
     </w:p>
     <w:p>
@@ -808,167 +1118,7 @@
           <w:color w:val="222222"/>
           <w:lang w:val="en-US"/>
         </w:rPr>
-        <w:t>Coordinated engineering documentation, maintenance activities, and technical communication for multidisciplinary teams of 5+ engineers, improving operational workflow efficiency by 18%.</w:t>
-      </w:r>
-    </w:p>
-    <w:p>
-      <w:pPr>
-        <w:pStyle w:val="ListParagraph"/>
-        <w:numPr>
-          <w:ilvl w:val="0"/>
-          <w:numId w:val="2"/>
-        </w:numPr>
-        <w:rPr>
-          <w:rFonts w:ascii="Arial" w:eastAsia="Calibri" w:hAnsi="Arial" w:cs="Arial"/>
-          <w:color w:val="222222"/>
-          <w:lang w:val="en-US"/>
-        </w:rPr>
-      </w:pPr>
-      <w:r>
-        <w:rPr>
-          <w:rFonts w:ascii="Arial" w:eastAsia="Calibri" w:hAnsi="Arial" w:cs="Arial"/>
-          <w:color w:val="222222"/>
-          <w:lang w:val="en-US"/>
-        </w:rPr>
-        <w:t>Supported maintenance planning and engineering evaluation of industrial equipment and field infrastructure to ensure operational continuity and safety compliance.</w:t>
-      </w:r>
-    </w:p>
-    <w:p>
-      <w:pPr>
-        <w:spacing w:before="40" w:after="40"/>
-        <w:ind w:left="240"/>
-        <w:rPr>
-          <w:rFonts w:ascii="Arial" w:hAnsi="Arial" w:cs="Arial"/>
-          <w:lang w:val="en-US"/>
-        </w:rPr>
-      </w:pPr>
-      <w:r>
-        <w:rPr>
-          <w:rFonts w:ascii="Arial" w:eastAsia="Calibri" w:hAnsi="Arial" w:cs="Arial"/>
-          <w:i/>
-          <w:iCs/>
-          <w:color w:val="7F8C8D"/>
-          <w:lang w:val="en-US"/>
-        </w:rPr>
-        <w:t>Key projects: Hudson River Tunnel Project (USA) • Railway Tunnel Project (</w:t>
-      </w:r>
-      <w:r>
-        <w:rPr>
-          <w:rFonts w:ascii="Arial" w:eastAsia="Calibri" w:hAnsi="Arial" w:cs="Arial"/>
-          <w:i/>
-          <w:iCs/>
-          <w:color w:val="7F8C8D"/>
-          <w:lang w:val="en-US"/>
-        </w:rPr>
-        <w:t>Perú</w:t>
-      </w:r>
-      <w:r>
-        <w:rPr>
-          <w:rFonts w:ascii="Arial" w:eastAsia="Calibri" w:hAnsi="Arial" w:cs="Arial"/>
-          <w:i/>
-          <w:iCs/>
-          <w:color w:val="7F8C8D"/>
-          <w:lang w:val="en-US"/>
-        </w:rPr>
-        <w:t>)</w:t>
-      </w:r>
-    </w:p>
-    <w:p>
-      <w:pPr>
-        <w:spacing w:before="180" w:after="20"/>
-        <w:rPr>
-          <w:rFonts w:ascii="Arial" w:hAnsi="Arial" w:cs="Arial"/>
-          <w:lang w:val="en-US"/>
-        </w:rPr>
-      </w:pPr>
-      <w:r>
-        <w:rPr>
-          <w:rFonts w:ascii="Arial" w:eastAsia="Calibri" w:hAnsi="Arial" w:cs="Arial"/>
-          <w:b/>
-          <w:bCs/>
-          <w:color w:val="111111"/>
-          <w:sz w:val="22"/>
-          <w:szCs w:val="22"/>
-          <w:lang w:val="en-US"/>
-        </w:rPr>
-        <w:t>Field Engineer – TBM &amp; Surface Facilities (</w:t>
-      </w:r>
-      <w:proofErr w:type="gramStart"/>
-      <w:r>
-        <w:rPr>
-          <w:rFonts w:ascii="Arial" w:eastAsia="Calibri" w:hAnsi="Arial" w:cs="Arial"/>
-          <w:b/>
-          <w:bCs/>
-          <w:color w:val="111111"/>
-          <w:sz w:val="22"/>
-          <w:szCs w:val="22"/>
-          <w:lang w:val="en-US"/>
-        </w:rPr>
-        <w:t>Intern)</w:t>
-      </w:r>
-      <w:r>
-        <w:rPr>
-          <w:rFonts w:ascii="Arial" w:eastAsia="Calibri" w:hAnsi="Arial" w:cs="Arial"/>
-          <w:color w:val="7F8C8D"/>
-          <w:sz w:val="22"/>
-          <w:szCs w:val="22"/>
-          <w:lang w:val="en-US"/>
-        </w:rPr>
-        <w:t xml:space="preserve">  </w:t>
-      </w:r>
-      <w:r>
-        <w:rPr>
-          <w:rFonts w:ascii="Arial" w:eastAsia="Calibri" w:hAnsi="Arial" w:cs="Arial"/>
-          <w:color w:val="002060"/>
-          <w:sz w:val="22"/>
-          <w:szCs w:val="22"/>
-          <w:lang w:val="en-US"/>
-        </w:rPr>
-        <w:t>|</w:t>
-      </w:r>
-      <w:proofErr w:type="gramEnd"/>
-      <w:r>
-        <w:rPr>
-          <w:rFonts w:ascii="Arial" w:eastAsia="Calibri" w:hAnsi="Arial" w:cs="Arial"/>
-          <w:color w:val="7F8C8D"/>
-          <w:sz w:val="22"/>
-          <w:szCs w:val="22"/>
-          <w:lang w:val="en-US"/>
-        </w:rPr>
-        <w:t xml:space="preserve">  </w:t>
-      </w:r>
-      <w:r>
-        <w:rPr>
-          <w:rFonts w:ascii="Arial" w:eastAsia="Calibri" w:hAnsi="Arial" w:cs="Arial"/>
-          <w:b/>
-          <w:bCs/>
-          <w:color w:val="002060"/>
-          <w:sz w:val="22"/>
-          <w:szCs w:val="22"/>
-          <w:lang w:val="en-US"/>
-        </w:rPr>
-        <w:t>China Railway Tunnel Group Co., Ltd.</w:t>
-      </w:r>
-    </w:p>
-    <w:p>
-      <w:pPr>
-        <w:spacing w:after="60"/>
-        <w:rPr>
-          <w:rFonts w:ascii="Arial" w:hAnsi="Arial" w:cs="Arial"/>
-          <w:lang w:val="en-US"/>
-        </w:rPr>
-      </w:pPr>
-      <w:r>
-        <w:rPr>
-          <w:rFonts w:ascii="Arial" w:eastAsia="Calibri" w:hAnsi="Arial" w:cs="Arial"/>
-          <w:i/>
-          <w:iCs/>
-          <w:color w:val="7F8C8D"/>
-          <w:sz w:val="18"/>
-          <w:szCs w:val="18"/>
-          <w:lang w:val="en-US"/>
-        </w:rPr>
-        <w:t>Panamá City, Panamá   •   Aug 2024 – Jan 2025</w:t>
+        <w:t>Designed corrective engineering solutions for mechanical and piping systems, improving operational continuity and reducing field incidents.</w:t>
       </w:r>
     </w:p>
     <w:p>
@@ -990,15 +1140,7 @@
           <w:color w:val="222222"/>
           <w:lang w:val="en-US"/>
         </w:rPr>
-        <w:t>Supported field monitoring of tunnelling and industrial mechanical infrastructure in active operations, maintaining equipment availability above 95</w:t>
-      </w:r>
-      <w:r>
-        <w:rPr>
-          <w:rFonts w:ascii="Arial" w:eastAsia="Calibri" w:hAnsi="Arial" w:cs="Arial"/>
-          <w:color w:val="222222"/>
-          <w:lang w:val="en-US"/>
-        </w:rPr>
-        <w:t>%.</w:t>
+        <w:t>Produced P&amp;IDs and isometric drawings for high-pressure systems in compliance with ASME B31 standards.</w:t>
       </w:r>
     </w:p>
     <w:p>
@@ -1020,15 +1162,7 @@
           <w:color w:val="222222"/>
           <w:lang w:val="en-US"/>
         </w:rPr>
-        <w:t>Assisted in technical inspections and performance monitoring of industrial equipment and mechanical systems in field environments</w:t>
-      </w:r>
-      <w:r>
-        <w:rPr>
-          <w:rFonts w:ascii="Arial" w:eastAsia="Calibri" w:hAnsi="Arial" w:cs="Arial"/>
-          <w:color w:val="222222"/>
-          <w:lang w:val="en-US"/>
-        </w:rPr>
-        <w:t>.</w:t>
+        <w:t>Developed technical documentation and inspection procedures, reducing execution errors by 20%.</w:t>
       </w:r>
     </w:p>
     <w:p>
@@ -1046,19 +1180,131 @@
       </w:pPr>
       <w:r>
         <w:rPr>
-          <w:rFonts w:ascii="Arial" w:eastAsia="Calibri" w:hAnsi="Arial" w:cs="Arial"/>
-          <w:color w:val="222222"/>
-          <w:lang w:val="en-US"/>
-        </w:rPr>
-        <w:t>Prepared weekly engineering reports on equipment performance, operational conditions, and infrastructure status to support maintenance and engineering decisions</w:t>
-      </w:r>
-      <w:r>
-        <w:rPr>
-          <w:rFonts w:ascii="Arial" w:eastAsia="Calibri" w:hAnsi="Arial" w:cs="Arial"/>
-          <w:color w:val="222222"/>
-          <w:lang w:val="en-US"/>
-        </w:rPr>
-        <w:t>.</w:t>
+          <w:rFonts w:ascii="Arial" w:hAnsi="Arial" w:cs="Arial"/>
+          <w:lang w:val="en-US"/>
+        </w:rPr>
+        <w:t>Supported pressure testing, mechanical assembly verification, and system inspections.</w:t>
+      </w:r>
+    </w:p>
+    <w:p>
+      <w:pPr>
+        <w:spacing w:before="40" w:after="40"/>
+        <w:ind w:left="240"/>
+        <w:rPr>
+          <w:rFonts w:ascii="Arial" w:eastAsia="Calibri" w:hAnsi="Arial" w:cs="Arial"/>
+          <w:i/>
+          <w:iCs/>
+          <w:color w:val="7F8C8D"/>
+          <w:lang w:val="en-US"/>
+        </w:rPr>
+      </w:pPr>
+      <w:r>
+        <w:rPr>
+          <w:rFonts w:ascii="Arial" w:eastAsia="Calibri" w:hAnsi="Arial" w:cs="Arial"/>
+          <w:i/>
+          <w:iCs/>
+          <w:color w:val="7F8C8D"/>
+          <w:lang w:val="en-US"/>
+        </w:rPr>
+        <w:t>Key project: Panama Metro Line 3 – Tunnel Section</w:t>
+      </w:r>
+    </w:p>
+    <w:p>
+      <w:pPr>
+        <w:spacing w:before="180" w:after="20"/>
+        <w:rPr>
+          <w:rFonts w:ascii="Arial" w:hAnsi="Arial" w:cs="Arial"/>
+          <w:lang w:val="en-US"/>
+        </w:rPr>
+      </w:pPr>
+      <w:r>
+        <w:rPr>
+          <w:rFonts w:ascii="Arial" w:eastAsia="Calibri" w:hAnsi="Arial" w:cs="Arial"/>
+          <w:b/>
+          <w:bCs/>
+          <w:color w:val="111111"/>
+          <w:sz w:val="22"/>
+          <w:szCs w:val="22"/>
+          <w:lang w:val="en-US"/>
+        </w:rPr>
+        <w:t>Engineering Projects – Mechanical Design &amp; Analysis</w:t>
+      </w:r>
+      <w:r>
+        <w:rPr>
+          <w:rFonts w:ascii="Arial" w:eastAsia="Calibri" w:hAnsi="Arial" w:cs="Arial"/>
+          <w:b/>
+          <w:bCs/>
+          <w:color w:val="111111"/>
+          <w:sz w:val="22"/>
+          <w:szCs w:val="22"/>
+          <w:lang w:val="en-US"/>
+        </w:rPr>
+        <w:t xml:space="preserve"> </w:t>
+      </w:r>
+      <w:r>
+        <w:rPr>
+          <w:rFonts w:ascii="Arial" w:eastAsia="Calibri" w:hAnsi="Arial" w:cs="Arial"/>
+          <w:color w:val="002060"/>
+          <w:sz w:val="22"/>
+          <w:szCs w:val="22"/>
+          <w:lang w:val="en-US"/>
+        </w:rPr>
+        <w:t>|</w:t>
+      </w:r>
+      <w:r>
+        <w:rPr>
+          <w:rFonts w:ascii="Arial" w:eastAsia="Calibri" w:hAnsi="Arial" w:cs="Arial"/>
+          <w:color w:val="7F8C8D"/>
+          <w:sz w:val="22"/>
+          <w:szCs w:val="22"/>
+          <w:lang w:val="en-US"/>
+        </w:rPr>
+        <w:t xml:space="preserve"> </w:t>
+      </w:r>
+      <w:r>
+        <w:rPr>
+          <w:rFonts w:ascii="Arial" w:eastAsia="Calibri" w:hAnsi="Arial" w:cs="Arial"/>
+          <w:b/>
+          <w:bCs/>
+          <w:color w:val="002060"/>
+          <w:sz w:val="22"/>
+          <w:szCs w:val="22"/>
+          <w:lang w:val="en-US"/>
+        </w:rPr>
+        <w:t>Independent</w:t>
+      </w:r>
+    </w:p>
+    <w:p>
+      <w:pPr>
+        <w:spacing w:after="60"/>
+        <w:rPr>
+          <w:rFonts w:ascii="Arial" w:hAnsi="Arial" w:cs="Arial"/>
+          <w:lang w:val="en-US"/>
+        </w:rPr>
+      </w:pPr>
+      <w:r>
+        <w:rPr>
+          <w:rFonts w:ascii="Arial" w:eastAsia="Calibri" w:hAnsi="Arial" w:cs="Arial"/>
+          <w:i/>
+          <w:iCs/>
+          <w:color w:val="7F8C8D"/>
+          <w:sz w:val="18"/>
+          <w:szCs w:val="18"/>
+          <w:lang w:val="en-US"/>
+        </w:rPr>
+        <w:t xml:space="preserve">Panamá City, Panamá   •   2024 – </w:t>
+      </w:r>
+      <w:r>
+        <w:rPr>
+          <w:rFonts w:ascii="Arial" w:eastAsia="Calibri" w:hAnsi="Arial" w:cs="Arial"/>
+          <w:i/>
+          <w:iCs/>
+          <w:color w:val="7F8C8D"/>
+          <w:sz w:val="18"/>
+          <w:szCs w:val="18"/>
+          <w:lang w:val="en-US"/>
+        </w:rPr>
+        <w:t>Present</w:t>
       </w:r>
     </w:p>
     <w:p>
@@ -1070,279 +1316,18 @@
         </w:numPr>
         <w:spacing w:before="40" w:after="40"/>
         <w:rPr>
-          <w:rFonts w:ascii="Arial" w:hAnsi="Arial" w:cs="Arial"/>
-          <w:lang w:val="en-US"/>
-        </w:rPr>
-      </w:pPr>
-      <w:r>
-        <w:rPr>
-          <w:rFonts w:ascii="Arial" w:eastAsia="Calibri" w:hAnsi="Arial" w:cs="Arial"/>
-          <w:color w:val="222222"/>
-          <w:lang w:val="en-US"/>
-        </w:rPr>
-        <w:t>Supported troubleshooting and operational monitoring of mechanical and industrial systems, improving equipment reliability by 20%.</w:t>
-      </w:r>
-    </w:p>
-    <w:p>
-      <w:pPr>
-        <w:spacing w:before="40" w:after="40"/>
-        <w:ind w:left="240"/>
-        <w:rPr>
-          <w:rFonts w:ascii="Arial" w:hAnsi="Arial" w:cs="Arial"/>
-          <w:lang w:val="en-US"/>
-        </w:rPr>
-      </w:pPr>
-      <w:r>
-        <w:rPr>
-          <w:rFonts w:ascii="Arial" w:eastAsia="Calibri" w:hAnsi="Arial" w:cs="Arial"/>
-          <w:i/>
-          <w:iCs/>
-          <w:color w:val="7F8C8D"/>
-          <w:lang w:val="en-US"/>
-        </w:rPr>
-        <w:t>Key project: Panama Metro Line 3 – Tunnel Section</w:t>
-      </w:r>
-    </w:p>
-    <w:p>
-      <w:pPr>
-        <w:rPr>
-          <w:rFonts w:ascii="Arial" w:eastAsia="Calibri" w:hAnsi="Arial" w:cs="Arial"/>
-          <w:b/>
-          <w:bCs/>
-          <w:sz w:val="22"/>
-          <w:szCs w:val="22"/>
-          <w:lang w:val="en-US"/>
-        </w:rPr>
-      </w:pPr>
-      <w:r>
-        <w:rPr>
-          <w:rFonts w:ascii="Arial" w:eastAsia="Calibri" w:hAnsi="Arial" w:cs="Arial"/>
-          <w:b/>
-          <w:bCs/>
-          <w:sz w:val="22"/>
-          <w:szCs w:val="22"/>
-          <w:lang w:val="en-US"/>
-        </w:rPr>
-        <w:br w:type="page"/>
-      </w:r>
-    </w:p>
-    <w:p>
-      <w:pPr>
-        <w:pBdr>
-          <w:bottom w:val="single" w:sz="6" w:space="2" w:color="1A5276"/>
-        </w:pBdr>
-        <w:spacing w:before="240" w:after="60"/>
-        <w:rPr>
-          <w:rFonts w:ascii="Arial" w:hAnsi="Arial" w:cs="Arial"/>
-          <w:lang w:val="en-US"/>
-        </w:rPr>
-      </w:pPr>
-      <w:r>
-        <w:rPr>
-          <w:rFonts w:ascii="Arial" w:eastAsia="Calibri" w:hAnsi="Arial" w:cs="Arial"/>
-          <w:b/>
-          <w:bCs/>
-          <w:sz w:val="22"/>
-          <w:szCs w:val="22"/>
-          <w:lang w:val="en-US"/>
-        </w:rPr>
-        <w:lastRenderedPageBreak/>
-        <w:t>EDUCATION</w:t>
-      </w:r>
-    </w:p>
-    <w:p>
-      <w:pPr>
-        <w:spacing w:before="120" w:after="20"/>
-        <w:rPr>
-          <w:rFonts w:ascii="Arial" w:hAnsi="Arial" w:cs="Arial"/>
-          <w:lang w:val="en-US"/>
-        </w:rPr>
-      </w:pPr>
-      <w:r>
-        <w:rPr>
-          <w:rFonts w:ascii="Arial" w:eastAsia="Calibri" w:hAnsi="Arial" w:cs="Arial"/>
-          <w:b/>
-          <w:bCs/>
-          <w:color w:val="111111"/>
-          <w:sz w:val="22"/>
-          <w:szCs w:val="22"/>
-          <w:lang w:val="en-US"/>
-        </w:rPr>
-        <w:t>B.Sc. in Mechanical Engineering</w:t>
-      </w:r>
-      <w:r>
-        <w:rPr>
-          <w:rFonts w:ascii="Arial" w:eastAsia="Calibri" w:hAnsi="Arial" w:cs="Arial"/>
-          <w:b/>
-          <w:bCs/>
-          <w:color w:val="1A5276"/>
-          <w:lang w:val="en-US"/>
-        </w:rPr>
-        <w:t xml:space="preserve">   •   </w:t>
-      </w:r>
-      <w:r>
-        <w:rPr>
-          <w:rFonts w:ascii="Arial" w:eastAsia="Calibri" w:hAnsi="Arial" w:cs="Arial"/>
-          <w:b/>
-          <w:bCs/>
-          <w:color w:val="002060"/>
-          <w:lang w:val="en-US"/>
-        </w:rPr>
-        <w:t>Technological University of Panama</w:t>
-      </w:r>
-    </w:p>
-    <w:p>
-      <w:pPr>
-        <w:spacing w:after="60"/>
-        <w:rPr>
-          <w:rFonts w:ascii="Arial" w:hAnsi="Arial" w:cs="Arial"/>
-          <w:lang w:val="en-US"/>
-        </w:rPr>
-      </w:pPr>
-      <w:r>
-        <w:rPr>
-          <w:rFonts w:ascii="Arial" w:eastAsia="Calibri" w:hAnsi="Arial" w:cs="Arial"/>
-          <w:i/>
-          <w:iCs/>
-          <w:color w:val="7F8C8D"/>
-          <w:sz w:val="18"/>
-          <w:szCs w:val="18"/>
-          <w:lang w:val="en-US"/>
-        </w:rPr>
-        <w:t>Panamá City, Panamá   •   Jan 2018 – Aug 202</w:t>
-      </w:r>
-      <w:r>
-        <w:rPr>
-          <w:rFonts w:ascii="Arial" w:eastAsia="Calibri" w:hAnsi="Arial" w:cs="Arial"/>
-          <w:i/>
-          <w:iCs/>
-          <w:color w:val="7F8C8D"/>
-          <w:sz w:val="18"/>
-          <w:szCs w:val="18"/>
-          <w:lang w:val="en-US"/>
-        </w:rPr>
-        <w:t>4</w:t>
-      </w:r>
-      <w:r>
-        <w:rPr>
-          <w:rFonts w:ascii="Arial" w:eastAsia="Calibri" w:hAnsi="Arial" w:cs="Arial"/>
-          <w:i/>
-          <w:iCs/>
-          <w:color w:val="7F8C8D"/>
-          <w:sz w:val="18"/>
-          <w:szCs w:val="18"/>
-          <w:lang w:val="en-US"/>
-        </w:rPr>
-        <w:t xml:space="preserve">  </w:t>
-      </w:r>
-    </w:p>
-    <w:p>
-      <w:pPr>
-        <w:pBdr>
-          <w:bottom w:val="single" w:sz="6" w:space="2" w:color="1A5276"/>
-        </w:pBdr>
-        <w:spacing w:after="60"/>
-        <w:rPr>
-          <w:rFonts w:ascii="Arial" w:eastAsia="Calibri" w:hAnsi="Arial" w:cs="Arial"/>
-          <w:b/>
-          <w:bCs/>
-          <w:lang w:val="en-US"/>
-        </w:rPr>
-      </w:pPr>
-      <w:r>
-        <w:rPr>
-          <w:rFonts w:ascii="Arial" w:eastAsia="Calibri" w:hAnsi="Arial" w:cs="Arial"/>
-          <w:b/>
-          <w:bCs/>
-          <w:lang w:val="en-US"/>
-        </w:rPr>
-        <w:t xml:space="preserve">Relevant coursework: Mechanical Systems, </w:t>
-      </w:r>
-      <w:r>
-        <w:rPr>
-          <w:rFonts w:ascii="Arial" w:eastAsia="Calibri" w:hAnsi="Arial" w:cs="Arial"/>
-          <w:b/>
-          <w:bCs/>
-          <w:lang w:val="en-US"/>
-        </w:rPr>
-        <w:t>Thermodynamics</w:t>
-      </w:r>
-      <w:r>
-        <w:rPr>
-          <w:rFonts w:ascii="Arial" w:eastAsia="Calibri" w:hAnsi="Arial" w:cs="Arial"/>
-          <w:b/>
-          <w:bCs/>
-          <w:lang w:val="en-US"/>
-        </w:rPr>
-        <w:t xml:space="preserve">, </w:t>
-      </w:r>
-      <w:r>
-        <w:rPr>
-          <w:rFonts w:ascii="Arial" w:eastAsia="Calibri" w:hAnsi="Arial" w:cs="Arial"/>
-          <w:b/>
-          <w:bCs/>
-          <w:lang w:val="en-US"/>
-        </w:rPr>
-        <w:t>Materials Engineering</w:t>
-      </w:r>
-      <w:r>
-        <w:rPr>
-          <w:rFonts w:ascii="Arial" w:eastAsia="Calibri" w:hAnsi="Arial" w:cs="Arial"/>
-          <w:b/>
-          <w:bCs/>
-          <w:lang w:val="en-US"/>
-        </w:rPr>
-        <w:t xml:space="preserve">, </w:t>
-      </w:r>
-      <w:r>
-        <w:rPr>
-          <w:rFonts w:ascii="Arial" w:eastAsia="Calibri" w:hAnsi="Arial" w:cs="Arial"/>
-          <w:b/>
-          <w:bCs/>
-          <w:lang w:val="en-US"/>
-        </w:rPr>
-        <w:t>Heat Transfer</w:t>
-      </w:r>
-      <w:r>
-        <w:rPr>
-          <w:rFonts w:ascii="Arial" w:eastAsia="Calibri" w:hAnsi="Arial" w:cs="Arial"/>
-          <w:b/>
-          <w:bCs/>
-          <w:lang w:val="en-US"/>
-        </w:rPr>
-        <w:t xml:space="preserve">, </w:t>
-      </w:r>
-      <w:r>
-        <w:rPr>
-          <w:rFonts w:ascii="Arial" w:eastAsia="Calibri" w:hAnsi="Arial" w:cs="Arial"/>
-          <w:b/>
-          <w:bCs/>
-          <w:lang w:val="en-US"/>
-        </w:rPr>
-        <w:t>Industrial Systems</w:t>
-      </w:r>
-    </w:p>
-    <w:p>
-      <w:pPr>
-        <w:pBdr>
-          <w:bottom w:val="single" w:sz="6" w:space="2" w:color="1A5276"/>
-        </w:pBdr>
-        <w:spacing w:before="240" w:after="60"/>
-        <w:rPr>
-          <w:rFonts w:ascii="Arial" w:hAnsi="Arial" w:cs="Arial"/>
-          <w:lang w:val="en-US"/>
-        </w:rPr>
-      </w:pPr>
-      <w:r>
-        <w:rPr>
-          <w:rFonts w:ascii="Arial" w:eastAsia="Calibri" w:hAnsi="Arial" w:cs="Arial"/>
-          <w:b/>
-          <w:bCs/>
-          <w:sz w:val="22"/>
-          <w:szCs w:val="22"/>
-          <w:lang w:val="en-US"/>
-        </w:rPr>
-        <w:t>CERTIFICATIONS &amp; TRAINING</w:t>
+          <w:rFonts w:ascii="Arial" w:eastAsia="Calibri" w:hAnsi="Arial" w:cs="Arial"/>
+          <w:color w:val="222222"/>
+          <w:lang w:val="en-US"/>
+        </w:rPr>
+      </w:pPr>
+      <w:r>
+        <w:rPr>
+          <w:rFonts w:ascii="Arial" w:eastAsia="Calibri" w:hAnsi="Arial" w:cs="Arial"/>
+          <w:color w:val="222222"/>
+          <w:lang w:val="en-US"/>
+        </w:rPr>
+        <w:t>Developed 3D mechanical designs and assemblies using Autodesk Inventor for structural and mechanical applications.</w:t>
       </w:r>
     </w:p>
     <w:p>
@@ -1354,73 +1339,18 @@
         </w:numPr>
         <w:spacing w:before="40" w:after="40"/>
         <w:rPr>
-          <w:rFonts w:ascii="Arial" w:hAnsi="Arial" w:cs="Arial"/>
-          <w:lang w:val="en-US"/>
-        </w:rPr>
-      </w:pPr>
-      <w:r>
-        <w:rPr>
-          <w:rFonts w:ascii="Arial" w:eastAsia="Calibri" w:hAnsi="Arial" w:cs="Arial"/>
-          <w:color w:val="222222"/>
-          <w:lang w:val="en-US"/>
-        </w:rPr>
-        <w:t>Engineering training in hydraulic systems and industrial equipment monitoring</w:t>
-      </w:r>
-      <w:r>
-        <w:rPr>
-          <w:rFonts w:ascii="Arial" w:eastAsia="Calibri" w:hAnsi="Arial" w:cs="Arial"/>
-          <w:color w:val="222222"/>
-          <w:lang w:val="en-US"/>
-        </w:rPr>
-        <w:t xml:space="preserve"> </w:t>
-      </w:r>
-      <w:r>
-        <w:rPr>
-          <w:rFonts w:ascii="Arial" w:eastAsia="Calibri" w:hAnsi="Arial" w:cs="Arial"/>
-          <w:color w:val="222222"/>
-          <w:lang w:val="en-US"/>
-        </w:rPr>
-        <w:t>– H</w:t>
-      </w:r>
-      <w:r>
-        <w:rPr>
-          <w:rFonts w:ascii="Arial" w:eastAsia="Calibri" w:hAnsi="Arial" w:cs="Arial"/>
-          <w:color w:val="222222"/>
-          <w:lang w:val="en-US"/>
-        </w:rPr>
-        <w:t>K</w:t>
-      </w:r>
-      <w:r>
-        <w:rPr>
-          <w:rFonts w:ascii="Arial" w:eastAsia="Calibri" w:hAnsi="Arial" w:cs="Arial"/>
-          <w:color w:val="222222"/>
-          <w:lang w:val="en-US"/>
-        </w:rPr>
-        <w:t xml:space="preserve"> AG (</w:t>
-      </w:r>
-      <w:r>
-        <w:rPr>
-          <w:rFonts w:ascii="Arial" w:eastAsia="Calibri" w:hAnsi="Arial" w:cs="Arial"/>
-          <w:color w:val="222222"/>
-          <w:lang w:val="en-US"/>
-        </w:rPr>
-        <w:t xml:space="preserve">Germany, </w:t>
-      </w:r>
-      <w:r>
-        <w:rPr>
-          <w:rFonts w:ascii="Arial" w:eastAsia="Calibri" w:hAnsi="Arial" w:cs="Arial"/>
-          <w:color w:val="222222"/>
-          <w:lang w:val="en-US"/>
-        </w:rPr>
-        <w:t>Jun 2025)</w:t>
-      </w:r>
-      <w:r>
-        <w:rPr>
-          <w:rFonts w:ascii="Arial" w:eastAsia="Calibri" w:hAnsi="Arial" w:cs="Arial"/>
-          <w:color w:val="222222"/>
-          <w:lang w:val="en-US"/>
-        </w:rPr>
-        <w:t xml:space="preserve"> </w:t>
+          <w:rFonts w:ascii="Arial" w:eastAsia="Calibri" w:hAnsi="Arial" w:cs="Arial"/>
+          <w:color w:val="222222"/>
+          <w:lang w:val="en-US"/>
+        </w:rPr>
+      </w:pPr>
+      <w:r>
+        <w:rPr>
+          <w:rFonts w:ascii="Arial" w:eastAsia="Calibri" w:hAnsi="Arial" w:cs="Arial"/>
+          <w:color w:val="222222"/>
+          <w:lang w:val="en-US"/>
+        </w:rPr>
+        <w:t>Generated manufacturing drawings and technical documentation, applying dimensioning principles for fabrication.</w:t>
       </w:r>
     </w:p>
     <w:p>
@@ -1432,17 +1362,41 @@
         </w:numPr>
         <w:spacing w:before="40" w:after="40"/>
         <w:rPr>
-          <w:rFonts w:ascii="Arial" w:hAnsi="Arial" w:cs="Arial"/>
-          <w:lang w:val="en-US"/>
-        </w:rPr>
-      </w:pPr>
-      <w:r>
-        <w:rPr>
-          <w:rFonts w:ascii="Arial" w:eastAsia="Calibri" w:hAnsi="Arial" w:cs="Arial"/>
-          <w:color w:val="222222"/>
-          <w:lang w:val="en-US"/>
-        </w:rPr>
-        <w:t>Design of Thermofluidic Systems – Technological University of Panama (Aug 2023)</w:t>
+          <w:rFonts w:ascii="Arial" w:eastAsia="Calibri" w:hAnsi="Arial" w:cs="Arial"/>
+          <w:color w:val="222222"/>
+          <w:lang w:val="en-US"/>
+        </w:rPr>
+      </w:pPr>
+      <w:r>
+        <w:rPr>
+          <w:rFonts w:ascii="Arial" w:eastAsia="Calibri" w:hAnsi="Arial" w:cs="Arial"/>
+          <w:color w:val="222222"/>
+          <w:lang w:val="en-US"/>
+        </w:rPr>
+        <w:t>Designed pipe support systems, considering load conditions, material selection, and structural behavior.</w:t>
+      </w:r>
+    </w:p>
+    <w:p>
+      <w:pPr>
+        <w:pStyle w:val="ListParagraph"/>
+        <w:numPr>
+          <w:ilvl w:val="0"/>
+          <w:numId w:val="2"/>
+        </w:numPr>
+        <w:spacing w:before="40" w:after="40"/>
+        <w:rPr>
+          <w:rFonts w:ascii="Arial" w:eastAsia="Calibri" w:hAnsi="Arial" w:cs="Arial"/>
+          <w:color w:val="222222"/>
+          <w:lang w:val="en-US"/>
+        </w:rPr>
+      </w:pPr>
+      <w:r>
+        <w:rPr>
+          <w:rFonts w:ascii="Arial" w:eastAsia="Calibri" w:hAnsi="Arial" w:cs="Arial"/>
+          <w:color w:val="222222"/>
+          <w:lang w:val="en-US"/>
+        </w:rPr>
+        <w:t>Applied engineering calculations to validate design assumptions and improve structural integrity.</w:t>
       </w:r>
     </w:p>
     <w:p>
@@ -1452,6 +1406,12 @@
         </w:pBdr>
         <w:spacing w:before="240" w:after="60"/>
         <w:rPr>
+          <w:rFonts w:ascii="Arial" w:hAnsi="Arial" w:cs="Arial"/>
+          <w:lang w:val="en-US"/>
+        </w:rPr>
+      </w:pPr>
+      <w:r>
+        <w:rPr>
           <w:rFonts w:ascii="Arial" w:eastAsia="Calibri" w:hAnsi="Arial" w:cs="Arial"/>
           <w:b/>
           <w:bCs/>
@@ -1459,26 +1419,54 @@
           <w:szCs w:val="22"/>
           <w:lang w:val="en-US"/>
         </w:rPr>
-      </w:pPr>
-      <w:r>
-        <w:rPr>
-          <w:rFonts w:ascii="Arial" w:eastAsia="Calibri" w:hAnsi="Arial" w:cs="Arial"/>
-          <w:b/>
-          <w:bCs/>
+        <w:lastRenderedPageBreak/>
+        <w:t>EDUCATION</w:t>
+      </w:r>
+    </w:p>
+    <w:p>
+      <w:pPr>
+        <w:spacing w:before="120" w:after="20"/>
+        <w:rPr>
+          <w:rFonts w:ascii="Arial" w:hAnsi="Arial" w:cs="Arial"/>
+          <w:lang w:val="en-US"/>
+        </w:rPr>
+      </w:pPr>
+      <w:r>
+        <w:rPr>
+          <w:rFonts w:ascii="Arial" w:eastAsia="Calibri" w:hAnsi="Arial" w:cs="Arial"/>
+          <w:b/>
+          <w:bCs/>
+          <w:color w:val="111111"/>
           <w:sz w:val="22"/>
           <w:szCs w:val="22"/>
           <w:lang w:val="en-US"/>
         </w:rPr>
-        <w:t>FIELD &amp; OPERATIONAL READINESS</w:t>
-      </w:r>
-    </w:p>
-    <w:p>
-      <w:pPr>
-        <w:numPr>
-          <w:ilvl w:val="0"/>
-          <w:numId w:val="4"/>
-        </w:numPr>
-        <w:spacing w:before="40" w:after="40"/>
+        <w:t>B.Sc. in Mechanical Engineering</w:t>
+      </w:r>
+      <w:r>
+        <w:rPr>
+          <w:rFonts w:ascii="Arial" w:eastAsia="Calibri" w:hAnsi="Arial" w:cs="Arial"/>
+          <w:b/>
+          <w:bCs/>
+          <w:color w:val="1A5276"/>
+          <w:lang w:val="en-US"/>
+        </w:rPr>
+        <w:t xml:space="preserve">   •   </w:t>
+      </w:r>
+      <w:r>
+        <w:rPr>
+          <w:rFonts w:ascii="Arial" w:eastAsia="Calibri" w:hAnsi="Arial" w:cs="Arial"/>
+          <w:b/>
+          <w:bCs/>
+          <w:color w:val="002060"/>
+          <w:lang w:val="en-US"/>
+        </w:rPr>
+        <w:t>Technological University of Panama</w:t>
+      </w:r>
+    </w:p>
+    <w:p>
+      <w:pPr>
+        <w:spacing w:after="60"/>
         <w:rPr>
           <w:rFonts w:ascii="Arial" w:hAnsi="Arial" w:cs="Arial"/>
           <w:lang w:val="en-US"/>
@@ -1486,84 +1474,95 @@
       </w:pPr>
       <w:r>
         <w:rPr>
-          <w:rFonts w:ascii="Arial" w:hAnsi="Arial" w:cs="Arial"/>
-        </w:rPr>
-        <w:t xml:space="preserve">Valid Driver </w:t>
-      </w:r>
-      <w:proofErr w:type="spellStart"/>
-      <w:r>
-        <w:rPr>
-          <w:rFonts w:ascii="Arial" w:hAnsi="Arial" w:cs="Arial"/>
-        </w:rPr>
-        <w:t>License</w:t>
-      </w:r>
-      <w:proofErr w:type="spellEnd"/>
-    </w:p>
-    <w:p>
-      <w:pPr>
-        <w:numPr>
-          <w:ilvl w:val="0"/>
-          <w:numId w:val="4"/>
-        </w:numPr>
-        <w:spacing w:before="40" w:after="40"/>
-        <w:rPr>
-          <w:rFonts w:ascii="Arial" w:hAnsi="Arial" w:cs="Arial"/>
-          <w:lang w:val="en-US"/>
-        </w:rPr>
-      </w:pPr>
-      <w:r>
-        <w:rPr>
-          <w:rFonts w:ascii="Arial" w:hAnsi="Arial" w:cs="Arial"/>
-        </w:rPr>
-        <w:t xml:space="preserve">Strong Safety </w:t>
-      </w:r>
-      <w:proofErr w:type="spellStart"/>
-      <w:r>
-        <w:rPr>
-          <w:rFonts w:ascii="Arial" w:hAnsi="Arial" w:cs="Arial"/>
-        </w:rPr>
-        <w:t>Awareness</w:t>
-      </w:r>
-      <w:proofErr w:type="spellEnd"/>
-    </w:p>
-    <w:p>
-      <w:pPr>
-        <w:numPr>
-          <w:ilvl w:val="0"/>
-          <w:numId w:val="4"/>
-        </w:numPr>
-        <w:spacing w:before="40" w:after="40"/>
-        <w:rPr>
-          <w:rFonts w:ascii="Arial" w:hAnsi="Arial" w:cs="Arial"/>
-          <w:lang w:val="en-US"/>
-        </w:rPr>
-      </w:pPr>
-      <w:r>
-        <w:rPr>
-          <w:rFonts w:ascii="Arial" w:hAnsi="Arial" w:cs="Arial"/>
-          <w:lang w:val="en-US"/>
-        </w:rPr>
-        <w:t>Ability to Work in Industrial and Field Environments</w:t>
-      </w:r>
-    </w:p>
-    <w:p>
-      <w:pPr>
-        <w:numPr>
-          <w:ilvl w:val="0"/>
-          <w:numId w:val="4"/>
-        </w:numPr>
-        <w:spacing w:before="40" w:after="40"/>
-        <w:rPr>
-          <w:rFonts w:ascii="Arial" w:hAnsi="Arial" w:cs="Arial"/>
-          <w:lang w:val="en-US"/>
-        </w:rPr>
-      </w:pPr>
-      <w:r>
-        <w:rPr>
-          <w:rFonts w:ascii="Arial" w:hAnsi="Arial" w:cs="Arial"/>
-          <w:lang w:val="en-US"/>
-        </w:rPr>
-        <w:t>Available for Site Inspections and Infrastructure Operations</w:t>
+          <w:rFonts w:ascii="Arial" w:eastAsia="Calibri" w:hAnsi="Arial" w:cs="Arial"/>
+          <w:i/>
+          <w:iCs/>
+          <w:color w:val="7F8C8D"/>
+          <w:sz w:val="18"/>
+          <w:szCs w:val="18"/>
+          <w:lang w:val="en-US"/>
+        </w:rPr>
+        <w:t>Panamá City, Panamá   •   Jan 2018 – Aug 202</w:t>
+      </w:r>
+      <w:r>
+        <w:rPr>
+          <w:rFonts w:ascii="Arial" w:eastAsia="Calibri" w:hAnsi="Arial" w:cs="Arial"/>
+          <w:i/>
+          <w:iCs/>
+          <w:color w:val="7F8C8D"/>
+          <w:sz w:val="18"/>
+          <w:szCs w:val="18"/>
+          <w:lang w:val="en-US"/>
+        </w:rPr>
+        <w:t>4</w:t>
+      </w:r>
+      <w:r>
+        <w:rPr>
+          <w:rFonts w:ascii="Arial" w:eastAsia="Calibri" w:hAnsi="Arial" w:cs="Arial"/>
+          <w:i/>
+          <w:iCs/>
+          <w:color w:val="7F8C8D"/>
+          <w:sz w:val="18"/>
+          <w:szCs w:val="18"/>
+          <w:lang w:val="en-US"/>
+        </w:rPr>
+        <w:t xml:space="preserve">  </w:t>
+      </w:r>
+    </w:p>
+    <w:p>
+      <w:pPr>
+        <w:pBdr>
+          <w:bottom w:val="single" w:sz="6" w:space="2" w:color="1A5276"/>
+        </w:pBdr>
+        <w:spacing w:after="60"/>
+        <w:rPr>
+          <w:rFonts w:ascii="Arial" w:eastAsia="Calibri" w:hAnsi="Arial" w:cs="Arial"/>
+          <w:lang w:val="en-US"/>
+        </w:rPr>
+      </w:pPr>
+      <w:r>
+        <w:rPr>
+          <w:rFonts w:ascii="Arial" w:eastAsia="Calibri" w:hAnsi="Arial" w:cs="Arial"/>
+          <w:b/>
+          <w:bCs/>
+          <w:lang w:val="en-US"/>
+        </w:rPr>
+        <w:t xml:space="preserve">Relevant coursework: </w:t>
+      </w:r>
+      <w:r>
+        <w:rPr>
+          <w:rFonts w:ascii="Arial" w:eastAsia="Calibri" w:hAnsi="Arial" w:cs="Arial"/>
+          <w:lang w:val="en-US"/>
+        </w:rPr>
+        <w:t>Finite Element Analysis</w:t>
+      </w:r>
+      <w:r>
+        <w:rPr>
+          <w:rFonts w:ascii="Arial" w:eastAsia="Calibri" w:hAnsi="Arial" w:cs="Arial"/>
+          <w:lang w:val="en-US"/>
+        </w:rPr>
+        <w:t xml:space="preserve">, </w:t>
+      </w:r>
+      <w:r>
+        <w:rPr>
+          <w:rFonts w:ascii="Arial" w:eastAsia="Calibri" w:hAnsi="Arial" w:cs="Arial"/>
+          <w:lang w:val="en-US"/>
+        </w:rPr>
+        <w:t>Computational Modeling</w:t>
+      </w:r>
+      <w:r>
+        <w:rPr>
+          <w:rFonts w:ascii="Arial" w:eastAsia="Calibri" w:hAnsi="Arial" w:cs="Arial"/>
+          <w:lang w:val="en-US"/>
+        </w:rPr>
+        <w:t xml:space="preserve">, </w:t>
+      </w:r>
+      <w:r>
+        <w:rPr>
+          <w:rFonts w:ascii="Arial" w:eastAsia="Calibri" w:hAnsi="Arial" w:cs="Arial"/>
+          <w:lang w:val="en-US"/>
+        </w:rPr>
+        <w:t>Materials Engineering</w:t>
       </w:r>
     </w:p>
     <w:p>
@@ -1586,6 +1585,202 @@
           <w:szCs w:val="22"/>
           <w:lang w:val="en-US"/>
         </w:rPr>
+        <w:t>CERTIFICATIONS &amp; TRAINING</w:t>
+      </w:r>
+    </w:p>
+    <w:p>
+      <w:pPr>
+        <w:pStyle w:val="ListParagraph"/>
+        <w:numPr>
+          <w:ilvl w:val="0"/>
+          <w:numId w:val="2"/>
+        </w:numPr>
+        <w:spacing w:before="40" w:after="40"/>
+        <w:rPr>
+          <w:rFonts w:ascii="Arial" w:hAnsi="Arial" w:cs="Arial"/>
+          <w:lang w:val="en-US"/>
+        </w:rPr>
+      </w:pPr>
+      <w:r>
+        <w:rPr>
+          <w:rFonts w:ascii="Arial" w:eastAsia="Calibri" w:hAnsi="Arial" w:cs="Arial"/>
+          <w:color w:val="222222"/>
+          <w:lang w:val="en-US"/>
+        </w:rPr>
+        <w:t>Engineering training in hydraulic systems and industrial equipment monitoring</w:t>
+      </w:r>
+      <w:r>
+        <w:rPr>
+          <w:rFonts w:ascii="Arial" w:eastAsia="Calibri" w:hAnsi="Arial" w:cs="Arial"/>
+          <w:color w:val="222222"/>
+          <w:lang w:val="en-US"/>
+        </w:rPr>
+        <w:t xml:space="preserve"> </w:t>
+      </w:r>
+      <w:r>
+        <w:rPr>
+          <w:rFonts w:ascii="Arial" w:eastAsia="Calibri" w:hAnsi="Arial" w:cs="Arial"/>
+          <w:color w:val="222222"/>
+          <w:lang w:val="en-US"/>
+        </w:rPr>
+        <w:t>– H</w:t>
+      </w:r>
+      <w:r>
+        <w:rPr>
+          <w:rFonts w:ascii="Arial" w:eastAsia="Calibri" w:hAnsi="Arial" w:cs="Arial"/>
+          <w:color w:val="222222"/>
+          <w:lang w:val="en-US"/>
+        </w:rPr>
+        <w:t>K</w:t>
+      </w:r>
+      <w:r>
+        <w:rPr>
+          <w:rFonts w:ascii="Arial" w:eastAsia="Calibri" w:hAnsi="Arial" w:cs="Arial"/>
+          <w:color w:val="222222"/>
+          <w:lang w:val="en-US"/>
+        </w:rPr>
+        <w:t xml:space="preserve"> AG (</w:t>
+      </w:r>
+      <w:r>
+        <w:rPr>
+          <w:rFonts w:ascii="Arial" w:eastAsia="Calibri" w:hAnsi="Arial" w:cs="Arial"/>
+          <w:color w:val="222222"/>
+          <w:lang w:val="en-US"/>
+        </w:rPr>
+        <w:t xml:space="preserve">Germany, </w:t>
+      </w:r>
+      <w:r>
+        <w:rPr>
+          <w:rFonts w:ascii="Arial" w:eastAsia="Calibri" w:hAnsi="Arial" w:cs="Arial"/>
+          <w:color w:val="222222"/>
+          <w:lang w:val="en-US"/>
+        </w:rPr>
+        <w:t>Jun 2025)</w:t>
+      </w:r>
+      <w:r>
+        <w:rPr>
+          <w:rFonts w:ascii="Arial" w:eastAsia="Calibri" w:hAnsi="Arial" w:cs="Arial"/>
+          <w:color w:val="222222"/>
+          <w:lang w:val="en-US"/>
+        </w:rPr>
+        <w:t xml:space="preserve"> </w:t>
+      </w:r>
+    </w:p>
+    <w:p>
+      <w:pPr>
+        <w:pStyle w:val="ListParagraph"/>
+        <w:numPr>
+          <w:ilvl w:val="0"/>
+          <w:numId w:val="2"/>
+        </w:numPr>
+        <w:spacing w:before="40" w:after="40"/>
+        <w:rPr>
+          <w:rFonts w:ascii="Arial" w:hAnsi="Arial" w:cs="Arial"/>
+          <w:lang w:val="en-US"/>
+        </w:rPr>
+      </w:pPr>
+      <w:r>
+        <w:rPr>
+          <w:rFonts w:ascii="Arial" w:eastAsia="Calibri" w:hAnsi="Arial" w:cs="Arial"/>
+          <w:color w:val="222222"/>
+          <w:lang w:val="en-US"/>
+        </w:rPr>
+        <w:t>Design of Thermofluidic Systems – Technological University of Panama (Aug 2023)</w:t>
+      </w:r>
+    </w:p>
+    <w:p>
+      <w:pPr>
+        <w:pBdr>
+          <w:bottom w:val="single" w:sz="6" w:space="2" w:color="1A5276"/>
+        </w:pBdr>
+        <w:spacing w:before="240" w:after="60"/>
+        <w:rPr>
+          <w:rFonts w:ascii="Arial" w:eastAsia="Calibri" w:hAnsi="Arial" w:cs="Arial"/>
+          <w:b/>
+          <w:bCs/>
+          <w:sz w:val="22"/>
+          <w:szCs w:val="22"/>
+          <w:lang w:val="en-US"/>
+        </w:rPr>
+      </w:pPr>
+      <w:r>
+        <w:rPr>
+          <w:rFonts w:ascii="Arial" w:eastAsia="Calibri" w:hAnsi="Arial" w:cs="Arial"/>
+          <w:b/>
+          <w:bCs/>
+          <w:sz w:val="22"/>
+          <w:szCs w:val="22"/>
+          <w:lang w:val="en-US"/>
+        </w:rPr>
+        <w:t>TECHNICAL PROJECTS &amp; RESEARCH</w:t>
+      </w:r>
+    </w:p>
+    <w:p>
+      <w:pPr>
+        <w:pStyle w:val="ListParagraph"/>
+        <w:numPr>
+          <w:ilvl w:val="0"/>
+          <w:numId w:val="2"/>
+        </w:numPr>
+        <w:spacing w:before="40" w:after="40"/>
+        <w:rPr>
+          <w:rFonts w:ascii="Arial" w:eastAsia="Calibri" w:hAnsi="Arial" w:cs="Arial"/>
+          <w:color w:val="222222"/>
+          <w:lang w:val="en-US"/>
+        </w:rPr>
+      </w:pPr>
+      <w:r>
+        <w:rPr>
+          <w:rFonts w:ascii="Arial" w:eastAsia="Calibri" w:hAnsi="Arial" w:cs="Arial"/>
+          <w:color w:val="222222"/>
+          <w:lang w:val="en-US"/>
+        </w:rPr>
+        <w:t xml:space="preserve">Developed MATLAB-based model to analyze structural resonance under dynamic loading conditions. </w:t>
+      </w:r>
+    </w:p>
+    <w:p>
+      <w:pPr>
+        <w:pStyle w:val="ListParagraph"/>
+        <w:numPr>
+          <w:ilvl w:val="0"/>
+          <w:numId w:val="2"/>
+        </w:numPr>
+        <w:spacing w:before="40" w:after="40"/>
+        <w:rPr>
+          <w:rFonts w:ascii="Arial" w:eastAsia="Calibri" w:hAnsi="Arial" w:cs="Arial"/>
+          <w:color w:val="222222"/>
+          <w:lang w:val="en-US"/>
+        </w:rPr>
+      </w:pPr>
+      <w:r>
+        <w:rPr>
+          <w:rFonts w:ascii="Arial" w:eastAsia="Calibri" w:hAnsi="Arial" w:cs="Arial"/>
+          <w:color w:val="222222"/>
+          <w:lang w:val="en-US"/>
+        </w:rPr>
+        <w:t>Applied numerical methods for engineering system evaluation.</w:t>
+      </w:r>
+    </w:p>
+    <w:p>
+      <w:pPr>
+        <w:pBdr>
+          <w:bottom w:val="single" w:sz="6" w:space="2" w:color="1A5276"/>
+        </w:pBdr>
+        <w:spacing w:before="240" w:after="60"/>
+        <w:rPr>
+          <w:rFonts w:ascii="Arial" w:hAnsi="Arial" w:cs="Arial"/>
+          <w:lang w:val="en-US"/>
+        </w:rPr>
+      </w:pPr>
+      <w:r>
+        <w:rPr>
+          <w:rFonts w:ascii="Arial" w:eastAsia="Calibri" w:hAnsi="Arial" w:cs="Arial"/>
+          <w:b/>
+          <w:bCs/>
+          <w:sz w:val="22"/>
+          <w:szCs w:val="22"/>
+          <w:lang w:val="en-US"/>
+        </w:rPr>
         <w:t>LANGUAGES</w:t>
       </w:r>
     </w:p>
@@ -1651,6 +1846,102 @@
           <w:lang w:val="en-US"/>
         </w:rPr>
         <w:t xml:space="preserve"> (A2 – actively developing)</w:t>
+      </w:r>
+    </w:p>
+    <w:p>
+      <w:pPr>
+        <w:pBdr>
+          <w:bottom w:val="single" w:sz="6" w:space="2" w:color="1A5276"/>
+        </w:pBdr>
+        <w:spacing w:before="240" w:after="60"/>
+        <w:rPr>
+          <w:rFonts w:ascii="Arial" w:eastAsia="Calibri" w:hAnsi="Arial" w:cs="Arial"/>
+          <w:b/>
+          <w:bCs/>
+          <w:sz w:val="22"/>
+          <w:szCs w:val="22"/>
+          <w:lang w:val="en-US"/>
+        </w:rPr>
+      </w:pPr>
+      <w:r>
+        <w:rPr>
+          <w:rFonts w:ascii="Arial" w:eastAsia="Calibri" w:hAnsi="Arial" w:cs="Arial"/>
+          <w:b/>
+          <w:bCs/>
+          <w:sz w:val="22"/>
+          <w:szCs w:val="22"/>
+          <w:lang w:val="en-US"/>
+        </w:rPr>
+        <w:t>FIELD &amp; OPERATIONAL READINESS</w:t>
+      </w:r>
+    </w:p>
+    <w:p>
+      <w:pPr>
+        <w:pStyle w:val="ListParagraph"/>
+        <w:numPr>
+          <w:ilvl w:val="0"/>
+          <w:numId w:val="2"/>
+        </w:numPr>
+        <w:spacing w:before="40" w:after="40"/>
+        <w:rPr>
+          <w:rFonts w:ascii="Arial" w:eastAsia="Calibri" w:hAnsi="Arial" w:cs="Arial"/>
+          <w:color w:val="222222"/>
+          <w:lang w:val="en-US"/>
+        </w:rPr>
+      </w:pPr>
+      <w:r>
+        <w:rPr>
+          <w:rFonts w:ascii="Arial" w:eastAsia="Calibri" w:hAnsi="Arial" w:cs="Arial"/>
+          <w:color w:val="222222"/>
+          <w:lang w:val="en-US"/>
+        </w:rPr>
+        <w:t>Valid Driver License</w:t>
+      </w:r>
+    </w:p>
+    <w:p>
+      <w:pPr>
+        <w:pStyle w:val="ListParagraph"/>
+        <w:numPr>
+          <w:ilvl w:val="0"/>
+          <w:numId w:val="2"/>
+        </w:numPr>
+        <w:spacing w:before="40" w:after="40"/>
+        <w:rPr>
+          <w:rFonts w:ascii="Arial" w:eastAsia="Calibri" w:hAnsi="Arial" w:cs="Arial"/>
+          <w:color w:val="222222"/>
+          <w:lang w:val="en-US"/>
+        </w:rPr>
+      </w:pPr>
+      <w:r>
+        <w:rPr>
+          <w:rFonts w:ascii="Arial" w:eastAsia="Calibri" w:hAnsi="Arial" w:cs="Arial"/>
+          <w:color w:val="222222"/>
+          <w:lang w:val="en-US"/>
+        </w:rPr>
+        <w:t xml:space="preserve">Work Authorization: Authorized to work in Panama </w:t>
+      </w:r>
+    </w:p>
+    <w:p>
+      <w:pPr>
+        <w:pStyle w:val="ListParagraph"/>
+        <w:numPr>
+          <w:ilvl w:val="0"/>
+          <w:numId w:val="2"/>
+        </w:numPr>
+        <w:spacing w:before="40" w:after="40"/>
+        <w:rPr>
+          <w:rFonts w:ascii="Arial" w:eastAsia="Calibri" w:hAnsi="Arial" w:cs="Arial"/>
+          <w:color w:val="222222"/>
+          <w:lang w:val="en-US"/>
+        </w:rPr>
+      </w:pPr>
+      <w:r>
+        <w:rPr>
+          <w:rFonts w:ascii="Arial" w:eastAsia="Calibri" w:hAnsi="Arial" w:cs="Arial"/>
+          <w:color w:val="222222"/>
+          <w:lang w:val="en-US"/>
+        </w:rPr>
+        <w:t>Availability: Full-time, on-site</w:t>
       </w:r>
     </w:p>
     <w:sectPr>
@@ -1954,6 +2245,155 @@
       </w:pPr>
     </w:lvl>
   </w:abstractNum>
+  <w:abstractNum w:abstractNumId="3" w15:restartNumberingAfterBreak="0">
+    <w:nsid w:val="6A587254"/>
+    <w:multiLevelType w:val="multilevel"/>
+    <w:tmpl w:val="9C5AD04C"/>
+    <w:lvl w:ilvl="0">
+      <w:start w:val="1"/>
+      <w:numFmt w:val="bullet"/>
+      <w:lvlText w:val=""/>
+      <w:lvlJc w:val="left"/>
+      <w:pPr>
+        <w:tabs>
+          <w:tab w:val="num" w:pos="720"/>
+        </w:tabs>
+        <w:ind w:left="720" w:hanging="360"/>
+      </w:pPr>
+      <w:rPr>
+        <w:rFonts w:ascii="Symbol" w:hAnsi="Symbol" w:hint="default"/>
+        <w:sz w:val="20"/>
+      </w:rPr>
+    </w:lvl>
+    <w:lvl w:ilvl="1" w:tentative="1">
+      <w:start w:val="1"/>
+      <w:numFmt w:val="bullet"/>
+      <w:lvlText w:val="o"/>
+      <w:lvlJc w:val="left"/>
+      <w:pPr>
+        <w:tabs>
+          <w:tab w:val="num" w:pos="1440"/>
+        </w:tabs>
+        <w:ind w:left="1440" w:hanging="360"/>
+      </w:pPr>
+      <w:rPr>
+        <w:rFonts w:ascii="Courier New" w:hAnsi="Courier New" w:hint="default"/>
+        <w:sz w:val="20"/>
+      </w:rPr>
+    </w:lvl>
+    <w:lvl w:ilvl="2" w:tentative="1">
+      <w:start w:val="1"/>
+      <w:numFmt w:val="bullet"/>
+      <w:lvlText w:val=""/>
+      <w:lvlJc w:val="left"/>
+      <w:pPr>
+        <w:tabs>
+          <w:tab w:val="num" w:pos="2160"/>
+        </w:tabs>
+        <w:ind w:left="2160" w:hanging="360"/>
+      </w:pPr>
+      <w:rPr>
+        <w:rFonts w:ascii="Wingdings" w:hAnsi="Wingdings" w:hint="default"/>
+        <w:sz w:val="20"/>
+      </w:rPr>
+    </w:lvl>
+    <w:lvl w:ilvl="3" w:tentative="1">
+      <w:start w:val="1"/>
+      <w:numFmt w:val="bullet"/>
+      <w:lvlText w:val=""/>
+      <w:lvlJc w:val="left"/>
+      <w:pPr>
+        <w:tabs>
+          <w:tab w:val="num" w:pos="2880"/>
+        </w:tabs>
+        <w:ind w:left="2880" w:hanging="360"/>
+      </w:pPr>
+      <w:rPr>
+        <w:rFonts w:ascii="Wingdings" w:hAnsi="Wingdings" w:hint="default"/>
+        <w:sz w:val="20"/>
+      </w:rPr>
+    </w:lvl>
+    <w:lvl w:ilvl="4" w:tentative="1">
+      <w:start w:val="1"/>
+      <w:numFmt w:val="bullet"/>
+      <w:lvlText w:val=""/>
+      <w:lvlJc w:val="left"/>
+      <w:pPr>
+        <w:tabs>
+          <w:tab w:val="num" w:pos="3600"/>
+        </w:tabs>
+        <w:ind w:left="3600" w:hanging="360"/>
+      </w:pPr>
+      <w:rPr>
+        <w:rFonts w:ascii="Wingdings" w:hAnsi="Wingdings" w:hint="default"/>
+        <w:sz w:val="20"/>
+      </w:rPr>
+    </w:lvl>
+    <w:lvl w:ilvl="5" w:tentative="1">
+      <w:start w:val="1"/>
+      <w:numFmt w:val="bullet"/>
+      <w:lvlText w:val=""/>
+      <w:lvlJc w:val="left"/>
+      <w:pPr>
+        <w:tabs>
+          <w:tab w:val="num" w:pos="4320"/>
+        </w:tabs>
+        <w:ind w:left="4320" w:hanging="360"/>
+      </w:pPr>
+      <w:rPr>
+        <w:rFonts w:ascii="Wingdings" w:hAnsi="Wingdings" w:hint="default"/>
+        <w:sz w:val="20"/>
+      </w:rPr>
+    </w:lvl>
+    <w:lvl w:ilvl="6" w:tentative="1">
+      <w:start w:val="1"/>
+      <w:numFmt w:val="bullet"/>
+      <w:lvlText w:val=""/>
+      <w:lvlJc w:val="left"/>
+      <w:pPr>
+        <w:tabs>
+          <w:tab w:val="num" w:pos="5040"/>
+        </w:tabs>
+        <w:ind w:left="5040" w:hanging="360"/>
+      </w:pPr>
+      <w:rPr>
+        <w:rFonts w:ascii="Wingdings" w:hAnsi="Wingdings" w:hint="default"/>
+        <w:sz w:val="20"/>
+      </w:rPr>
+    </w:lvl>
+    <w:lvl w:ilvl="7" w:tentative="1">
+      <w:start w:val="1"/>
+      <w:numFmt w:val="bullet"/>
+      <w:lvlText w:val=""/>
+      <w:lvlJc w:val="left"/>
+      <w:pPr>
+        <w:tabs>
+          <w:tab w:val="num" w:pos="5760"/>
+        </w:tabs>
+        <w:ind w:left="5760" w:hanging="360"/>
+      </w:pPr>
+      <w:rPr>
+        <w:rFonts w:ascii="Wingdings" w:hAnsi="Wingdings" w:hint="default"/>
+        <w:sz w:val="20"/>
+      </w:rPr>
+    </w:lvl>
+    <w:lvl w:ilvl="8" w:tentative="1">
+      <w:start w:val="1"/>
+      <w:numFmt w:val="bullet"/>
+      <w:lvlText w:val=""/>
+      <w:lvlJc w:val="left"/>
+      <w:pPr>
+        <w:tabs>
+          <w:tab w:val="num" w:pos="6480"/>
+        </w:tabs>
+        <w:ind w:left="6480" w:hanging="360"/>
+      </w:pPr>
+      <w:rPr>
+        <w:rFonts w:ascii="Wingdings" w:hAnsi="Wingdings" w:hint="default"/>
+        <w:sz w:val="20"/>
+      </w:rPr>
+    </w:lvl>
+  </w:abstractNum>
   <w:num w:numId="1" w16cid:durableId="1549106939">
     <w:abstractNumId w:val="2"/>
     <w:lvlOverride w:ilvl="0">
@@ -1968,6 +2408,9 @@
   </w:num>
   <w:num w:numId="4" w16cid:durableId="42563924">
     <w:abstractNumId w:val="1"/>
+  </w:num>
+  <w:num w:numId="5" w16cid:durableId="1195846105">
+    <w:abstractNumId w:val="3"/>
   </w:num>
 </w:numbering>
 </file>

</xml_diff>